<commit_message>
Experimental chapter specifications and justifications
</commit_message>
<xml_diff>
--- a/Corrections/Harry Questa - Corrections.docx
+++ b/Corrections/Harry Questa - Corrections.docx
@@ -12,12 +12,16 @@
         <w:rPr>
           <w:b/>
           <w:bCs/>
+          <w:sz w:val="28"/>
+          <w:szCs w:val="28"/>
         </w:rPr>
       </w:pPr>
       <w:r>
         <w:rPr>
           <w:b/>
           <w:bCs/>
+          <w:sz w:val="28"/>
+          <w:szCs w:val="28"/>
         </w:rPr>
         <w:t xml:space="preserve">Harry Questa </w:t>
       </w:r>
@@ -25,6 +29,8 @@
         <w:rPr>
           <w:b/>
           <w:bCs/>
+          <w:sz w:val="28"/>
+          <w:szCs w:val="28"/>
         </w:rPr>
         <w:t>–</w:t>
       </w:r>
@@ -32,6 +38,8 @@
         <w:rPr>
           <w:b/>
           <w:bCs/>
+          <w:sz w:val="28"/>
+          <w:szCs w:val="28"/>
         </w:rPr>
         <w:t xml:space="preserve"> </w:t>
       </w:r>
@@ -39,6 +47,8 @@
         <w:rPr>
           <w:b/>
           <w:bCs/>
+          <w:sz w:val="28"/>
+          <w:szCs w:val="28"/>
         </w:rPr>
         <w:t>PhD corrections</w:t>
       </w:r>
@@ -46,10 +56,21 @@
         <w:rPr>
           <w:b/>
           <w:bCs/>
+          <w:sz w:val="28"/>
+          <w:szCs w:val="28"/>
         </w:rPr>
         <w:t xml:space="preserve"> (inc. those noted in viva)</w:t>
       </w:r>
     </w:p>
+    <w:p/>
+    <w:p>
+      <w:pPr>
+        <w:pStyle w:val="Heading2"/>
+      </w:pPr>
+      <w:r>
+        <w:t>Abstract</w:t>
+      </w:r>
+    </w:p>
     <w:p>
       <w:pPr>
         <w:numPr>
@@ -63,9 +84,17 @@
     </w:p>
     <w:p>
       <w:pPr>
-        <w:numPr>
-          <w:ilvl w:val="0"/>
-          <w:numId w:val="1"/>
+        <w:pStyle w:val="Heading2"/>
+      </w:pPr>
+      <w:r>
+        <w:t>Chapter 1 - Introduction</w:t>
+      </w:r>
+    </w:p>
+    <w:p>
+      <w:pPr>
+        <w:numPr>
+          <w:ilvl w:val="0"/>
+          <w:numId w:val="3"/>
         </w:numPr>
       </w:pPr>
       <w:r>
@@ -82,10 +111,46 @@
       <w:pPr>
         <w:numPr>
           <w:ilvl w:val="0"/>
-          <w:numId w:val="1"/>
-        </w:numPr>
-      </w:pPr>
-      <w:r>
+          <w:numId w:val="3"/>
+        </w:numPr>
+      </w:pPr>
+      <w:r>
+        <w:t>What's a 'point' vs 'aim' vs 'objective' There seems to be a lot overlap in the above text and list below. Improve and rationalise as discussed in viva...</w:t>
+      </w:r>
+    </w:p>
+    <w:p>
+      <w:pPr>
+        <w:numPr>
+          <w:ilvl w:val="0"/>
+          <w:numId w:val="3"/>
+        </w:numPr>
+      </w:pPr>
+      <w:r>
+        <w:t>Can you add some examples of speeds for motor/transmission bearings in rpm but also m/s entrainment</w:t>
+      </w:r>
+    </w:p>
+    <w:p>
+      <w:pPr>
+        <w:pStyle w:val="Heading2"/>
+      </w:pPr>
+      <w:r>
+        <w:t>Chapter 2 - Literature Review</w:t>
+      </w:r>
+    </w:p>
+    <w:p>
+      <w:pPr>
+        <w:numPr>
+          <w:ilvl w:val="0"/>
+          <w:numId w:val="4"/>
+        </w:numPr>
+        <w:rPr>
+          <w:color w:val="4EA72E" w:themeColor="accent6"/>
+        </w:rPr>
+      </w:pPr>
+      <w:r>
+        <w:rPr>
+          <w:color w:val="4EA72E" w:themeColor="accent6"/>
+        </w:rPr>
         <w:t>Consider adding a lit review section on the function of rolling element bearings.</w:t>
       </w:r>
     </w:p>
@@ -93,43 +158,156 @@
       <w:pPr>
         <w:numPr>
           <w:ilvl w:val="0"/>
-          <w:numId w:val="1"/>
-        </w:numPr>
-      </w:pPr>
-      <w:r>
-        <w:t xml:space="preserve">Add a small section (or comments where appropriate) discussing 'what is a </w:t>
-      </w:r>
-      <w:proofErr w:type="gramStart"/>
-      <w:r>
-        <w:t>high speed</w:t>
-      </w:r>
-      <w:proofErr w:type="gramEnd"/>
-      <w:r>
-        <w:t xml:space="preserve"> bearing' - </w:t>
+          <w:numId w:val="4"/>
+        </w:numPr>
+        <w:rPr>
+          <w:color w:val="4EA72E" w:themeColor="accent6"/>
+        </w:rPr>
+      </w:pPr>
+      <w:r>
+        <w:rPr>
+          <w:color w:val="4EA72E" w:themeColor="accent6"/>
+        </w:rPr>
+        <w:t>Need to specify what type of models? Tribology, dynamics, tribo-dynamics, fatigue etc.</w:t>
+      </w:r>
+      <w:r>
+        <w:rPr>
+          <w:color w:val="4EA72E" w:themeColor="accent6"/>
+        </w:rPr>
+        <w:t>.. different</w:t>
+      </w:r>
+      <w:r>
+        <w:rPr>
+          <w:color w:val="4EA72E" w:themeColor="accent6"/>
+        </w:rPr>
+        <w:t xml:space="preserve"> people will read different things into 'models'</w:t>
+      </w:r>
+    </w:p>
+    <w:p>
+      <w:pPr>
+        <w:numPr>
+          <w:ilvl w:val="1"/>
+          <w:numId w:val="4"/>
+        </w:numPr>
+        <w:rPr>
+          <w:color w:val="0070C0"/>
+        </w:rPr>
+      </w:pPr>
+      <w:r>
+        <w:rPr>
+          <w:color w:val="0070C0"/>
+        </w:rPr>
+        <w:t>Clarified</w:t>
+      </w:r>
+      <w:r>
+        <w:rPr>
+          <w:color w:val="0070C0"/>
+        </w:rPr>
+        <w:t xml:space="preserve"> that these refer to</w:t>
+      </w:r>
+      <w:r>
+        <w:rPr>
+          <w:color w:val="0070C0"/>
+        </w:rPr>
+        <w:t xml:space="preserve"> analytical dynamic models, then commented on advancement to couple tribo-dynamic modelling</w:t>
+      </w:r>
+      <w:r>
+        <w:rPr>
+          <w:color w:val="0070C0"/>
+        </w:rPr>
+        <w:t>.</w:t>
+      </w:r>
+    </w:p>
+    <w:p>
+      <w:pPr>
+        <w:numPr>
+          <w:ilvl w:val="0"/>
+          <w:numId w:val="4"/>
+        </w:numPr>
+        <w:rPr>
+          <w:color w:val="4EA72E" w:themeColor="accent6"/>
+        </w:rPr>
+      </w:pPr>
+      <w:r>
+        <w:rPr>
+          <w:color w:val="4EA72E" w:themeColor="accent6"/>
+        </w:rPr>
+        <w:t xml:space="preserve">Add a small section (or comments where appropriate) discussing 'what is a high speed bearing' - </w:t>
       </w:r>
       <w:hyperlink r:id="rId5" w:history="1">
-        <w:proofErr w:type="spellStart"/>
-        <w:proofErr w:type="gramStart"/>
         <w:r>
           <w:rPr>
             <w:rStyle w:val="Hyperlink"/>
+            <w:color w:val="4EA72E" w:themeColor="accent6"/>
           </w:rPr>
           <w:t>n.Dm</w:t>
         </w:r>
-        <w:proofErr w:type="spellEnd"/>
-        <w:proofErr w:type="gramEnd"/>
       </w:hyperlink>
       <w:r>
+        <w:rPr>
+          <w:color w:val="4EA72E" w:themeColor="accent6"/>
+        </w:rPr>
         <w:t xml:space="preserve"> parameter vs. rpm. </w:t>
       </w:r>
     </w:p>
     <w:p>
       <w:pPr>
-        <w:numPr>
-          <w:ilvl w:val="0"/>
-          <w:numId w:val="1"/>
-        </w:numPr>
-      </w:pPr>
+        <w:pStyle w:val="ListParagraph"/>
+        <w:numPr>
+          <w:ilvl w:val="0"/>
+          <w:numId w:val="9"/>
+        </w:numPr>
+        <w:rPr>
+          <w:color w:val="0070C0"/>
+        </w:rPr>
+      </w:pPr>
+      <w:r>
+        <w:rPr>
+          <w:color w:val="0070C0"/>
+        </w:rPr>
+        <w:t>Added section 2.1.3 to Literature Raeview under "</w:t>
+      </w:r>
+      <w:r>
+        <w:rPr>
+          <w:color w:val="0070C0"/>
+        </w:rPr>
+        <w:t>Characterisation</w:t>
+      </w:r>
+      <w:r>
+        <w:rPr>
+          <w:color w:val="0070C0"/>
+        </w:rPr>
+        <w:t xml:space="preserve"> of High-Speed Bearings"</w:t>
+      </w:r>
+    </w:p>
+    <w:p>
+      <w:pPr>
+        <w:pStyle w:val="ListParagraph"/>
+        <w:numPr>
+          <w:ilvl w:val="0"/>
+          <w:numId w:val="9"/>
+        </w:numPr>
+        <w:rPr>
+          <w:color w:val="0070C0"/>
+        </w:rPr>
+      </w:pPr>
+      <w:r>
+        <w:rPr>
+          <w:color w:val="0070C0"/>
+        </w:rPr>
+        <w:t>Also added/elaborated a section on their application in automotive powertrains.</w:t>
+      </w:r>
+    </w:p>
+    <w:p>
+      <w:pPr>
+        <w:numPr>
+          <w:ilvl w:val="0"/>
+          <w:numId w:val="4"/>
+        </w:numPr>
+      </w:pPr>
+      <w:r>
+        <w:t>Reordering sections</w:t>
+      </w:r>
     </w:p>
     <w:p>
       <w:pPr>
@@ -137,17 +315,32 @@
           <w:ilvl w:val="1"/>
           <w:numId w:val="2"/>
         </w:numPr>
-      </w:pPr>
-      <w:r>
-        <w:t xml:space="preserve">Consider reordering the lit. review sections. </w:t>
-      </w:r>
-      <w:proofErr w:type="spellStart"/>
-      <w:r>
-        <w:t>e.g</w:t>
-      </w:r>
-      <w:proofErr w:type="spellEnd"/>
-      <w:r>
-        <w:t xml:space="preserve"> modelling is before the theory, there is a large EHL section before the introduction of lubrication regimes.</w:t>
+        <w:rPr>
+          <w:color w:val="4EA72E" w:themeColor="accent6"/>
+        </w:rPr>
+      </w:pPr>
+      <w:r>
+        <w:rPr>
+          <w:color w:val="4EA72E" w:themeColor="accent6"/>
+        </w:rPr>
+        <w:t>Consider reordering the lit. review sections. e.g modelling is before the theory, there is a large EHL section before the introduction of lubrication regimes.</w:t>
+      </w:r>
+    </w:p>
+    <w:p>
+      <w:pPr>
+        <w:numPr>
+          <w:ilvl w:val="2"/>
+          <w:numId w:val="2"/>
+        </w:numPr>
+        <w:rPr>
+          <w:color w:val="0070C0"/>
+        </w:rPr>
+      </w:pPr>
+      <w:r>
+        <w:rPr>
+          <w:color w:val="0070C0"/>
+        </w:rPr>
+        <w:t>Reordered</w:t>
       </w:r>
     </w:p>
     <w:p>
@@ -158,15 +351,7 @@
         </w:numPr>
       </w:pPr>
       <w:r>
-        <w:t xml:space="preserve">Consider moving the background about rolling element bearings from the start of </w:t>
-      </w:r>
-      <w:proofErr w:type="spellStart"/>
-      <w:r>
-        <w:t>Chapt</w:t>
-      </w:r>
-      <w:proofErr w:type="spellEnd"/>
-      <w:r>
-        <w:t xml:space="preserve"> 3 into the main literature review.</w:t>
+        <w:t>Consider moving the background about rolling element bearings from the start of Chapt 3 into the main literature review.</w:t>
       </w:r>
     </w:p>
     <w:p>
@@ -179,34 +364,770 @@
       <w:r>
         <w:t xml:space="preserve">Consider moving the background on ANN to </w:t>
       </w:r>
-      <w:proofErr w:type="spellStart"/>
       <w:r>
         <w:t>C</w:t>
       </w:r>
       <w:r>
-        <w:t>hapt</w:t>
-      </w:r>
-      <w:proofErr w:type="spellEnd"/>
-      <w:r>
-        <w:t xml:space="preserve"> 3.</w:t>
-      </w:r>
-    </w:p>
-    <w:p>
-      <w:pPr>
-        <w:numPr>
-          <w:ilvl w:val="0"/>
-          <w:numId w:val="1"/>
-        </w:numPr>
-      </w:pPr>
-      <w:r>
+        <w:t>hapt 3.</w:t>
+      </w:r>
+    </w:p>
+    <w:p>
+      <w:pPr>
+        <w:numPr>
+          <w:ilvl w:val="0"/>
+          <w:numId w:val="4"/>
+        </w:numPr>
+      </w:pPr>
+      <w:r>
+        <w:t>Load</w:t>
+      </w:r>
+      <w:r>
+        <w:t xml:space="preserve"> has minimal effect on EHL film so this</w:t>
+      </w:r>
+      <w:r>
+        <w:t xml:space="preserve"> (fixed preload)</w:t>
+      </w:r>
+      <w:r>
+        <w:t xml:space="preserve"> is perhaps a sensible approach that balances computational time </w:t>
+      </w:r>
+      <w:r>
+        <w:t>with results</w:t>
+      </w:r>
+      <w:r>
+        <w:t xml:space="preserve"> of </w:t>
+      </w:r>
+      <w:r>
+        <w:t>practical value</w:t>
+      </w:r>
+      <w:r>
+        <w:t>. Why not persist with this is, what error does it introduce?</w:t>
+      </w:r>
+    </w:p>
+    <w:p>
+      <w:pPr>
+        <w:numPr>
+          <w:ilvl w:val="0"/>
+          <w:numId w:val="4"/>
+        </w:numPr>
+      </w:pPr>
+      <w:r>
+        <w:t>So is your implementation of a lubricated dynamic model in a system the main contribution? Is the dynamic model of the bearing itself any different from previous models? Improve clarity</w:t>
+      </w:r>
+    </w:p>
+    <w:p>
+      <w:pPr>
+        <w:numPr>
+          <w:ilvl w:val="0"/>
+          <w:numId w:val="4"/>
+        </w:numPr>
+        <w:rPr>
+          <w:color w:val="4EA72E" w:themeColor="accent6"/>
+        </w:rPr>
+      </w:pPr>
+      <w:r>
+        <w:rPr>
+          <w:color w:val="4EA72E" w:themeColor="accent6"/>
+        </w:rPr>
+        <w:lastRenderedPageBreak/>
+        <w:t>Elaborate on what the time-varying forces in electrified vehicle transmissions are</w:t>
+      </w:r>
+    </w:p>
+    <w:p>
+      <w:pPr>
+        <w:numPr>
+          <w:ilvl w:val="1"/>
+          <w:numId w:val="4"/>
+        </w:numPr>
+        <w:rPr>
+          <w:color w:val="0070C0"/>
+        </w:rPr>
+      </w:pPr>
+      <w:r>
+        <w:rPr>
+          <w:color w:val="0070C0"/>
+        </w:rPr>
+        <w:t>Added to subsection 2.12 at start of Literature Review</w:t>
+      </w:r>
+    </w:p>
+    <w:p>
+      <w:pPr>
+        <w:numPr>
+          <w:ilvl w:val="0"/>
+          <w:numId w:val="4"/>
+        </w:numPr>
+      </w:pPr>
+      <w:r>
+        <w:t>What about rough surface contact mechanics? Today's full rough contact models are very fast and routinely used for bearing predictions such as bearing life for example. What effect does roughness have on stiffness and dynamic response of contact? Real vs nominal area etc.. What is the typical roughness of bearing components?</w:t>
+      </w:r>
+    </w:p>
+    <w:p>
+      <w:pPr>
+        <w:numPr>
+          <w:ilvl w:val="0"/>
+          <w:numId w:val="4"/>
+        </w:numPr>
+        <w:rPr>
+          <w:color w:val="4EA72E" w:themeColor="accent6"/>
+        </w:rPr>
+      </w:pPr>
+      <w:r>
+        <w:rPr>
+          <w:color w:val="4EA72E" w:themeColor="accent6"/>
+        </w:rPr>
+        <w:t>State main assumption in Hertz Theory</w:t>
+      </w:r>
+    </w:p>
+    <w:p>
+      <w:pPr>
+        <w:numPr>
+          <w:ilvl w:val="1"/>
+          <w:numId w:val="4"/>
+        </w:numPr>
+        <w:rPr>
+          <w:color w:val="0070C0"/>
+        </w:rPr>
+      </w:pPr>
+      <w:r>
+        <w:rPr>
+          <w:color w:val="0070C0"/>
+        </w:rPr>
+        <w:t>Added to Section 2.2.1</w:t>
+      </w:r>
+    </w:p>
+    <w:p>
+      <w:pPr>
+        <w:numPr>
+          <w:ilvl w:val="0"/>
+          <w:numId w:val="4"/>
+        </w:numPr>
+        <w:rPr>
+          <w:color w:val="4EA72E" w:themeColor="accent6"/>
+        </w:rPr>
+      </w:pPr>
+      <w:r>
+        <w:rPr>
+          <w:color w:val="4EA72E" w:themeColor="accent6"/>
+        </w:rPr>
+        <w:t>Why is Hertz OK for point contact but not for line contact? It is the exact same theory? Rephrase</w:t>
+      </w:r>
+    </w:p>
+    <w:p>
+      <w:pPr>
+        <w:numPr>
+          <w:ilvl w:val="1"/>
+          <w:numId w:val="4"/>
+        </w:numPr>
+        <w:rPr>
+          <w:color w:val="4EA72E" w:themeColor="accent6"/>
+        </w:rPr>
+      </w:pPr>
+      <w:r>
+        <w:rPr>
+          <w:color w:val="0070C0"/>
+        </w:rPr>
+        <w:t>Clarified</w:t>
+      </w:r>
+      <w:r>
+        <w:rPr>
+          <w:color w:val="0070C0"/>
+        </w:rPr>
+        <w:t xml:space="preserve"> in 2.2.2</w:t>
+      </w:r>
+      <w:r>
+        <w:rPr>
+          <w:color w:val="0070C0"/>
+        </w:rPr>
+        <w:t>. Cylind</w:t>
+      </w:r>
+      <w:r>
+        <w:rPr>
+          <w:color w:val="0070C0"/>
+        </w:rPr>
+        <w:t xml:space="preserve">rical rollers </w:t>
+      </w:r>
+      <w:r>
+        <w:rPr>
+          <w:color w:val="0070C0"/>
+        </w:rPr>
+        <w:t>have finite length, no</w:t>
+      </w:r>
+      <w:r>
+        <w:rPr>
+          <w:color w:val="0070C0"/>
+        </w:rPr>
+        <w:t>t modelled as</w:t>
+      </w:r>
+      <w:r>
+        <w:rPr>
+          <w:color w:val="0070C0"/>
+        </w:rPr>
+        <w:t xml:space="preserve"> infinitely long cylinders. </w:t>
+      </w:r>
+      <w:r>
+        <w:rPr>
+          <w:color w:val="0070C0"/>
+        </w:rPr>
+        <w:t>Therefore,</w:t>
+      </w:r>
+      <w:r>
+        <w:rPr>
+          <w:color w:val="0070C0"/>
+        </w:rPr>
+        <w:t xml:space="preserve"> adjustment required to capture edge effects</w:t>
+      </w:r>
+    </w:p>
+    <w:p>
+      <w:pPr>
+        <w:numPr>
+          <w:ilvl w:val="0"/>
+          <w:numId w:val="4"/>
+        </w:numPr>
+        <w:rPr>
+          <w:color w:val="4EA72E" w:themeColor="accent6"/>
+        </w:rPr>
+      </w:pPr>
+      <w:r>
+        <w:rPr>
+          <w:color w:val="4EA72E" w:themeColor="accent6"/>
+        </w:rPr>
+        <w:t>For accurate predictions (including bearing life predictions) none of this is used, but a full numerical contact model is used instead, which can even include roughness and asperity stress history. I think you need to update the text to clarify this</w:t>
+      </w:r>
+    </w:p>
+    <w:p>
+      <w:pPr>
+        <w:numPr>
+          <w:ilvl w:val="1"/>
+          <w:numId w:val="4"/>
+        </w:numPr>
+        <w:rPr>
+          <w:color w:val="0070C0"/>
+        </w:rPr>
+      </w:pPr>
+      <w:r>
+        <w:rPr>
+          <w:color w:val="0070C0"/>
+        </w:rPr>
+        <w:t>Clarified</w:t>
+      </w:r>
+      <w:r>
+        <w:rPr>
+          <w:color w:val="0070C0"/>
+        </w:rPr>
+        <w:t xml:space="preserve"> in text</w:t>
+      </w:r>
+      <w:r>
+        <w:rPr>
+          <w:color w:val="0070C0"/>
+        </w:rPr>
+        <w:t xml:space="preserve"> that full numerical contact solutions are not viable for FMBD models requiring computationally</w:t>
+      </w:r>
+      <w:r>
+        <w:rPr>
+          <w:color w:val="0070C0"/>
+        </w:rPr>
+        <w:t xml:space="preserve"> efficien</w:t>
+      </w:r>
+      <w:r>
+        <w:rPr>
+          <w:color w:val="0070C0"/>
+        </w:rPr>
+        <w:t>cy. Therefore, focus was on Hertz based analytical methods.</w:t>
+      </w:r>
+    </w:p>
+    <w:p>
+      <w:pPr>
+        <w:numPr>
+          <w:ilvl w:val="0"/>
+          <w:numId w:val="4"/>
+        </w:numPr>
+        <w:rPr>
+          <w:color w:val="4EA72E" w:themeColor="accent6"/>
+        </w:rPr>
+      </w:pPr>
+      <w:r>
+        <w:rPr>
+          <w:color w:val="4EA72E" w:themeColor="accent6"/>
+        </w:rPr>
+        <w:t>How/why does starvation occur in bearings? Explain briefly</w:t>
+      </w:r>
+    </w:p>
+    <w:p>
+      <w:pPr>
+        <w:numPr>
+          <w:ilvl w:val="1"/>
+          <w:numId w:val="4"/>
+        </w:numPr>
+        <w:rPr>
+          <w:color w:val="0070C0"/>
+        </w:rPr>
+      </w:pPr>
+      <w:r>
+        <w:rPr>
+          <w:color w:val="0070C0"/>
+        </w:rPr>
+        <w:t>Mechanism explained in 2.4.2 Starvation. Explanation refined.</w:t>
+      </w:r>
+    </w:p>
+    <w:p>
+      <w:pPr>
+        <w:numPr>
+          <w:ilvl w:val="0"/>
+          <w:numId w:val="4"/>
+        </w:numPr>
+        <w:rPr>
+          <w:color w:val="4EA72E" w:themeColor="accent6"/>
+        </w:rPr>
+      </w:pPr>
+      <w:r>
+        <w:rPr>
+          <w:color w:val="4EA72E" w:themeColor="accent6"/>
+        </w:rPr>
+        <w:t>Add comment on tribofilms in boundary section: so what protects/lubricates the contact here? Solid, chemically formed boundary (tribofilms) that are 20-100nm in thickness.</w:t>
+      </w:r>
+    </w:p>
+    <w:p>
+      <w:pPr>
+        <w:numPr>
+          <w:ilvl w:val="1"/>
+          <w:numId w:val="4"/>
+        </w:numPr>
+        <w:rPr>
+          <w:color w:val="0070C0"/>
+        </w:rPr>
+      </w:pPr>
+      <w:r>
+        <w:rPr>
+          <w:color w:val="0070C0"/>
+        </w:rPr>
+        <w:t>Added comment on tribofilms to boundary section of 2.3.6</w:t>
+      </w:r>
+    </w:p>
+    <w:p>
+      <w:pPr>
+        <w:numPr>
+          <w:ilvl w:val="0"/>
+          <w:numId w:val="4"/>
+        </w:numPr>
+        <w:rPr>
+          <w:color w:val="E97132" w:themeColor="accent2"/>
+        </w:rPr>
+      </w:pPr>
+      <w:r>
+        <w:rPr>
+          <w:color w:val="E97132" w:themeColor="accent2"/>
+        </w:rPr>
         <w:t>Add further detail about the state of the art in EHL modelling (see further corrections form Amir)</w:t>
       </w:r>
-    </w:p>
-    <w:p>
-      <w:pPr>
-        <w:numPr>
-          <w:ilvl w:val="0"/>
-          <w:numId w:val="1"/>
+      <w:r>
+        <w:rPr>
+          <w:color w:val="E97132" w:themeColor="accent2"/>
+        </w:rPr>
+        <w:t xml:space="preserve">. </w:t>
+      </w:r>
+      <w:r>
+        <w:rPr>
+          <w:color w:val="E97132" w:themeColor="accent2"/>
+        </w:rPr>
+        <w:t>Experimental EHD studies</w:t>
+      </w:r>
+      <w:r>
+        <w:rPr>
+          <w:color w:val="E97132" w:themeColor="accent2"/>
+        </w:rPr>
+        <w:t xml:space="preserve">, </w:t>
+      </w:r>
+      <w:r>
+        <w:rPr>
+          <w:color w:val="E97132" w:themeColor="accent2"/>
+        </w:rPr>
+        <w:t>Gupta inlet heating correction factor</w:t>
+      </w:r>
+      <w:r>
+        <w:rPr>
+          <w:color w:val="E97132" w:themeColor="accent2"/>
+        </w:rPr>
+        <w:t xml:space="preserve">, </w:t>
+      </w:r>
+      <w:r>
+        <w:rPr>
+          <w:color w:val="E97132" w:themeColor="accent2"/>
+        </w:rPr>
+        <w:t>CFD models?</w:t>
+      </w:r>
+    </w:p>
+    <w:p>
+      <w:pPr>
+        <w:numPr>
+          <w:ilvl w:val="0"/>
+          <w:numId w:val="4"/>
+        </w:numPr>
+      </w:pPr>
+      <w:r>
+        <w:t>At the end of Lit Survey, add a section to clarify how this Lit Survey justifies the need for your work i.e. what you hope the work will be able to tel us that we do not know already ? What is the evidence that your approach is needed and can make a valid contribution? Why do we need tribo dynamic multi body analysis (inc effect so EHD films) and why do we need ANNs to be able to study these bearings better than we can with existing tools?</w:t>
+      </w:r>
+    </w:p>
+    <w:p>
+      <w:pPr>
+        <w:pStyle w:val="Heading2"/>
+      </w:pPr>
+      <w:r>
+        <w:t>Chapter 3 - Experimental Tribodynamics</w:t>
+      </w:r>
+    </w:p>
+    <w:p>
+      <w:pPr>
+        <w:numPr>
+          <w:ilvl w:val="0"/>
+          <w:numId w:val="10"/>
+        </w:numPr>
+        <w:rPr>
+          <w:color w:val="4EA72E" w:themeColor="accent6"/>
+        </w:rPr>
+      </w:pPr>
+      <w:r>
+        <w:rPr>
+          <w:color w:val="4EA72E" w:themeColor="accent6"/>
+        </w:rPr>
+        <w:t xml:space="preserve">Add bearing NDM value from experimental test. </w:t>
+      </w:r>
+      <w:r>
+        <w:rPr>
+          <w:color w:val="4EA72E" w:themeColor="accent6"/>
+        </w:rPr>
+        <w:t xml:space="preserve">so ~30mm Dm, which gives NDm ~450k. This is not usually considered as high speed bearing. </w:t>
+      </w:r>
+      <w:r>
+        <w:rPr>
+          <w:color w:val="4EA72E" w:themeColor="accent6"/>
+        </w:rPr>
+        <w:t>Discuss what is considered high-speed in relation to automotive</w:t>
+      </w:r>
+      <w:r>
+        <w:rPr>
+          <w:color w:val="4EA72E" w:themeColor="accent6"/>
+        </w:rPr>
+        <w:t>.</w:t>
+      </w:r>
+    </w:p>
+    <w:p>
+      <w:pPr>
+        <w:numPr>
+          <w:ilvl w:val="1"/>
+          <w:numId w:val="10"/>
+        </w:numPr>
+        <w:rPr>
+          <w:color w:val="0070C0"/>
+        </w:rPr>
+      </w:pPr>
+      <w:r>
+        <w:rPr>
+          <w:color w:val="0070C0"/>
+        </w:rPr>
+        <w:t>Discussion on what is considered high-speed is now included in new section 2.1.3 in literature review</w:t>
+      </w:r>
+      <w:r>
+        <w:rPr>
+          <w:color w:val="0070C0"/>
+        </w:rPr>
+        <w:t xml:space="preserve">. </w:t>
+      </w:r>
+      <w:r>
+        <w:rPr>
+          <w:color w:val="0070C0"/>
+        </w:rPr>
+        <w:t>nDm here is 578k since Dm is 38.5. Classified as high-speed (&lt;500k) as discussed in new nDm section</w:t>
+      </w:r>
+      <w:r>
+        <w:rPr>
+          <w:color w:val="0070C0"/>
+        </w:rPr>
+        <w:t>.</w:t>
+      </w:r>
+    </w:p>
+    <w:p>
+      <w:pPr>
+        <w:numPr>
+          <w:ilvl w:val="0"/>
+          <w:numId w:val="10"/>
+        </w:numPr>
+        <w:rPr>
+          <w:color w:val="4EA72E" w:themeColor="accent6"/>
+        </w:rPr>
+      </w:pPr>
+      <w:r>
+        <w:rPr>
+          <w:color w:val="4EA72E" w:themeColor="accent6"/>
+        </w:rPr>
+        <w:lastRenderedPageBreak/>
+        <w:t>What pressures in experimental test</w:t>
+      </w:r>
+    </w:p>
+    <w:p>
+      <w:pPr>
+        <w:numPr>
+          <w:ilvl w:val="1"/>
+          <w:numId w:val="10"/>
+        </w:numPr>
+        <w:rPr>
+          <w:color w:val="0070C0"/>
+        </w:rPr>
+      </w:pPr>
+      <w:r>
+        <w:rPr>
+          <w:color w:val="0070C0"/>
+        </w:rPr>
+        <w:t xml:space="preserve">Contact pressures are presented in the </w:t>
+      </w:r>
+      <w:r>
+        <w:rPr>
+          <w:color w:val="0070C0"/>
+        </w:rPr>
+        <w:t>results section and</w:t>
+      </w:r>
+      <w:r>
+        <w:rPr>
+          <w:color w:val="0070C0"/>
+        </w:rPr>
+        <w:t xml:space="preserve"> vary depending on dynamic response of rig (eg. resonance). A single nominal value would not be representative here.</w:t>
+      </w:r>
+    </w:p>
+    <w:p>
+      <w:pPr>
+        <w:numPr>
+          <w:ilvl w:val="0"/>
+          <w:numId w:val="10"/>
+        </w:numPr>
+      </w:pPr>
+      <w:r>
+        <w:t>How necessary is the iteration scheme here given the minimal impact of load on film? How does ignoring  this compare to other sources of error, for example accuracy of your location measurements? Add a short discussion with some values to illustrate  sensitivity of solution(s) to this if possible</w:t>
+      </w:r>
+    </w:p>
+    <w:p>
+      <w:pPr>
+        <w:numPr>
+          <w:ilvl w:val="0"/>
+          <w:numId w:val="10"/>
+        </w:numPr>
+        <w:rPr>
+          <w:color w:val="4EA72E" w:themeColor="accent6"/>
+        </w:rPr>
+      </w:pPr>
+      <w:r>
+        <w:rPr>
+          <w:color w:val="4EA72E" w:themeColor="accent6"/>
+        </w:rPr>
+        <w:t>Clarify if rig was built by candidate</w:t>
+      </w:r>
+    </w:p>
+    <w:p>
+      <w:pPr>
+        <w:numPr>
+          <w:ilvl w:val="1"/>
+          <w:numId w:val="10"/>
+        </w:numPr>
+        <w:rPr>
+          <w:color w:val="0070C0"/>
+        </w:rPr>
+      </w:pPr>
+      <w:r>
+        <w:rPr>
+          <w:color w:val="0070C0"/>
+        </w:rPr>
+        <w:t>Added to footnotes</w:t>
+      </w:r>
+    </w:p>
+    <w:p>
+      <w:pPr>
+        <w:numPr>
+          <w:ilvl w:val="0"/>
+          <w:numId w:val="10"/>
+        </w:numPr>
+        <w:rPr>
+          <w:color w:val="000000" w:themeColor="text1"/>
+        </w:rPr>
+      </w:pPr>
+      <w:r>
+        <w:rPr>
+          <w:color w:val="000000" w:themeColor="text1"/>
+        </w:rPr>
+        <w:t>What acceleration is this from 0-15000rpm in 4s? Was this accounted for in the EHL film predictions? What entrainment speed? Are there inlet shear heating effects? You go through a lot of trouble to describe the 1D Reynolds solver but these other factors may be just as (or even more) important. Add brief discussion.</w:t>
+      </w:r>
+    </w:p>
+    <w:p>
+      <w:pPr>
+        <w:numPr>
+          <w:ilvl w:val="0"/>
+          <w:numId w:val="10"/>
+        </w:numPr>
+        <w:rPr>
+          <w:color w:val="4EA72E" w:themeColor="accent6"/>
+        </w:rPr>
+      </w:pPr>
+      <w:r>
+        <w:rPr>
+          <w:color w:val="4EA72E" w:themeColor="accent6"/>
+        </w:rPr>
+        <w:t>Film is determined by inlet conditions where pressures are much lower than in the contact, in 10s MPa. Correct this to make clear (sec 3.3.3)</w:t>
+      </w:r>
+    </w:p>
+    <w:p>
+      <w:pPr>
+        <w:numPr>
+          <w:ilvl w:val="1"/>
+          <w:numId w:val="10"/>
+        </w:numPr>
+        <w:rPr>
+          <w:color w:val="0070C0"/>
+        </w:rPr>
+      </w:pPr>
+      <w:r>
+        <w:rPr>
+          <w:color w:val="0070C0"/>
+        </w:rPr>
+        <w:t>Corrected description of film formation</w:t>
+      </w:r>
+    </w:p>
+    <w:p>
+      <w:pPr>
+        <w:numPr>
+          <w:ilvl w:val="0"/>
+          <w:numId w:val="10"/>
+        </w:numPr>
+        <w:rPr>
+          <w:color w:val="E97132" w:themeColor="accent2"/>
+        </w:rPr>
+      </w:pPr>
+      <w:r>
+        <w:rPr>
+          <w:color w:val="E97132" w:themeColor="accent2"/>
+        </w:rPr>
+        <w:t>Was temperature effect on lubricant viscosity accounted for? Also inlet shear heating?</w:t>
+      </w:r>
+    </w:p>
+    <w:p>
+      <w:pPr>
+        <w:numPr>
+          <w:ilvl w:val="0"/>
+          <w:numId w:val="10"/>
+        </w:numPr>
+        <w:rPr>
+          <w:color w:val="E97132" w:themeColor="accent2"/>
+        </w:rPr>
+      </w:pPr>
+      <w:r>
+        <w:rPr>
+          <w:color w:val="E97132" w:themeColor="accent2"/>
+        </w:rPr>
+        <w:t>This is a lot of effort to calculate bearing EHD film thickness. But did you account for other potentially important effects such as inlet shear heating? How much do these predictions differ from a standard EHD regression equation approach using thermal correction such as that of Gupta, say? Please discuss and clarify this.</w:t>
+      </w:r>
+    </w:p>
+    <w:p>
+      <w:pPr>
+        <w:numPr>
+          <w:ilvl w:val="0"/>
+          <w:numId w:val="10"/>
+        </w:numPr>
+        <w:rPr>
+          <w:color w:val="4EA72E" w:themeColor="accent6"/>
+        </w:rPr>
+      </w:pPr>
+      <w:r>
+        <w:rPr>
+          <w:color w:val="4EA72E" w:themeColor="accent6"/>
+        </w:rPr>
+        <w:t>Improve description of figure 3.13</w:t>
+      </w:r>
+    </w:p>
+    <w:p>
+      <w:pPr>
+        <w:numPr>
+          <w:ilvl w:val="1"/>
+          <w:numId w:val="10"/>
+        </w:numPr>
+        <w:rPr>
+          <w:color w:val="0070C0"/>
+        </w:rPr>
+      </w:pPr>
+      <w:r>
+        <w:rPr>
+          <w:color w:val="0070C0"/>
+        </w:rPr>
+        <w:t>Contact oscillation and change of regime explained in the text as discussed in the viva.</w:t>
+      </w:r>
+    </w:p>
+    <w:p>
+      <w:pPr>
+        <w:numPr>
+          <w:ilvl w:val="0"/>
+          <w:numId w:val="10"/>
+        </w:numPr>
+        <w:rPr>
+          <w:color w:val="4EA72E" w:themeColor="accent6"/>
+        </w:rPr>
+      </w:pPr>
+      <w:r>
+        <w:rPr>
+          <w:color w:val="4EA72E" w:themeColor="accent6"/>
+        </w:rPr>
+        <w:t>Explain differences in Figure 3.16 better</w:t>
+      </w:r>
+    </w:p>
+    <w:p>
+      <w:pPr>
+        <w:numPr>
+          <w:ilvl w:val="1"/>
+          <w:numId w:val="10"/>
+        </w:numPr>
+        <w:rPr>
+          <w:color w:val="0070C0"/>
+        </w:rPr>
+      </w:pPr>
+      <w:r>
+        <w:rPr>
+          <w:color w:val="0070C0"/>
+        </w:rPr>
+        <w:t>Added reference to film acting as interference wedge at the start of section and made the description clearer to reflect what was discussed in the viva.</w:t>
+      </w:r>
+    </w:p>
+    <w:p>
+      <w:pPr>
+        <w:numPr>
+          <w:ilvl w:val="0"/>
+          <w:numId w:val="10"/>
+        </w:numPr>
+        <w:rPr>
+          <w:color w:val="4EA72E" w:themeColor="accent6"/>
+        </w:rPr>
+      </w:pPr>
+      <w:r>
+        <w:rPr>
+          <w:color w:val="4EA72E" w:themeColor="accent6"/>
+        </w:rPr>
+        <w:t>What is the accuracy of the displacement measurements</w:t>
+      </w:r>
+    </w:p>
+    <w:p>
+      <w:pPr>
+        <w:numPr>
+          <w:ilvl w:val="1"/>
+          <w:numId w:val="10"/>
+        </w:numPr>
+        <w:rPr>
+          <w:color w:val="0070C0"/>
+        </w:rPr>
+      </w:pPr>
+      <w:r>
+        <w:rPr>
+          <w:color w:val="0070C0"/>
+        </w:rPr>
+        <w:t>Added specifications to 3.2.5 - Instrumentation</w:t>
+      </w:r>
+    </w:p>
+    <w:p>
+      <w:pPr>
+        <w:numPr>
+          <w:ilvl w:val="0"/>
+          <w:numId w:val="10"/>
         </w:numPr>
       </w:pPr>
       <w:r>
@@ -217,7 +1138,7 @@
       <w:pPr>
         <w:numPr>
           <w:ilvl w:val="0"/>
-          <w:numId w:val="1"/>
+          <w:numId w:val="10"/>
         </w:numPr>
       </w:pPr>
       <w:r>
@@ -227,30 +1148,121 @@
     <w:p>
       <w:pPr>
         <w:numPr>
-          <w:ilvl w:val="0"/>
-          <w:numId w:val="1"/>
-        </w:numPr>
-      </w:pPr>
-      <w:r>
+          <w:ilvl w:val="1"/>
+          <w:numId w:val="10"/>
+        </w:numPr>
+      </w:pPr>
+      <w:r>
+        <w:t>Not directly stated, but the design intent of the rig was to continue with validation. The designs and technical drawings for the adaptations were done in the scope of the PhD, but did not materialize due to lab access during Covid and moving to AVL.</w:t>
+      </w:r>
+    </w:p>
+    <w:p>
+      <w:pPr>
+        <w:numPr>
+          <w:ilvl w:val="0"/>
+          <w:numId w:val="10"/>
+        </w:numPr>
+        <w:rPr>
+          <w:color w:val="4EA72E" w:themeColor="accent6"/>
+        </w:rPr>
+      </w:pPr>
+      <w:r>
+        <w:rPr>
+          <w:color w:val="4EA72E" w:themeColor="accent6"/>
+        </w:rPr>
+        <w:lastRenderedPageBreak/>
         <w:t>Section 3.2.3 - briefly justify/explain your choices of the various rig and test parameters/specifications.</w:t>
       </w:r>
     </w:p>
     <w:p>
       <w:pPr>
         <w:numPr>
-          <w:ilvl w:val="0"/>
-          <w:numId w:val="1"/>
-        </w:numPr>
-      </w:pPr>
-      <w:r>
+          <w:ilvl w:val="1"/>
+          <w:numId w:val="10"/>
+        </w:numPr>
+        <w:rPr>
+          <w:color w:val="0070C0"/>
+        </w:rPr>
+      </w:pPr>
+      <w:r>
+        <w:rPr>
+          <w:color w:val="0070C0"/>
+        </w:rPr>
+        <w:t>Added justification for rig components and design.</w:t>
+      </w:r>
+    </w:p>
+    <w:p>
+      <w:pPr>
+        <w:numPr>
+          <w:ilvl w:val="0"/>
+          <w:numId w:val="10"/>
+        </w:numPr>
+        <w:rPr>
+          <w:color w:val="4EA72E" w:themeColor="accent6"/>
+        </w:rPr>
+      </w:pPr>
+      <w:r>
+        <w:rPr>
+          <w:color w:val="4EA72E" w:themeColor="accent6"/>
+        </w:rPr>
         <w:t>Section 3.2.5 - justify/explain your choices of the various signal processing parameters/approaches.</w:t>
       </w:r>
     </w:p>
     <w:p>
       <w:pPr>
         <w:numPr>
-          <w:ilvl w:val="0"/>
-          <w:numId w:val="1"/>
+          <w:ilvl w:val="1"/>
+          <w:numId w:val="10"/>
+        </w:numPr>
+        <w:rPr>
+          <w:color w:val="0070C0"/>
+        </w:rPr>
+      </w:pPr>
+      <w:r>
+        <w:rPr>
+          <w:color w:val="0070C0"/>
+        </w:rPr>
+        <w:t>Added justification to the signal processing approaches, focussed mainly on the filtering and SFFT.</w:t>
+      </w:r>
+    </w:p>
+    <w:p>
+      <w:pPr>
+        <w:numPr>
+          <w:ilvl w:val="0"/>
+          <w:numId w:val="10"/>
+        </w:numPr>
+      </w:pPr>
+      <w:r>
+        <w:t>Elaborate on mechansim of film acting as interference wedge</w:t>
+      </w:r>
+    </w:p>
+    <w:p>
+      <w:pPr>
+        <w:numPr>
+          <w:ilvl w:val="0"/>
+          <w:numId w:val="10"/>
+        </w:numPr>
+      </w:pPr>
+      <w:r>
+        <w:t>This</w:t>
+      </w:r>
+      <w:r>
+        <w:t xml:space="preserve"> gives good justification to the need for your work ... Such a big increase in bearing load would result in a massive reduction in bearing life, right?  But we do not account for it in bearing life calculations. Should we? Or is this specific to conditions and assumptions here? Discuss either way.</w:t>
+      </w:r>
+    </w:p>
+    <w:p>
+      <w:pPr>
+        <w:pStyle w:val="Heading2"/>
+      </w:pPr>
+      <w:r>
+        <w:t>Chapter 4 – FMBD Modelling</w:t>
+      </w:r>
+    </w:p>
+    <w:p>
+      <w:pPr>
+        <w:numPr>
+          <w:ilvl w:val="0"/>
+          <w:numId w:val="6"/>
         </w:numPr>
       </w:pPr>
       <w:r>
@@ -261,40 +1273,241 @@
       <w:pPr>
         <w:numPr>
           <w:ilvl w:val="0"/>
-          <w:numId w:val="1"/>
-        </w:numPr>
-      </w:pPr>
-      <w:r>
+          <w:numId w:val="6"/>
+        </w:numPr>
+      </w:pPr>
+      <w:r>
+        <w:t>How much of your input is needed to model this using this ready-made software? Is the contribution here the link between your component level model and this system level software? Please clarify</w:t>
+      </w:r>
+    </w:p>
+    <w:p>
+      <w:pPr>
+        <w:numPr>
+          <w:ilvl w:val="0"/>
+          <w:numId w:val="6"/>
+        </w:numPr>
+      </w:pPr>
+      <w:r>
+        <w:t>So essentially this allows you to plug in your bearing model from Chapter 3 into this system level software, right? This is OK but please clarify the novelty in this part of the work (co-simulation). This could be the implementation or the results as discussed.</w:t>
+      </w:r>
+    </w:p>
+    <w:p>
+      <w:pPr>
+        <w:numPr>
+          <w:ilvl w:val="0"/>
+          <w:numId w:val="6"/>
+        </w:numPr>
+        <w:rPr>
+          <w:color w:val="4EA72E" w:themeColor="accent6"/>
+        </w:rPr>
+      </w:pPr>
+      <w:r>
+        <w:rPr>
+          <w:color w:val="4EA72E" w:themeColor="accent6"/>
+        </w:rPr>
+        <w:t>How is the dynamic response of gears pair (and the motor itself) modelled here? Briefly explain</w:t>
+      </w:r>
+    </w:p>
+    <w:p>
+      <w:pPr>
+        <w:numPr>
+          <w:ilvl w:val="1"/>
+          <w:numId w:val="6"/>
+        </w:numPr>
+        <w:rPr>
+          <w:color w:val="0070C0"/>
+        </w:rPr>
+      </w:pPr>
+      <w:r>
+        <w:rPr>
+          <w:color w:val="0070C0"/>
+        </w:rPr>
+        <w:t>This is already explained in section 4.3.2, including what isn't modelled (flexible bodies in representative excitation model and stator tooth forces due to minimal lateral contribution once resolved).</w:t>
+      </w:r>
+      <w:r>
+        <w:rPr>
+          <w:color w:val="0070C0"/>
+        </w:rPr>
+        <w:t xml:space="preserve"> Refined description</w:t>
+      </w:r>
+    </w:p>
+    <w:p>
+      <w:pPr>
+        <w:numPr>
+          <w:ilvl w:val="0"/>
+          <w:numId w:val="6"/>
+        </w:numPr>
+        <w:rPr>
+          <w:color w:val="000000" w:themeColor="text1"/>
+        </w:rPr>
+      </w:pPr>
+      <w:r>
+        <w:rPr>
+          <w:color w:val="000000" w:themeColor="text1"/>
+        </w:rPr>
+        <w:t>Can you add a line or two to provide a physical explanation of why the elastic deformation is so much bigger for the lubricated case vs dry given that externally  applied loads are the same? How is the housing modelled here?</w:t>
+      </w:r>
+    </w:p>
+    <w:p>
+      <w:pPr>
+        <w:numPr>
+          <w:ilvl w:val="0"/>
+          <w:numId w:val="6"/>
+        </w:numPr>
+        <w:rPr>
+          <w:color w:val="000000" w:themeColor="text1"/>
+        </w:rPr>
+      </w:pPr>
+      <w:r>
+        <w:rPr>
+          <w:color w:val="000000" w:themeColor="text1"/>
+        </w:rPr>
+        <w:t>Relatively small variation. Does this help to show that there is no need to accurately model film dependence on load as mentioned before? Discuss briefly if you think it worthwhile but OK to ignore.</w:t>
+      </w:r>
+    </w:p>
+    <w:p>
+      <w:pPr>
+        <w:numPr>
+          <w:ilvl w:val="0"/>
+          <w:numId w:val="6"/>
+        </w:numPr>
+        <w:rPr>
+          <w:color w:val="000000" w:themeColor="text1"/>
+        </w:rPr>
+      </w:pPr>
+      <w:r>
+        <w:rPr>
+          <w:color w:val="000000" w:themeColor="text1"/>
+        </w:rPr>
+        <w:t>OK. How does this value compare to that from simple EHD regression predictions?</w:t>
+      </w:r>
+    </w:p>
+    <w:p>
+      <w:pPr>
+        <w:numPr>
+          <w:ilvl w:val="0"/>
+          <w:numId w:val="6"/>
+        </w:numPr>
+        <w:rPr>
+          <w:color w:val="4EA72E" w:themeColor="accent6"/>
+        </w:rPr>
+      </w:pPr>
+      <w:r>
+        <w:rPr>
+          <w:color w:val="4EA72E" w:themeColor="accent6"/>
+        </w:rPr>
         <w:t>Fig 4.6 - text says peak torque is 68 Nm, but graph suggest 80 something.</w:t>
       </w:r>
     </w:p>
     <w:p>
       <w:pPr>
         <w:numPr>
-          <w:ilvl w:val="0"/>
-          <w:numId w:val="1"/>
-        </w:numPr>
-      </w:pPr>
-      <w:r>
+          <w:ilvl w:val="1"/>
+          <w:numId w:val="6"/>
+        </w:numPr>
+        <w:rPr>
+          <w:color w:val="0070C0"/>
+        </w:rPr>
+      </w:pPr>
+      <w:r>
+        <w:rPr>
+          <w:color w:val="0070C0"/>
+        </w:rPr>
+        <w:t>Clarified as maximum average torque delivered by PMSM</w:t>
+      </w:r>
+    </w:p>
+    <w:p>
+      <w:pPr>
+        <w:numPr>
+          <w:ilvl w:val="0"/>
+          <w:numId w:val="6"/>
+        </w:numPr>
+        <w:rPr>
+          <w:color w:val="4EA72E" w:themeColor="accent6"/>
+        </w:rPr>
+      </w:pPr>
+      <w:r>
+        <w:rPr>
+          <w:color w:val="4EA72E" w:themeColor="accent6"/>
+        </w:rPr>
         <w:t>Table 4.2 - state where these are from.</w:t>
       </w:r>
     </w:p>
     <w:p>
       <w:pPr>
         <w:numPr>
-          <w:ilvl w:val="0"/>
-          <w:numId w:val="1"/>
-        </w:numPr>
-      </w:pPr>
-      <w:r>
+          <w:ilvl w:val="1"/>
+          <w:numId w:val="6"/>
+        </w:numPr>
+        <w:rPr>
+          <w:color w:val="0070C0"/>
+        </w:rPr>
+      </w:pPr>
+      <w:r>
+        <w:rPr>
+          <w:color w:val="0070C0"/>
+        </w:rPr>
+        <w:lastRenderedPageBreak/>
+        <w:t>Th</w:t>
+      </w:r>
+      <w:r>
+        <w:rPr>
+          <w:color w:val="0070C0"/>
+        </w:rPr>
+        <w:t>ese correspond to a light transmission oil. The lubricant and rheological parameters were provided by AVL</w:t>
+      </w:r>
+      <w:r>
+        <w:rPr>
+          <w:color w:val="0070C0"/>
+        </w:rPr>
+        <w:t>.</w:t>
+      </w:r>
+    </w:p>
+    <w:p>
+      <w:pPr>
+        <w:numPr>
+          <w:ilvl w:val="0"/>
+          <w:numId w:val="6"/>
+        </w:numPr>
+        <w:rPr>
+          <w:color w:val="4EA72E" w:themeColor="accent6"/>
+        </w:rPr>
+      </w:pPr>
+      <w:r>
+        <w:rPr>
+          <w:color w:val="4EA72E" w:themeColor="accent6"/>
+        </w:rPr>
         <w:t>Fig 4.11 is pretty much unreadable - have as a full landscape page?</w:t>
       </w:r>
     </w:p>
     <w:p>
       <w:pPr>
         <w:numPr>
-          <w:ilvl w:val="0"/>
-          <w:numId w:val="1"/>
+          <w:ilvl w:val="1"/>
+          <w:numId w:val="6"/>
+        </w:numPr>
+        <w:rPr>
+          <w:color w:val="0070C0"/>
+        </w:rPr>
+      </w:pPr>
+      <w:r>
+        <w:rPr>
+          <w:color w:val="0070C0"/>
+        </w:rPr>
+        <w:t>Amended</w:t>
+      </w:r>
+      <w:r>
+        <w:rPr>
+          <w:color w:val="0070C0"/>
+        </w:rPr>
+        <w:t xml:space="preserve"> to full landscape page</w:t>
+      </w:r>
+    </w:p>
+    <w:p>
+      <w:pPr>
+        <w:numPr>
+          <w:ilvl w:val="0"/>
+          <w:numId w:val="6"/>
         </w:numPr>
       </w:pPr>
       <w:r>
@@ -305,10 +1518,35 @@
       <w:pPr>
         <w:numPr>
           <w:ilvl w:val="0"/>
-          <w:numId w:val="1"/>
-        </w:numPr>
-      </w:pPr>
-      <w:r>
+          <w:numId w:val="6"/>
+        </w:numPr>
+      </w:pPr>
+      <w:r>
+        <w:t>Comment on the significance of the huge increase in contact force.</w:t>
+      </w:r>
+    </w:p>
+    <w:p>
+      <w:pPr>
+        <w:pStyle w:val="Heading2"/>
+      </w:pPr>
+      <w:r>
+        <w:t>Chapter 5 - ANN</w:t>
+      </w:r>
+    </w:p>
+    <w:p>
+      <w:pPr>
+        <w:numPr>
+          <w:ilvl w:val="0"/>
+          <w:numId w:val="11"/>
+        </w:numPr>
+        <w:rPr>
+          <w:color w:val="000000" w:themeColor="text1"/>
+        </w:rPr>
+      </w:pPr>
+      <w:r>
+        <w:rPr>
+          <w:color w:val="000000" w:themeColor="text1"/>
+        </w:rPr>
         <w:t>Chapter 5 - make it clearer from where the various techniques that you've combined for the ANN method.</w:t>
       </w:r>
     </w:p>
@@ -316,7 +1554,202 @@
       <w:pPr>
         <w:numPr>
           <w:ilvl w:val="0"/>
-          <w:numId w:val="1"/>
+          <w:numId w:val="11"/>
+        </w:numPr>
+        <w:rPr>
+          <w:color w:val="000000" w:themeColor="text1"/>
+        </w:rPr>
+      </w:pPr>
+      <w:r>
+        <w:rPr>
+          <w:color w:val="000000" w:themeColor="text1"/>
+        </w:rPr>
+        <w:t>Statements on regression equations not being valid outside of bounds of data used to generate: This is often stated in the thesis but not properly justified with evidence. Is there any evidence that these analytical (regression) equations for EHL are not sufficiently accurate in this context? Including this would help to justify your approach.</w:t>
+      </w:r>
+    </w:p>
+    <w:p>
+      <w:pPr>
+        <w:numPr>
+          <w:ilvl w:val="0"/>
+          <w:numId w:val="11"/>
+        </w:numPr>
+        <w:rPr>
+          <w:color w:val="E97132" w:themeColor="accent2"/>
+        </w:rPr>
+      </w:pPr>
+      <w:r>
+        <w:rPr>
+          <w:color w:val="E97132" w:themeColor="accent2"/>
+        </w:rPr>
+        <w:t>At these speeds the standard EHD theory is not valid due to inlet shear heating effects but there are several corrections out there (based on experimental data). Did you try to use Gupta correction for example? This needs discussing with relevant references (also mentioned above in a previous comment)</w:t>
+      </w:r>
+    </w:p>
+    <w:p>
+      <w:pPr>
+        <w:numPr>
+          <w:ilvl w:val="0"/>
+          <w:numId w:val="11"/>
+        </w:numPr>
+        <w:rPr>
+          <w:color w:val="000000" w:themeColor="text1"/>
+        </w:rPr>
+      </w:pPr>
+      <w:r>
+        <w:rPr>
+          <w:color w:val="000000" w:themeColor="text1"/>
+        </w:rPr>
+        <w:t>Clarify who did what with regards to the ANN section</w:t>
+      </w:r>
+    </w:p>
+    <w:p>
+      <w:pPr>
+        <w:numPr>
+          <w:ilvl w:val="0"/>
+          <w:numId w:val="11"/>
+        </w:numPr>
+        <w:rPr>
+          <w:color w:val="000000" w:themeColor="text1"/>
+        </w:rPr>
+      </w:pPr>
+      <w:r>
+        <w:rPr>
+          <w:color w:val="000000" w:themeColor="text1"/>
+        </w:rPr>
+        <w:t xml:space="preserve">So if thermal effects are not included in your present solution what is the reason for the observed differences? I would have excepted this to be the biggest effect.  </w:t>
+      </w:r>
+    </w:p>
+    <w:p>
+      <w:pPr>
+        <w:numPr>
+          <w:ilvl w:val="0"/>
+          <w:numId w:val="11"/>
+        </w:numPr>
+        <w:rPr>
+          <w:color w:val="4EA72E" w:themeColor="accent6"/>
+        </w:rPr>
+      </w:pPr>
+      <w:r>
+        <w:rPr>
+          <w:color w:val="4EA72E" w:themeColor="accent6"/>
+        </w:rPr>
+        <w:t>How did you determine 9 input variables?</w:t>
+      </w:r>
+    </w:p>
+    <w:p>
+      <w:pPr>
+        <w:numPr>
+          <w:ilvl w:val="1"/>
+          <w:numId w:val="11"/>
+        </w:numPr>
+        <w:rPr>
+          <w:color w:val="0070C0"/>
+        </w:rPr>
+      </w:pPr>
+      <w:r>
+        <w:rPr>
+          <w:color w:val="0070C0"/>
+        </w:rPr>
+        <w:t>Required variables for the EHL film thickness calculation.</w:t>
+      </w:r>
+    </w:p>
+    <w:p>
+      <w:pPr>
+        <w:numPr>
+          <w:ilvl w:val="0"/>
+          <w:numId w:val="11"/>
+        </w:numPr>
+        <w:rPr>
+          <w:color w:val="000000" w:themeColor="text1"/>
+        </w:rPr>
+      </w:pPr>
+      <w:r>
+        <w:rPr>
+          <w:color w:val="000000" w:themeColor="text1"/>
+        </w:rPr>
+        <w:t>OK, I can see the value of this (Greenwood boundaries). But how different is the present approach to that in [92]? Please add text to clarify the differences and hence novelty of your work.</w:t>
+      </w:r>
+    </w:p>
+    <w:p>
+      <w:pPr>
+        <w:numPr>
+          <w:ilvl w:val="0"/>
+          <w:numId w:val="11"/>
+        </w:numPr>
+        <w:rPr>
+          <w:color w:val="E97132" w:themeColor="accent2"/>
+        </w:rPr>
+      </w:pPr>
+      <w:r>
+        <w:rPr>
+          <w:color w:val="E97132" w:themeColor="accent2"/>
+        </w:rPr>
+        <w:t>Isothermal valid for high speeds? Comment</w:t>
+      </w:r>
+    </w:p>
+    <w:p>
+      <w:pPr>
+        <w:numPr>
+          <w:ilvl w:val="0"/>
+          <w:numId w:val="11"/>
+        </w:numPr>
+        <w:rPr>
+          <w:color w:val="000000" w:themeColor="text1"/>
+        </w:rPr>
+      </w:pPr>
+      <w:r>
+        <w:rPr>
+          <w:color w:val="000000" w:themeColor="text1"/>
+        </w:rPr>
+        <w:t>Why not validate ANN against experiment?</w:t>
+      </w:r>
+    </w:p>
+    <w:p>
+      <w:pPr>
+        <w:numPr>
+          <w:ilvl w:val="0"/>
+          <w:numId w:val="11"/>
+        </w:numPr>
+        <w:rPr>
+          <w:color w:val="000000" w:themeColor="text1"/>
+        </w:rPr>
+      </w:pPr>
+      <w:r>
+        <w:rPr>
+          <w:color w:val="000000" w:themeColor="text1"/>
+        </w:rPr>
+        <w:t>Yes, but ideally you should compare model predictions to a completely new set of data available in literature (e.g. Maclaren et al, high speed film thickness data or similar). It would  have been a good addition to this chapter but there is no time for this now, something to think about in the future. The possibility and the value of this should be mentioned though.</w:t>
+      </w:r>
+    </w:p>
+    <w:p>
+      <w:pPr>
+        <w:numPr>
+          <w:ilvl w:val="0"/>
+          <w:numId w:val="11"/>
+        </w:numPr>
+        <w:rPr>
+          <w:color w:val="000000" w:themeColor="text1"/>
+        </w:rPr>
+      </w:pPr>
+      <w:r>
+        <w:rPr>
+          <w:color w:val="000000" w:themeColor="text1"/>
+        </w:rPr>
+        <w:t>Clarify why large discrepency at high speed between analytical and numerical predicitions</w:t>
+      </w:r>
+    </w:p>
+    <w:p>
+      <w:pPr>
+        <w:pStyle w:val="Heading2"/>
+      </w:pPr>
+      <w:r>
+        <w:t>Chapter 6 - Conclusions</w:t>
+      </w:r>
+    </w:p>
+    <w:p>
+      <w:pPr>
+        <w:numPr>
+          <w:ilvl w:val="0"/>
+          <w:numId w:val="8"/>
         </w:numPr>
       </w:pPr>
       <w:r>
@@ -327,7 +1760,7 @@
       <w:pPr>
         <w:numPr>
           <w:ilvl w:val="0"/>
-          <w:numId w:val="1"/>
+          <w:numId w:val="8"/>
         </w:numPr>
       </w:pPr>
       <w:r>
@@ -350,9 +1783,386 @@
 <file path=word/numbering.xml><?xml version="1.0" encoding="utf-8"?>
 <w:numbering xmlns:wpc="http://schemas.microsoft.com/office/word/2010/wordprocessingCanvas" xmlns:cx="http://schemas.microsoft.com/office/drawing/2014/chartex" xmlns:cx1="http://schemas.microsoft.com/office/drawing/2015/9/8/chartex" xmlns:cx2="http://schemas.microsoft.com/office/drawing/2015/10/21/chartex" xmlns:cx3="http://schemas.microsoft.com/office/drawing/2016/5/9/chartex" xmlns:cx4="http://schemas.microsoft.com/office/drawing/2016/5/10/chartex" xmlns:cx5="http://schemas.microsoft.com/office/drawing/2016/5/11/chartex" xmlns:cx6="http://schemas.microsoft.com/office/drawing/2016/5/12/chartex" xmlns:cx7="http://schemas.microsoft.com/office/drawing/2016/5/13/chartex" xmlns:cx8="http://schemas.microsoft.com/office/drawing/2016/5/14/chartex" xmlns:mc="http://schemas.openxmlformats.org/markup-compatibility/2006" xmlns:aink="http://schemas.microsoft.com/office/drawing/2016/ink" xmlns:am3d="http://schemas.microsoft.com/office/drawing/2017/model3d" xmlns:o="urn:schemas-microsoft-com:office:office" xmlns:oel="http://schemas.microsoft.com/office/2019/extlst" xmlns:r="http://schemas.openxmlformats.org/officeDocument/2006/relationships" xmlns:m="http://schemas.openxmlformats.org/officeDocument/2006/math" xmlns:v="urn:schemas-microsoft-com:vml" xmlns:wp14="http://schemas.microsoft.com/office/word/2010/wordprocessingDrawing" xmlns:wp="http://schemas.openxmlformats.org/drawingml/2006/wordprocessingDrawing" xmlns:w10="urn:schemas-microsoft-com:office:word" xmlns:w="http://schemas.openxmlformats.org/wordprocessingml/2006/main" xmlns:w14="http://schemas.microsoft.com/office/word/2010/wordml" xmlns:w15="http://schemas.microsoft.com/office/word/2012/wordml" xmlns:w16cex="http://schemas.microsoft.com/office/word/2018/wordml/cex" xmlns:w16cid="http://schemas.microsoft.com/office/word/2016/wordml/cid" xmlns:w16="http://schemas.microsoft.com/office/word/2018/wordml" xmlns:w16du="http://schemas.microsoft.com/office/word/2023/wordml/word16du" xmlns:w16sdtdh="http://schemas.microsoft.com/office/word/2020/wordml/sdtdatahash" xmlns:w16sdtfl="http://schemas.microsoft.com/office/word/2024/wordml/sdtformatlock" xmlns:w16se="http://schemas.microsoft.com/office/word/2015/wordml/symex" xmlns:wpg="http://schemas.microsoft.com/office/word/2010/wordprocessingGroup" xmlns:wpi="http://schemas.microsoft.com/office/word/2010/wordprocessingInk" xmlns:wne="http://schemas.microsoft.com/office/word/2006/wordml" xmlns:wps="http://schemas.microsoft.com/office/word/2010/wordprocessingShape" mc:Ignorable="w14 w15 w16se w16cid w16 w16cex w16sdtdh w16sdtfl w16du wp14">
   <w:abstractNum w:abstractNumId="0" w15:restartNumberingAfterBreak="0">
-    <w:nsid w:val="47666336"/>
+    <w:nsid w:val="0B0C6FCA"/>
     <w:multiLevelType w:val="multilevel"/>
-    <w:tmpl w:val="9D961DF8"/>
+    <w:tmpl w:val="0809001D"/>
+    <w:lvl w:ilvl="0">
+      <w:start w:val="1"/>
+      <w:numFmt w:val="decimal"/>
+      <w:lvlText w:val="%1)"/>
+      <w:lvlJc w:val="left"/>
+      <w:pPr>
+        <w:ind w:left="360" w:hanging="360"/>
+      </w:pPr>
+    </w:lvl>
+    <w:lvl w:ilvl="1">
+      <w:start w:val="1"/>
+      <w:numFmt w:val="lowerLetter"/>
+      <w:lvlText w:val="%2)"/>
+      <w:lvlJc w:val="left"/>
+      <w:pPr>
+        <w:ind w:left="720" w:hanging="360"/>
+      </w:pPr>
+    </w:lvl>
+    <w:lvl w:ilvl="2">
+      <w:start w:val="1"/>
+      <w:numFmt w:val="lowerRoman"/>
+      <w:lvlText w:val="%3)"/>
+      <w:lvlJc w:val="left"/>
+      <w:pPr>
+        <w:ind w:left="1080" w:hanging="360"/>
+      </w:pPr>
+    </w:lvl>
+    <w:lvl w:ilvl="3">
+      <w:start w:val="1"/>
+      <w:numFmt w:val="decimal"/>
+      <w:lvlText w:val="(%4)"/>
+      <w:lvlJc w:val="left"/>
+      <w:pPr>
+        <w:ind w:left="1440" w:hanging="360"/>
+      </w:pPr>
+    </w:lvl>
+    <w:lvl w:ilvl="4">
+      <w:start w:val="1"/>
+      <w:numFmt w:val="lowerLetter"/>
+      <w:lvlText w:val="(%5)"/>
+      <w:lvlJc w:val="left"/>
+      <w:pPr>
+        <w:ind w:left="1800" w:hanging="360"/>
+      </w:pPr>
+    </w:lvl>
+    <w:lvl w:ilvl="5">
+      <w:start w:val="1"/>
+      <w:numFmt w:val="lowerRoman"/>
+      <w:lvlText w:val="(%6)"/>
+      <w:lvlJc w:val="left"/>
+      <w:pPr>
+        <w:ind w:left="2160" w:hanging="360"/>
+      </w:pPr>
+    </w:lvl>
+    <w:lvl w:ilvl="6">
+      <w:start w:val="1"/>
+      <w:numFmt w:val="decimal"/>
+      <w:lvlText w:val="%7."/>
+      <w:lvlJc w:val="left"/>
+      <w:pPr>
+        <w:ind w:left="2520" w:hanging="360"/>
+      </w:pPr>
+    </w:lvl>
+    <w:lvl w:ilvl="7">
+      <w:start w:val="1"/>
+      <w:numFmt w:val="lowerLetter"/>
+      <w:lvlText w:val="%8."/>
+      <w:lvlJc w:val="left"/>
+      <w:pPr>
+        <w:ind w:left="2880" w:hanging="360"/>
+      </w:pPr>
+    </w:lvl>
+    <w:lvl w:ilvl="8">
+      <w:start w:val="1"/>
+      <w:numFmt w:val="lowerRoman"/>
+      <w:lvlText w:val="%9."/>
+      <w:lvlJc w:val="left"/>
+      <w:pPr>
+        <w:ind w:left="3240" w:hanging="360"/>
+      </w:pPr>
+    </w:lvl>
+  </w:abstractNum>
+  <w:abstractNum w:abstractNumId="1" w15:restartNumberingAfterBreak="0">
+    <w:nsid w:val="0B962AE7"/>
+    <w:multiLevelType w:val="hybridMultilevel"/>
+    <w:tmpl w:val="2B1E7FAC"/>
+    <w:lvl w:ilvl="0" w:tplc="08090001">
+      <w:start w:val="1"/>
+      <w:numFmt w:val="bullet"/>
+      <w:lvlText w:val=""/>
+      <w:lvlJc w:val="left"/>
+      <w:pPr>
+        <w:ind w:left="720" w:hanging="360"/>
+      </w:pPr>
+      <w:rPr>
+        <w:rFonts w:ascii="Symbol" w:hAnsi="Symbol" w:hint="default"/>
+      </w:rPr>
+    </w:lvl>
+    <w:lvl w:ilvl="1" w:tplc="08090003" w:tentative="1">
+      <w:start w:val="1"/>
+      <w:numFmt w:val="bullet"/>
+      <w:lvlText w:val="o"/>
+      <w:lvlJc w:val="left"/>
+      <w:pPr>
+        <w:ind w:left="1440" w:hanging="360"/>
+      </w:pPr>
+      <w:rPr>
+        <w:rFonts w:ascii="Courier New" w:hAnsi="Courier New" w:cs="Courier New" w:hint="default"/>
+      </w:rPr>
+    </w:lvl>
+    <w:lvl w:ilvl="2" w:tplc="08090005" w:tentative="1">
+      <w:start w:val="1"/>
+      <w:numFmt w:val="bullet"/>
+      <w:lvlText w:val=""/>
+      <w:lvlJc w:val="left"/>
+      <w:pPr>
+        <w:ind w:left="2160" w:hanging="360"/>
+      </w:pPr>
+      <w:rPr>
+        <w:rFonts w:ascii="Wingdings" w:hAnsi="Wingdings" w:hint="default"/>
+      </w:rPr>
+    </w:lvl>
+    <w:lvl w:ilvl="3" w:tplc="08090001" w:tentative="1">
+      <w:start w:val="1"/>
+      <w:numFmt w:val="bullet"/>
+      <w:lvlText w:val=""/>
+      <w:lvlJc w:val="left"/>
+      <w:pPr>
+        <w:ind w:left="2880" w:hanging="360"/>
+      </w:pPr>
+      <w:rPr>
+        <w:rFonts w:ascii="Symbol" w:hAnsi="Symbol" w:hint="default"/>
+      </w:rPr>
+    </w:lvl>
+    <w:lvl w:ilvl="4" w:tplc="08090003" w:tentative="1">
+      <w:start w:val="1"/>
+      <w:numFmt w:val="bullet"/>
+      <w:lvlText w:val="o"/>
+      <w:lvlJc w:val="left"/>
+      <w:pPr>
+        <w:ind w:left="3600" w:hanging="360"/>
+      </w:pPr>
+      <w:rPr>
+        <w:rFonts w:ascii="Courier New" w:hAnsi="Courier New" w:cs="Courier New" w:hint="default"/>
+      </w:rPr>
+    </w:lvl>
+    <w:lvl w:ilvl="5" w:tplc="08090005" w:tentative="1">
+      <w:start w:val="1"/>
+      <w:numFmt w:val="bullet"/>
+      <w:lvlText w:val=""/>
+      <w:lvlJc w:val="left"/>
+      <w:pPr>
+        <w:ind w:left="4320" w:hanging="360"/>
+      </w:pPr>
+      <w:rPr>
+        <w:rFonts w:ascii="Wingdings" w:hAnsi="Wingdings" w:hint="default"/>
+      </w:rPr>
+    </w:lvl>
+    <w:lvl w:ilvl="6" w:tplc="08090001" w:tentative="1">
+      <w:start w:val="1"/>
+      <w:numFmt w:val="bullet"/>
+      <w:lvlText w:val=""/>
+      <w:lvlJc w:val="left"/>
+      <w:pPr>
+        <w:ind w:left="5040" w:hanging="360"/>
+      </w:pPr>
+      <w:rPr>
+        <w:rFonts w:ascii="Symbol" w:hAnsi="Symbol" w:hint="default"/>
+      </w:rPr>
+    </w:lvl>
+    <w:lvl w:ilvl="7" w:tplc="08090003" w:tentative="1">
+      <w:start w:val="1"/>
+      <w:numFmt w:val="bullet"/>
+      <w:lvlText w:val="o"/>
+      <w:lvlJc w:val="left"/>
+      <w:pPr>
+        <w:ind w:left="5760" w:hanging="360"/>
+      </w:pPr>
+      <w:rPr>
+        <w:rFonts w:ascii="Courier New" w:hAnsi="Courier New" w:cs="Courier New" w:hint="default"/>
+      </w:rPr>
+    </w:lvl>
+    <w:lvl w:ilvl="8" w:tplc="08090005" w:tentative="1">
+      <w:start w:val="1"/>
+      <w:numFmt w:val="bullet"/>
+      <w:lvlText w:val=""/>
+      <w:lvlJc w:val="left"/>
+      <w:pPr>
+        <w:ind w:left="6480" w:hanging="360"/>
+      </w:pPr>
+      <w:rPr>
+        <w:rFonts w:ascii="Wingdings" w:hAnsi="Wingdings" w:hint="default"/>
+      </w:rPr>
+    </w:lvl>
+  </w:abstractNum>
+  <w:abstractNum w:abstractNumId="2" w15:restartNumberingAfterBreak="0">
+    <w:nsid w:val="0C4265B5"/>
+    <w:multiLevelType w:val="multilevel"/>
+    <w:tmpl w:val="E79872A4"/>
+    <w:lvl w:ilvl="0">
+      <w:start w:val="1"/>
+      <w:numFmt w:val="decimal"/>
+      <w:lvlText w:val="%1)"/>
+      <w:lvlJc w:val="left"/>
+      <w:pPr>
+        <w:ind w:left="360" w:hanging="360"/>
+      </w:pPr>
+    </w:lvl>
+    <w:lvl w:ilvl="1">
+      <w:start w:val="1"/>
+      <w:numFmt w:val="bullet"/>
+      <w:lvlText w:val=""/>
+      <w:lvlJc w:val="left"/>
+      <w:pPr>
+        <w:ind w:left="720" w:hanging="360"/>
+      </w:pPr>
+      <w:rPr>
+        <w:rFonts w:ascii="Symbol" w:hAnsi="Symbol" w:hint="default"/>
+      </w:rPr>
+    </w:lvl>
+    <w:lvl w:ilvl="2">
+      <w:start w:val="1"/>
+      <w:numFmt w:val="lowerRoman"/>
+      <w:lvlText w:val="%3)"/>
+      <w:lvlJc w:val="left"/>
+      <w:pPr>
+        <w:ind w:left="1080" w:hanging="360"/>
+      </w:pPr>
+    </w:lvl>
+    <w:lvl w:ilvl="3">
+      <w:start w:val="1"/>
+      <w:numFmt w:val="decimal"/>
+      <w:lvlText w:val="(%4)"/>
+      <w:lvlJc w:val="left"/>
+      <w:pPr>
+        <w:ind w:left="1440" w:hanging="360"/>
+      </w:pPr>
+    </w:lvl>
+    <w:lvl w:ilvl="4">
+      <w:start w:val="1"/>
+      <w:numFmt w:val="lowerLetter"/>
+      <w:lvlText w:val="(%5)"/>
+      <w:lvlJc w:val="left"/>
+      <w:pPr>
+        <w:ind w:left="1800" w:hanging="360"/>
+      </w:pPr>
+    </w:lvl>
+    <w:lvl w:ilvl="5">
+      <w:start w:val="1"/>
+      <w:numFmt w:val="lowerRoman"/>
+      <w:lvlText w:val="(%6)"/>
+      <w:lvlJc w:val="left"/>
+      <w:pPr>
+        <w:ind w:left="2160" w:hanging="360"/>
+      </w:pPr>
+    </w:lvl>
+    <w:lvl w:ilvl="6">
+      <w:start w:val="1"/>
+      <w:numFmt w:val="decimal"/>
+      <w:lvlText w:val="%7."/>
+      <w:lvlJc w:val="left"/>
+      <w:pPr>
+        <w:ind w:left="2520" w:hanging="360"/>
+      </w:pPr>
+    </w:lvl>
+    <w:lvl w:ilvl="7">
+      <w:start w:val="1"/>
+      <w:numFmt w:val="lowerLetter"/>
+      <w:lvlText w:val="%8."/>
+      <w:lvlJc w:val="left"/>
+      <w:pPr>
+        <w:ind w:left="2880" w:hanging="360"/>
+      </w:pPr>
+    </w:lvl>
+    <w:lvl w:ilvl="8">
+      <w:start w:val="1"/>
+      <w:numFmt w:val="lowerRoman"/>
+      <w:lvlText w:val="%9."/>
+      <w:lvlJc w:val="left"/>
+      <w:pPr>
+        <w:ind w:left="3240" w:hanging="360"/>
+      </w:pPr>
+    </w:lvl>
+  </w:abstractNum>
+  <w:abstractNum w:abstractNumId="3" w15:restartNumberingAfterBreak="0">
+    <w:nsid w:val="2EA5200E"/>
+    <w:multiLevelType w:val="multilevel"/>
+    <w:tmpl w:val="E79872A4"/>
+    <w:lvl w:ilvl="0">
+      <w:start w:val="1"/>
+      <w:numFmt w:val="decimal"/>
+      <w:lvlText w:val="%1)"/>
+      <w:lvlJc w:val="left"/>
+      <w:pPr>
+        <w:ind w:left="360" w:hanging="360"/>
+      </w:pPr>
+    </w:lvl>
+    <w:lvl w:ilvl="1">
+      <w:start w:val="1"/>
+      <w:numFmt w:val="bullet"/>
+      <w:lvlText w:val=""/>
+      <w:lvlJc w:val="left"/>
+      <w:pPr>
+        <w:ind w:left="720" w:hanging="360"/>
+      </w:pPr>
+      <w:rPr>
+        <w:rFonts w:ascii="Symbol" w:hAnsi="Symbol" w:hint="default"/>
+      </w:rPr>
+    </w:lvl>
+    <w:lvl w:ilvl="2">
+      <w:start w:val="1"/>
+      <w:numFmt w:val="lowerRoman"/>
+      <w:lvlText w:val="%3)"/>
+      <w:lvlJc w:val="left"/>
+      <w:pPr>
+        <w:ind w:left="1080" w:hanging="360"/>
+      </w:pPr>
+    </w:lvl>
+    <w:lvl w:ilvl="3">
+      <w:start w:val="1"/>
+      <w:numFmt w:val="decimal"/>
+      <w:lvlText w:val="(%4)"/>
+      <w:lvlJc w:val="left"/>
+      <w:pPr>
+        <w:ind w:left="1440" w:hanging="360"/>
+      </w:pPr>
+    </w:lvl>
+    <w:lvl w:ilvl="4">
+      <w:start w:val="1"/>
+      <w:numFmt w:val="lowerLetter"/>
+      <w:lvlText w:val="(%5)"/>
+      <w:lvlJc w:val="left"/>
+      <w:pPr>
+        <w:ind w:left="1800" w:hanging="360"/>
+      </w:pPr>
+    </w:lvl>
+    <w:lvl w:ilvl="5">
+      <w:start w:val="1"/>
+      <w:numFmt w:val="lowerRoman"/>
+      <w:lvlText w:val="(%6)"/>
+      <w:lvlJc w:val="left"/>
+      <w:pPr>
+        <w:ind w:left="2160" w:hanging="360"/>
+      </w:pPr>
+    </w:lvl>
+    <w:lvl w:ilvl="6">
+      <w:start w:val="1"/>
+      <w:numFmt w:val="decimal"/>
+      <w:lvlText w:val="%7."/>
+      <w:lvlJc w:val="left"/>
+      <w:pPr>
+        <w:ind w:left="2520" w:hanging="360"/>
+      </w:pPr>
+    </w:lvl>
+    <w:lvl w:ilvl="7">
+      <w:start w:val="1"/>
+      <w:numFmt w:val="lowerLetter"/>
+      <w:lvlText w:val="%8."/>
+      <w:lvlJc w:val="left"/>
+      <w:pPr>
+        <w:ind w:left="2880" w:hanging="360"/>
+      </w:pPr>
+    </w:lvl>
+    <w:lvl w:ilvl="8">
+      <w:start w:val="1"/>
+      <w:numFmt w:val="lowerRoman"/>
+      <w:lvlText w:val="%9."/>
+      <w:lvlJc w:val="left"/>
+      <w:pPr>
+        <w:ind w:left="3240" w:hanging="360"/>
+      </w:pPr>
+    </w:lvl>
+  </w:abstractNum>
+  <w:abstractNum w:abstractNumId="4" w15:restartNumberingAfterBreak="0">
+    <w:nsid w:val="3A82510C"/>
+    <w:multiLevelType w:val="multilevel"/>
+    <w:tmpl w:val="9F60B382"/>
     <w:lvl w:ilvl="0">
       <w:start w:val="1"/>
       <w:numFmt w:val="decimal"/>
@@ -374,6 +2184,318 @@
         <w:ind w:left="1440" w:hanging="360"/>
       </w:pPr>
     </w:lvl>
+    <w:lvl w:ilvl="2">
+      <w:start w:val="1"/>
+      <w:numFmt w:val="bullet"/>
+      <w:lvlText w:val=""/>
+      <w:lvlJc w:val="left"/>
+      <w:pPr>
+        <w:ind w:left="2160" w:hanging="360"/>
+      </w:pPr>
+      <w:rPr>
+        <w:rFonts w:ascii="Symbol" w:hAnsi="Symbol" w:hint="default"/>
+      </w:rPr>
+    </w:lvl>
+    <w:lvl w:ilvl="3" w:tentative="1">
+      <w:start w:val="1"/>
+      <w:numFmt w:val="decimal"/>
+      <w:lvlText w:val="%4."/>
+      <w:lvlJc w:val="left"/>
+      <w:pPr>
+        <w:tabs>
+          <w:tab w:val="num" w:pos="2880"/>
+        </w:tabs>
+        <w:ind w:left="2880" w:hanging="360"/>
+      </w:pPr>
+    </w:lvl>
+    <w:lvl w:ilvl="4" w:tentative="1">
+      <w:start w:val="1"/>
+      <w:numFmt w:val="decimal"/>
+      <w:lvlText w:val="%5."/>
+      <w:lvlJc w:val="left"/>
+      <w:pPr>
+        <w:tabs>
+          <w:tab w:val="num" w:pos="3600"/>
+        </w:tabs>
+        <w:ind w:left="3600" w:hanging="360"/>
+      </w:pPr>
+    </w:lvl>
+    <w:lvl w:ilvl="5" w:tentative="1">
+      <w:start w:val="1"/>
+      <w:numFmt w:val="decimal"/>
+      <w:lvlText w:val="%6."/>
+      <w:lvlJc w:val="left"/>
+      <w:pPr>
+        <w:tabs>
+          <w:tab w:val="num" w:pos="4320"/>
+        </w:tabs>
+        <w:ind w:left="4320" w:hanging="360"/>
+      </w:pPr>
+    </w:lvl>
+    <w:lvl w:ilvl="6" w:tentative="1">
+      <w:start w:val="1"/>
+      <w:numFmt w:val="decimal"/>
+      <w:lvlText w:val="%7."/>
+      <w:lvlJc w:val="left"/>
+      <w:pPr>
+        <w:tabs>
+          <w:tab w:val="num" w:pos="5040"/>
+        </w:tabs>
+        <w:ind w:left="5040" w:hanging="360"/>
+      </w:pPr>
+    </w:lvl>
+    <w:lvl w:ilvl="7" w:tentative="1">
+      <w:start w:val="1"/>
+      <w:numFmt w:val="decimal"/>
+      <w:lvlText w:val="%8."/>
+      <w:lvlJc w:val="left"/>
+      <w:pPr>
+        <w:tabs>
+          <w:tab w:val="num" w:pos="5760"/>
+        </w:tabs>
+        <w:ind w:left="5760" w:hanging="360"/>
+      </w:pPr>
+    </w:lvl>
+    <w:lvl w:ilvl="8" w:tentative="1">
+      <w:start w:val="1"/>
+      <w:numFmt w:val="decimal"/>
+      <w:lvlText w:val="%9."/>
+      <w:lvlJc w:val="left"/>
+      <w:pPr>
+        <w:tabs>
+          <w:tab w:val="num" w:pos="6480"/>
+        </w:tabs>
+        <w:ind w:left="6480" w:hanging="360"/>
+      </w:pPr>
+    </w:lvl>
+  </w:abstractNum>
+  <w:abstractNum w:abstractNumId="5" w15:restartNumberingAfterBreak="0">
+    <w:nsid w:val="47666336"/>
+    <w:multiLevelType w:val="multilevel"/>
+    <w:tmpl w:val="9F60B382"/>
+    <w:lvl w:ilvl="0">
+      <w:start w:val="1"/>
+      <w:numFmt w:val="decimal"/>
+      <w:lvlText w:val="%1."/>
+      <w:lvlJc w:val="left"/>
+      <w:pPr>
+        <w:tabs>
+          <w:tab w:val="num" w:pos="720"/>
+        </w:tabs>
+        <w:ind w:left="720" w:hanging="360"/>
+      </w:pPr>
+    </w:lvl>
+    <w:lvl w:ilvl="1">
+      <w:start w:val="1"/>
+      <w:numFmt w:val="lowerLetter"/>
+      <w:lvlText w:val="%2)"/>
+      <w:lvlJc w:val="left"/>
+      <w:pPr>
+        <w:ind w:left="1440" w:hanging="360"/>
+      </w:pPr>
+    </w:lvl>
+    <w:lvl w:ilvl="2">
+      <w:start w:val="1"/>
+      <w:numFmt w:val="bullet"/>
+      <w:lvlText w:val=""/>
+      <w:lvlJc w:val="left"/>
+      <w:pPr>
+        <w:ind w:left="2160" w:hanging="360"/>
+      </w:pPr>
+      <w:rPr>
+        <w:rFonts w:ascii="Symbol" w:hAnsi="Symbol" w:hint="default"/>
+      </w:rPr>
+    </w:lvl>
+    <w:lvl w:ilvl="3" w:tentative="1">
+      <w:start w:val="1"/>
+      <w:numFmt w:val="decimal"/>
+      <w:lvlText w:val="%4."/>
+      <w:lvlJc w:val="left"/>
+      <w:pPr>
+        <w:tabs>
+          <w:tab w:val="num" w:pos="2880"/>
+        </w:tabs>
+        <w:ind w:left="2880" w:hanging="360"/>
+      </w:pPr>
+    </w:lvl>
+    <w:lvl w:ilvl="4" w:tentative="1">
+      <w:start w:val="1"/>
+      <w:numFmt w:val="decimal"/>
+      <w:lvlText w:val="%5."/>
+      <w:lvlJc w:val="left"/>
+      <w:pPr>
+        <w:tabs>
+          <w:tab w:val="num" w:pos="3600"/>
+        </w:tabs>
+        <w:ind w:left="3600" w:hanging="360"/>
+      </w:pPr>
+    </w:lvl>
+    <w:lvl w:ilvl="5" w:tentative="1">
+      <w:start w:val="1"/>
+      <w:numFmt w:val="decimal"/>
+      <w:lvlText w:val="%6."/>
+      <w:lvlJc w:val="left"/>
+      <w:pPr>
+        <w:tabs>
+          <w:tab w:val="num" w:pos="4320"/>
+        </w:tabs>
+        <w:ind w:left="4320" w:hanging="360"/>
+      </w:pPr>
+    </w:lvl>
+    <w:lvl w:ilvl="6" w:tentative="1">
+      <w:start w:val="1"/>
+      <w:numFmt w:val="decimal"/>
+      <w:lvlText w:val="%7."/>
+      <w:lvlJc w:val="left"/>
+      <w:pPr>
+        <w:tabs>
+          <w:tab w:val="num" w:pos="5040"/>
+        </w:tabs>
+        <w:ind w:left="5040" w:hanging="360"/>
+      </w:pPr>
+    </w:lvl>
+    <w:lvl w:ilvl="7" w:tentative="1">
+      <w:start w:val="1"/>
+      <w:numFmt w:val="decimal"/>
+      <w:lvlText w:val="%8."/>
+      <w:lvlJc w:val="left"/>
+      <w:pPr>
+        <w:tabs>
+          <w:tab w:val="num" w:pos="5760"/>
+        </w:tabs>
+        <w:ind w:left="5760" w:hanging="360"/>
+      </w:pPr>
+    </w:lvl>
+    <w:lvl w:ilvl="8" w:tentative="1">
+      <w:start w:val="1"/>
+      <w:numFmt w:val="decimal"/>
+      <w:lvlText w:val="%9."/>
+      <w:lvlJc w:val="left"/>
+      <w:pPr>
+        <w:tabs>
+          <w:tab w:val="num" w:pos="6480"/>
+        </w:tabs>
+        <w:ind w:left="6480" w:hanging="360"/>
+      </w:pPr>
+    </w:lvl>
+  </w:abstractNum>
+  <w:abstractNum w:abstractNumId="6" w15:restartNumberingAfterBreak="0">
+    <w:nsid w:val="54C729BE"/>
+    <w:multiLevelType w:val="multilevel"/>
+    <w:tmpl w:val="E79872A4"/>
+    <w:lvl w:ilvl="0">
+      <w:start w:val="1"/>
+      <w:numFmt w:val="decimal"/>
+      <w:lvlText w:val="%1)"/>
+      <w:lvlJc w:val="left"/>
+      <w:pPr>
+        <w:ind w:left="360" w:hanging="360"/>
+      </w:pPr>
+    </w:lvl>
+    <w:lvl w:ilvl="1">
+      <w:start w:val="1"/>
+      <w:numFmt w:val="bullet"/>
+      <w:lvlText w:val=""/>
+      <w:lvlJc w:val="left"/>
+      <w:pPr>
+        <w:ind w:left="720" w:hanging="360"/>
+      </w:pPr>
+      <w:rPr>
+        <w:rFonts w:ascii="Symbol" w:hAnsi="Symbol" w:hint="default"/>
+      </w:rPr>
+    </w:lvl>
+    <w:lvl w:ilvl="2">
+      <w:start w:val="1"/>
+      <w:numFmt w:val="lowerRoman"/>
+      <w:lvlText w:val="%3)"/>
+      <w:lvlJc w:val="left"/>
+      <w:pPr>
+        <w:ind w:left="1080" w:hanging="360"/>
+      </w:pPr>
+    </w:lvl>
+    <w:lvl w:ilvl="3">
+      <w:start w:val="1"/>
+      <w:numFmt w:val="decimal"/>
+      <w:lvlText w:val="(%4)"/>
+      <w:lvlJc w:val="left"/>
+      <w:pPr>
+        <w:ind w:left="1440" w:hanging="360"/>
+      </w:pPr>
+    </w:lvl>
+    <w:lvl w:ilvl="4">
+      <w:start w:val="1"/>
+      <w:numFmt w:val="lowerLetter"/>
+      <w:lvlText w:val="(%5)"/>
+      <w:lvlJc w:val="left"/>
+      <w:pPr>
+        <w:ind w:left="1800" w:hanging="360"/>
+      </w:pPr>
+    </w:lvl>
+    <w:lvl w:ilvl="5">
+      <w:start w:val="1"/>
+      <w:numFmt w:val="lowerRoman"/>
+      <w:lvlText w:val="(%6)"/>
+      <w:lvlJc w:val="left"/>
+      <w:pPr>
+        <w:ind w:left="2160" w:hanging="360"/>
+      </w:pPr>
+    </w:lvl>
+    <w:lvl w:ilvl="6">
+      <w:start w:val="1"/>
+      <w:numFmt w:val="decimal"/>
+      <w:lvlText w:val="%7."/>
+      <w:lvlJc w:val="left"/>
+      <w:pPr>
+        <w:ind w:left="2520" w:hanging="360"/>
+      </w:pPr>
+    </w:lvl>
+    <w:lvl w:ilvl="7">
+      <w:start w:val="1"/>
+      <w:numFmt w:val="lowerLetter"/>
+      <w:lvlText w:val="%8."/>
+      <w:lvlJc w:val="left"/>
+      <w:pPr>
+        <w:ind w:left="2880" w:hanging="360"/>
+      </w:pPr>
+    </w:lvl>
+    <w:lvl w:ilvl="8">
+      <w:start w:val="1"/>
+      <w:numFmt w:val="lowerRoman"/>
+      <w:lvlText w:val="%9."/>
+      <w:lvlJc w:val="left"/>
+      <w:pPr>
+        <w:ind w:left="3240" w:hanging="360"/>
+      </w:pPr>
+    </w:lvl>
+  </w:abstractNum>
+  <w:abstractNum w:abstractNumId="7" w15:restartNumberingAfterBreak="0">
+    <w:nsid w:val="652504B8"/>
+    <w:multiLevelType w:val="multilevel"/>
+    <w:tmpl w:val="6BFACFD0"/>
+    <w:lvl w:ilvl="0">
+      <w:start w:val="1"/>
+      <w:numFmt w:val="decimal"/>
+      <w:lvlText w:val="%1."/>
+      <w:lvlJc w:val="left"/>
+      <w:pPr>
+        <w:tabs>
+          <w:tab w:val="num" w:pos="720"/>
+        </w:tabs>
+        <w:ind w:left="720" w:hanging="360"/>
+      </w:pPr>
+    </w:lvl>
+    <w:lvl w:ilvl="1">
+      <w:start w:val="1"/>
+      <w:numFmt w:val="decimal"/>
+      <w:lvlText w:val="%2."/>
+      <w:lvlJc w:val="left"/>
+      <w:pPr>
+        <w:tabs>
+          <w:tab w:val="num" w:pos="1440"/>
+        </w:tabs>
+        <w:ind w:left="1440" w:hanging="360"/>
+      </w:pPr>
+    </w:lvl>
     <w:lvl w:ilvl="2" w:tentative="1">
       <w:start w:val="1"/>
       <w:numFmt w:val="decimal"/>
@@ -459,14 +2581,14 @@
       </w:pPr>
     </w:lvl>
   </w:abstractNum>
-  <w:abstractNum w:abstractNumId="1" w15:restartNumberingAfterBreak="0">
-    <w:nsid w:val="652504B8"/>
+  <w:abstractNum w:abstractNumId="8" w15:restartNumberingAfterBreak="0">
+    <w:nsid w:val="6C537067"/>
     <w:multiLevelType w:val="multilevel"/>
-    <w:tmpl w:val="6BFACFD0"/>
+    <w:tmpl w:val="E3EEA7A0"/>
     <w:lvl w:ilvl="0">
       <w:start w:val="1"/>
-      <w:numFmt w:val="decimal"/>
-      <w:lvlText w:val="%1."/>
+      <w:numFmt w:val="bullet"/>
+      <w:lvlText w:val=""/>
       <w:lvlJc w:val="left"/>
       <w:pPr>
         <w:tabs>
@@ -474,11 +2596,15 @@
         </w:tabs>
         <w:ind w:left="720" w:hanging="360"/>
       </w:pPr>
-    </w:lvl>
-    <w:lvl w:ilvl="1">
-      <w:start w:val="1"/>
-      <w:numFmt w:val="decimal"/>
-      <w:lvlText w:val="%2."/>
+      <w:rPr>
+        <w:rFonts w:ascii="Symbol" w:hAnsi="Symbol" w:hint="default"/>
+        <w:sz w:val="20"/>
+      </w:rPr>
+    </w:lvl>
+    <w:lvl w:ilvl="1" w:tentative="1">
+      <w:start w:val="1"/>
+      <w:numFmt w:val="bullet"/>
+      <w:lvlText w:val=""/>
       <w:lvlJc w:val="left"/>
       <w:pPr>
         <w:tabs>
@@ -486,11 +2612,15 @@
         </w:tabs>
         <w:ind w:left="1440" w:hanging="360"/>
       </w:pPr>
+      <w:rPr>
+        <w:rFonts w:ascii="Symbol" w:hAnsi="Symbol" w:hint="default"/>
+        <w:sz w:val="20"/>
+      </w:rPr>
     </w:lvl>
     <w:lvl w:ilvl="2" w:tentative="1">
       <w:start w:val="1"/>
-      <w:numFmt w:val="decimal"/>
-      <w:lvlText w:val="%3."/>
+      <w:numFmt w:val="bullet"/>
+      <w:lvlText w:val=""/>
       <w:lvlJc w:val="left"/>
       <w:pPr>
         <w:tabs>
@@ -498,11 +2628,15 @@
         </w:tabs>
         <w:ind w:left="2160" w:hanging="360"/>
       </w:pPr>
+      <w:rPr>
+        <w:rFonts w:ascii="Symbol" w:hAnsi="Symbol" w:hint="default"/>
+        <w:sz w:val="20"/>
+      </w:rPr>
     </w:lvl>
     <w:lvl w:ilvl="3" w:tentative="1">
       <w:start w:val="1"/>
-      <w:numFmt w:val="decimal"/>
-      <w:lvlText w:val="%4."/>
+      <w:numFmt w:val="bullet"/>
+      <w:lvlText w:val=""/>
       <w:lvlJc w:val="left"/>
       <w:pPr>
         <w:tabs>
@@ -510,11 +2644,15 @@
         </w:tabs>
         <w:ind w:left="2880" w:hanging="360"/>
       </w:pPr>
+      <w:rPr>
+        <w:rFonts w:ascii="Symbol" w:hAnsi="Symbol" w:hint="default"/>
+        <w:sz w:val="20"/>
+      </w:rPr>
     </w:lvl>
     <w:lvl w:ilvl="4" w:tentative="1">
       <w:start w:val="1"/>
-      <w:numFmt w:val="decimal"/>
-      <w:lvlText w:val="%5."/>
+      <w:numFmt w:val="bullet"/>
+      <w:lvlText w:val=""/>
       <w:lvlJc w:val="left"/>
       <w:pPr>
         <w:tabs>
@@ -522,11 +2660,15 @@
         </w:tabs>
         <w:ind w:left="3600" w:hanging="360"/>
       </w:pPr>
+      <w:rPr>
+        <w:rFonts w:ascii="Symbol" w:hAnsi="Symbol" w:hint="default"/>
+        <w:sz w:val="20"/>
+      </w:rPr>
     </w:lvl>
     <w:lvl w:ilvl="5" w:tentative="1">
       <w:start w:val="1"/>
-      <w:numFmt w:val="decimal"/>
-      <w:lvlText w:val="%6."/>
+      <w:numFmt w:val="bullet"/>
+      <w:lvlText w:val=""/>
       <w:lvlJc w:val="left"/>
       <w:pPr>
         <w:tabs>
@@ -534,11 +2676,15 @@
         </w:tabs>
         <w:ind w:left="4320" w:hanging="360"/>
       </w:pPr>
+      <w:rPr>
+        <w:rFonts w:ascii="Symbol" w:hAnsi="Symbol" w:hint="default"/>
+        <w:sz w:val="20"/>
+      </w:rPr>
     </w:lvl>
     <w:lvl w:ilvl="6" w:tentative="1">
       <w:start w:val="1"/>
-      <w:numFmt w:val="decimal"/>
-      <w:lvlText w:val="%7."/>
+      <w:numFmt w:val="bullet"/>
+      <w:lvlText w:val=""/>
       <w:lvlJc w:val="left"/>
       <w:pPr>
         <w:tabs>
@@ -546,11 +2692,15 @@
         </w:tabs>
         <w:ind w:left="5040" w:hanging="360"/>
       </w:pPr>
+      <w:rPr>
+        <w:rFonts w:ascii="Symbol" w:hAnsi="Symbol" w:hint="default"/>
+        <w:sz w:val="20"/>
+      </w:rPr>
     </w:lvl>
     <w:lvl w:ilvl="7" w:tentative="1">
       <w:start w:val="1"/>
-      <w:numFmt w:val="decimal"/>
-      <w:lvlText w:val="%8."/>
+      <w:numFmt w:val="bullet"/>
+      <w:lvlText w:val=""/>
       <w:lvlJc w:val="left"/>
       <w:pPr>
         <w:tabs>
@@ -558,11 +2708,15 @@
         </w:tabs>
         <w:ind w:left="5760" w:hanging="360"/>
       </w:pPr>
+      <w:rPr>
+        <w:rFonts w:ascii="Symbol" w:hAnsi="Symbol" w:hint="default"/>
+        <w:sz w:val="20"/>
+      </w:rPr>
     </w:lvl>
     <w:lvl w:ilvl="8" w:tentative="1">
       <w:start w:val="1"/>
-      <w:numFmt w:val="decimal"/>
-      <w:lvlText w:val="%9."/>
+      <w:numFmt w:val="bullet"/>
+      <w:lvlText w:val=""/>
       <w:lvlJc w:val="left"/>
       <w:pPr>
         <w:tabs>
@@ -570,13 +2724,308 @@
         </w:tabs>
         <w:ind w:left="6480" w:hanging="360"/>
       </w:pPr>
+      <w:rPr>
+        <w:rFonts w:ascii="Symbol" w:hAnsi="Symbol" w:hint="default"/>
+        <w:sz w:val="20"/>
+      </w:rPr>
+    </w:lvl>
+  </w:abstractNum>
+  <w:abstractNum w:abstractNumId="9" w15:restartNumberingAfterBreak="0">
+    <w:nsid w:val="6FB00A3F"/>
+    <w:multiLevelType w:val="multilevel"/>
+    <w:tmpl w:val="0809001D"/>
+    <w:lvl w:ilvl="0">
+      <w:start w:val="1"/>
+      <w:numFmt w:val="decimal"/>
+      <w:lvlText w:val="%1)"/>
+      <w:lvlJc w:val="left"/>
+      <w:pPr>
+        <w:ind w:left="360" w:hanging="360"/>
+      </w:pPr>
+    </w:lvl>
+    <w:lvl w:ilvl="1">
+      <w:start w:val="1"/>
+      <w:numFmt w:val="lowerLetter"/>
+      <w:lvlText w:val="%2)"/>
+      <w:lvlJc w:val="left"/>
+      <w:pPr>
+        <w:ind w:left="720" w:hanging="360"/>
+      </w:pPr>
+    </w:lvl>
+    <w:lvl w:ilvl="2">
+      <w:start w:val="1"/>
+      <w:numFmt w:val="lowerRoman"/>
+      <w:lvlText w:val="%3)"/>
+      <w:lvlJc w:val="left"/>
+      <w:pPr>
+        <w:ind w:left="1080" w:hanging="360"/>
+      </w:pPr>
+    </w:lvl>
+    <w:lvl w:ilvl="3">
+      <w:start w:val="1"/>
+      <w:numFmt w:val="decimal"/>
+      <w:lvlText w:val="(%4)"/>
+      <w:lvlJc w:val="left"/>
+      <w:pPr>
+        <w:ind w:left="1440" w:hanging="360"/>
+      </w:pPr>
+    </w:lvl>
+    <w:lvl w:ilvl="4">
+      <w:start w:val="1"/>
+      <w:numFmt w:val="lowerLetter"/>
+      <w:lvlText w:val="(%5)"/>
+      <w:lvlJc w:val="left"/>
+      <w:pPr>
+        <w:ind w:left="1800" w:hanging="360"/>
+      </w:pPr>
+    </w:lvl>
+    <w:lvl w:ilvl="5">
+      <w:start w:val="1"/>
+      <w:numFmt w:val="lowerRoman"/>
+      <w:lvlText w:val="(%6)"/>
+      <w:lvlJc w:val="left"/>
+      <w:pPr>
+        <w:ind w:left="2160" w:hanging="360"/>
+      </w:pPr>
+    </w:lvl>
+    <w:lvl w:ilvl="6">
+      <w:start w:val="1"/>
+      <w:numFmt w:val="decimal"/>
+      <w:lvlText w:val="%7."/>
+      <w:lvlJc w:val="left"/>
+      <w:pPr>
+        <w:ind w:left="2520" w:hanging="360"/>
+      </w:pPr>
+    </w:lvl>
+    <w:lvl w:ilvl="7">
+      <w:start w:val="1"/>
+      <w:numFmt w:val="lowerLetter"/>
+      <w:lvlText w:val="%8."/>
+      <w:lvlJc w:val="left"/>
+      <w:pPr>
+        <w:ind w:left="2880" w:hanging="360"/>
+      </w:pPr>
+    </w:lvl>
+    <w:lvl w:ilvl="8">
+      <w:start w:val="1"/>
+      <w:numFmt w:val="lowerRoman"/>
+      <w:lvlText w:val="%9."/>
+      <w:lvlJc w:val="left"/>
+      <w:pPr>
+        <w:ind w:left="3240" w:hanging="360"/>
+      </w:pPr>
+    </w:lvl>
+  </w:abstractNum>
+  <w:abstractNum w:abstractNumId="10" w15:restartNumberingAfterBreak="0">
+    <w:nsid w:val="707A3F30"/>
+    <w:multiLevelType w:val="multilevel"/>
+    <w:tmpl w:val="0809001D"/>
+    <w:lvl w:ilvl="0">
+      <w:start w:val="1"/>
+      <w:numFmt w:val="decimal"/>
+      <w:lvlText w:val="%1)"/>
+      <w:lvlJc w:val="left"/>
+      <w:pPr>
+        <w:ind w:left="360" w:hanging="360"/>
+      </w:pPr>
+    </w:lvl>
+    <w:lvl w:ilvl="1">
+      <w:start w:val="1"/>
+      <w:numFmt w:val="lowerLetter"/>
+      <w:lvlText w:val="%2)"/>
+      <w:lvlJc w:val="left"/>
+      <w:pPr>
+        <w:ind w:left="720" w:hanging="360"/>
+      </w:pPr>
+    </w:lvl>
+    <w:lvl w:ilvl="2">
+      <w:start w:val="1"/>
+      <w:numFmt w:val="lowerRoman"/>
+      <w:lvlText w:val="%3)"/>
+      <w:lvlJc w:val="left"/>
+      <w:pPr>
+        <w:ind w:left="1080" w:hanging="360"/>
+      </w:pPr>
+    </w:lvl>
+    <w:lvl w:ilvl="3">
+      <w:start w:val="1"/>
+      <w:numFmt w:val="decimal"/>
+      <w:lvlText w:val="(%4)"/>
+      <w:lvlJc w:val="left"/>
+      <w:pPr>
+        <w:ind w:left="1440" w:hanging="360"/>
+      </w:pPr>
+    </w:lvl>
+    <w:lvl w:ilvl="4">
+      <w:start w:val="1"/>
+      <w:numFmt w:val="lowerLetter"/>
+      <w:lvlText w:val="(%5)"/>
+      <w:lvlJc w:val="left"/>
+      <w:pPr>
+        <w:ind w:left="1800" w:hanging="360"/>
+      </w:pPr>
+    </w:lvl>
+    <w:lvl w:ilvl="5">
+      <w:start w:val="1"/>
+      <w:numFmt w:val="lowerRoman"/>
+      <w:lvlText w:val="(%6)"/>
+      <w:lvlJc w:val="left"/>
+      <w:pPr>
+        <w:ind w:left="2160" w:hanging="360"/>
+      </w:pPr>
+    </w:lvl>
+    <w:lvl w:ilvl="6">
+      <w:start w:val="1"/>
+      <w:numFmt w:val="decimal"/>
+      <w:lvlText w:val="%7."/>
+      <w:lvlJc w:val="left"/>
+      <w:pPr>
+        <w:ind w:left="2520" w:hanging="360"/>
+      </w:pPr>
+    </w:lvl>
+    <w:lvl w:ilvl="7">
+      <w:start w:val="1"/>
+      <w:numFmt w:val="lowerLetter"/>
+      <w:lvlText w:val="%8."/>
+      <w:lvlJc w:val="left"/>
+      <w:pPr>
+        <w:ind w:left="2880" w:hanging="360"/>
+      </w:pPr>
+    </w:lvl>
+    <w:lvl w:ilvl="8">
+      <w:start w:val="1"/>
+      <w:numFmt w:val="lowerRoman"/>
+      <w:lvlText w:val="%9."/>
+      <w:lvlJc w:val="left"/>
+      <w:pPr>
+        <w:ind w:left="3240" w:hanging="360"/>
+      </w:pPr>
+    </w:lvl>
+  </w:abstractNum>
+  <w:abstractNum w:abstractNumId="11" w15:restartNumberingAfterBreak="0">
+    <w:nsid w:val="79690723"/>
+    <w:multiLevelType w:val="multilevel"/>
+    <w:tmpl w:val="E79872A4"/>
+    <w:lvl w:ilvl="0">
+      <w:start w:val="1"/>
+      <w:numFmt w:val="decimal"/>
+      <w:lvlText w:val="%1)"/>
+      <w:lvlJc w:val="left"/>
+      <w:pPr>
+        <w:ind w:left="360" w:hanging="360"/>
+      </w:pPr>
+    </w:lvl>
+    <w:lvl w:ilvl="1">
+      <w:start w:val="1"/>
+      <w:numFmt w:val="bullet"/>
+      <w:lvlText w:val=""/>
+      <w:lvlJc w:val="left"/>
+      <w:pPr>
+        <w:ind w:left="720" w:hanging="360"/>
+      </w:pPr>
+      <w:rPr>
+        <w:rFonts w:ascii="Symbol" w:hAnsi="Symbol" w:hint="default"/>
+      </w:rPr>
+    </w:lvl>
+    <w:lvl w:ilvl="2">
+      <w:start w:val="1"/>
+      <w:numFmt w:val="lowerRoman"/>
+      <w:lvlText w:val="%3)"/>
+      <w:lvlJc w:val="left"/>
+      <w:pPr>
+        <w:ind w:left="1080" w:hanging="360"/>
+      </w:pPr>
+    </w:lvl>
+    <w:lvl w:ilvl="3">
+      <w:start w:val="1"/>
+      <w:numFmt w:val="decimal"/>
+      <w:lvlText w:val="(%4)"/>
+      <w:lvlJc w:val="left"/>
+      <w:pPr>
+        <w:ind w:left="1440" w:hanging="360"/>
+      </w:pPr>
+    </w:lvl>
+    <w:lvl w:ilvl="4">
+      <w:start w:val="1"/>
+      <w:numFmt w:val="lowerLetter"/>
+      <w:lvlText w:val="(%5)"/>
+      <w:lvlJc w:val="left"/>
+      <w:pPr>
+        <w:ind w:left="1800" w:hanging="360"/>
+      </w:pPr>
+    </w:lvl>
+    <w:lvl w:ilvl="5">
+      <w:start w:val="1"/>
+      <w:numFmt w:val="lowerRoman"/>
+      <w:lvlText w:val="(%6)"/>
+      <w:lvlJc w:val="left"/>
+      <w:pPr>
+        <w:ind w:left="2160" w:hanging="360"/>
+      </w:pPr>
+    </w:lvl>
+    <w:lvl w:ilvl="6">
+      <w:start w:val="1"/>
+      <w:numFmt w:val="decimal"/>
+      <w:lvlText w:val="%7."/>
+      <w:lvlJc w:val="left"/>
+      <w:pPr>
+        <w:ind w:left="2520" w:hanging="360"/>
+      </w:pPr>
+    </w:lvl>
+    <w:lvl w:ilvl="7">
+      <w:start w:val="1"/>
+      <w:numFmt w:val="lowerLetter"/>
+      <w:lvlText w:val="%8."/>
+      <w:lvlJc w:val="left"/>
+      <w:pPr>
+        <w:ind w:left="2880" w:hanging="360"/>
+      </w:pPr>
+    </w:lvl>
+    <w:lvl w:ilvl="8">
+      <w:start w:val="1"/>
+      <w:numFmt w:val="lowerRoman"/>
+      <w:lvlText w:val="%9."/>
+      <w:lvlJc w:val="left"/>
+      <w:pPr>
+        <w:ind w:left="3240" w:hanging="360"/>
+      </w:pPr>
     </w:lvl>
   </w:abstractNum>
   <w:num w:numId="1" w16cid:durableId="1852377650">
+    <w:abstractNumId w:val="7"/>
+  </w:num>
+  <w:num w:numId="2" w16cid:durableId="1248685562">
+    <w:abstractNumId w:val="5"/>
+  </w:num>
+  <w:num w:numId="3" w16cid:durableId="2006085230">
+    <w:abstractNumId w:val="4"/>
+  </w:num>
+  <w:num w:numId="4" w16cid:durableId="1986815891">
+    <w:abstractNumId w:val="11"/>
+  </w:num>
+  <w:num w:numId="5" w16cid:durableId="1202938048">
+    <w:abstractNumId w:val="10"/>
+  </w:num>
+  <w:num w:numId="6" w16cid:durableId="814488065">
+    <w:abstractNumId w:val="2"/>
+  </w:num>
+  <w:num w:numId="7" w16cid:durableId="1992055025">
+    <w:abstractNumId w:val="0"/>
+  </w:num>
+  <w:num w:numId="8" w16cid:durableId="1390154152">
+    <w:abstractNumId w:val="9"/>
+  </w:num>
+  <w:num w:numId="9" w16cid:durableId="1754859666">
     <w:abstractNumId w:val="1"/>
   </w:num>
-  <w:num w:numId="2" w16cid:durableId="1248685562">
-    <w:abstractNumId w:val="0"/>
+  <w:num w:numId="10" w16cid:durableId="493181992">
+    <w:abstractNumId w:val="6"/>
+  </w:num>
+  <w:num w:numId="11" w16cid:durableId="2025135030">
+    <w:abstractNumId w:val="3"/>
+  </w:num>
+  <w:num w:numId="12" w16cid:durableId="397246090">
+    <w:abstractNumId w:val="8"/>
   </w:num>
 </w:numbering>
 </file>
@@ -1009,10 +3458,9 @@
     <w:next w:val="Normal"/>
     <w:link w:val="Heading2Char"/>
     <w:uiPriority w:val="9"/>
-    <w:semiHidden/>
     <w:unhideWhenUsed/>
     <w:qFormat/>
-    <w:rsid w:val="00073FB0"/>
+    <w:rsid w:val="008B378B"/>
     <w:pPr>
       <w:keepNext/>
       <w:keepLines/>
@@ -1021,7 +3469,8 @@
     </w:pPr>
     <w:rPr>
       <w:rFonts w:asciiTheme="majorHAnsi" w:eastAsiaTheme="majorEastAsia" w:hAnsiTheme="majorHAnsi" w:cstheme="majorBidi"/>
-      <w:color w:val="0F4761" w:themeColor="accent1" w:themeShade="BF"/>
+      <w:i/>
+      <w:color w:val="0E2841" w:themeColor="text2"/>
       <w:sz w:val="32"/>
       <w:szCs w:val="32"/>
     </w:rPr>
@@ -1184,7 +3633,6 @@
   <w:style w:type="character" w:default="1" w:styleId="DefaultParagraphFont">
     <w:name w:val="Default Paragraph Font"/>
     <w:uiPriority w:val="1"/>
-    <w:semiHidden/>
     <w:unhideWhenUsed/>
   </w:style>
   <w:style w:type="table" w:default="1" w:styleId="TableNormal">
@@ -1226,11 +3674,11 @@
     <w:basedOn w:val="DefaultParagraphFont"/>
     <w:link w:val="Heading2"/>
     <w:uiPriority w:val="9"/>
-    <w:semiHidden/>
-    <w:rsid w:val="00073FB0"/>
+    <w:rsid w:val="008B378B"/>
     <w:rPr>
       <w:rFonts w:asciiTheme="majorHAnsi" w:eastAsiaTheme="majorEastAsia" w:hAnsiTheme="majorHAnsi" w:cstheme="majorBidi"/>
-      <w:color w:val="0F4761" w:themeColor="accent1" w:themeShade="BF"/>
+      <w:i/>
+      <w:color w:val="0E2841" w:themeColor="text2"/>
       <w:sz w:val="32"/>
       <w:szCs w:val="32"/>
     </w:rPr>

</xml_diff>

<commit_message>
Graphics updates and experimental flowchart
</commit_message>
<xml_diff>
--- a/Corrections/Harry Questa - Corrections.docx
+++ b/Corrections/Harry Questa - Corrections.docx
@@ -115,7 +115,15 @@
         </w:numPr>
       </w:pPr>
       <w:r>
-        <w:t>What's a 'point' vs 'aim' vs 'objective' There seems to be a lot overlap in the above text and list below. Improve and rationalise as discussed in viva...</w:t>
+        <w:t xml:space="preserve">What's a 'point' vs 'aim' vs 'objective' There seems to be a </w:t>
+      </w:r>
+      <w:proofErr w:type="gramStart"/>
+      <w:r>
+        <w:t>lot</w:t>
+      </w:r>
+      <w:proofErr w:type="gramEnd"/>
+      <w:r>
+        <w:t xml:space="preserve"> overlap in the above text and list below. Improve and rationalise as discussed in viva...</w:t>
       </w:r>
     </w:p>
     <w:p>
@@ -168,19 +176,7 @@
         <w:rPr>
           <w:color w:val="4EA72E" w:themeColor="accent6"/>
         </w:rPr>
-        <w:t>Need to specify what type of models? Tribology, dynamics, tribo-dynamics, fatigue etc.</w:t>
-      </w:r>
-      <w:r>
-        <w:rPr>
-          <w:color w:val="4EA72E" w:themeColor="accent6"/>
-        </w:rPr>
-        <w:t>.. different</w:t>
-      </w:r>
-      <w:r>
-        <w:rPr>
-          <w:color w:val="4EA72E" w:themeColor="accent6"/>
-        </w:rPr>
-        <w:t xml:space="preserve"> people will read different things into 'models'</w:t>
+        <w:t>Need to specify what type of models? Tribology, dynamics, tribo-dynamics, fatigue etc... different people will read different things into 'models'</w:t>
       </w:r>
     </w:p>
     <w:p>
@@ -232,9 +228,25 @@
         <w:rPr>
           <w:color w:val="4EA72E" w:themeColor="accent6"/>
         </w:rPr>
-        <w:t xml:space="preserve">Add a small section (or comments where appropriate) discussing 'what is a high speed bearing' - </w:t>
+        <w:t xml:space="preserve">Add a small section (or comments where appropriate) discussing 'what is a </w:t>
+      </w:r>
+      <w:proofErr w:type="gramStart"/>
+      <w:r>
+        <w:rPr>
+          <w:color w:val="4EA72E" w:themeColor="accent6"/>
+        </w:rPr>
+        <w:t>high speed</w:t>
+      </w:r>
+      <w:proofErr w:type="gramEnd"/>
+      <w:r>
+        <w:rPr>
+          <w:color w:val="4EA72E" w:themeColor="accent6"/>
+        </w:rPr>
+        <w:t xml:space="preserve"> bearing' - </w:t>
       </w:r>
       <w:hyperlink r:id="rId5" w:history="1">
+        <w:proofErr w:type="spellStart"/>
+        <w:proofErr w:type="gramStart"/>
         <w:r>
           <w:rPr>
             <w:rStyle w:val="Hyperlink"/>
@@ -242,6 +254,8 @@
           </w:rPr>
           <w:t>n.Dm</w:t>
         </w:r>
+        <w:proofErr w:type="spellEnd"/>
+        <w:proofErr w:type="gramEnd"/>
       </w:hyperlink>
       <w:r>
         <w:rPr>
@@ -265,19 +279,21 @@
         <w:rPr>
           <w:color w:val="0070C0"/>
         </w:rPr>
-        <w:t>Added section 2.1.3 to Literature Raeview under "</w:t>
-      </w:r>
-      <w:r>
-        <w:rPr>
-          <w:color w:val="0070C0"/>
-        </w:rPr>
-        <w:t>Characterisation</w:t>
-      </w:r>
-      <w:r>
-        <w:rPr>
-          <w:color w:val="0070C0"/>
-        </w:rPr>
-        <w:t xml:space="preserve"> of High-Speed Bearings"</w:t>
+        <w:t xml:space="preserve">Added section 2.1.3 to Literature </w:t>
+      </w:r>
+      <w:proofErr w:type="spellStart"/>
+      <w:r>
+        <w:rPr>
+          <w:color w:val="0070C0"/>
+        </w:rPr>
+        <w:t>Raeview</w:t>
+      </w:r>
+      <w:proofErr w:type="spellEnd"/>
+      <w:r>
+        <w:rPr>
+          <w:color w:val="0070C0"/>
+        </w:rPr>
+        <w:t xml:space="preserve"> under "Characterisation of High-Speed Bearings"</w:t>
       </w:r>
     </w:p>
     <w:p>
@@ -323,7 +339,21 @@
         <w:rPr>
           <w:color w:val="4EA72E" w:themeColor="accent6"/>
         </w:rPr>
-        <w:t>Consider reordering the lit. review sections. e.g modelling is before the theory, there is a large EHL section before the introduction of lubrication regimes.</w:t>
+        <w:t xml:space="preserve">Consider reordering the lit. review sections. </w:t>
+      </w:r>
+      <w:proofErr w:type="spellStart"/>
+      <w:r>
+        <w:rPr>
+          <w:color w:val="4EA72E" w:themeColor="accent6"/>
+        </w:rPr>
+        <w:t>e.g</w:t>
+      </w:r>
+      <w:proofErr w:type="spellEnd"/>
+      <w:r>
+        <w:rPr>
+          <w:color w:val="4EA72E" w:themeColor="accent6"/>
+        </w:rPr>
+        <w:t xml:space="preserve"> modelling is before the theory, there is a large EHL section before the introduction of lubrication regimes.</w:t>
       </w:r>
     </w:p>
     <w:p>
@@ -351,7 +381,15 @@
         </w:numPr>
       </w:pPr>
       <w:r>
-        <w:t>Consider moving the background about rolling element bearings from the start of Chapt 3 into the main literature review.</w:t>
+        <w:t xml:space="preserve">Consider moving the background about rolling element bearings from the start of </w:t>
+      </w:r>
+      <w:proofErr w:type="spellStart"/>
+      <w:r>
+        <w:t>Chapt</w:t>
+      </w:r>
+      <w:proofErr w:type="spellEnd"/>
+      <w:r>
+        <w:t xml:space="preserve"> 3 into the main literature review.</w:t>
       </w:r>
     </w:p>
     <w:p>
@@ -364,11 +402,16 @@
       <w:r>
         <w:t xml:space="preserve">Consider moving the background on ANN to </w:t>
       </w:r>
+      <w:proofErr w:type="spellStart"/>
       <w:r>
         <w:t>C</w:t>
       </w:r>
       <w:r>
-        <w:t>hapt 3.</w:t>
+        <w:t>hapt</w:t>
+      </w:r>
+      <w:proofErr w:type="spellEnd"/>
+      <w:r>
+        <w:t xml:space="preserve"> 3.</w:t>
       </w:r>
     </w:p>
     <w:p>
@@ -382,25 +425,21 @@
         <w:t>Load</w:t>
       </w:r>
       <w:r>
-        <w:t xml:space="preserve"> has minimal effect on EHL film so this</w:t>
+        <w:t xml:space="preserve"> has minimal effect on EHL </w:t>
+      </w:r>
+      <w:proofErr w:type="gramStart"/>
+      <w:r>
+        <w:t>film</w:t>
+      </w:r>
+      <w:proofErr w:type="gramEnd"/>
+      <w:r>
+        <w:t xml:space="preserve"> so this</w:t>
       </w:r>
       <w:r>
         <w:t xml:space="preserve"> (fixed preload)</w:t>
       </w:r>
       <w:r>
-        <w:t xml:space="preserve"> is perhaps a sensible approach that balances computational time </w:t>
-      </w:r>
-      <w:r>
-        <w:t>with results</w:t>
-      </w:r>
-      <w:r>
-        <w:t xml:space="preserve"> of </w:t>
-      </w:r>
-      <w:r>
-        <w:t>practical value</w:t>
-      </w:r>
-      <w:r>
-        <w:t>. Why not persist with this is, what error does it introduce?</w:t>
+        <w:t xml:space="preserve"> is perhaps a sensible approach that balances computational time with results of practical value. Why not persist with this is, what error does it introduce?</w:t>
       </w:r>
     </w:p>
     <w:p>
@@ -410,8 +449,13 @@
           <w:numId w:val="4"/>
         </w:numPr>
       </w:pPr>
-      <w:r>
-        <w:t>So is your implementation of a lubricated dynamic model in a system the main contribution? Is the dynamic model of the bearing itself any different from previous models? Improve clarity</w:t>
+      <w:proofErr w:type="gramStart"/>
+      <w:r>
+        <w:t>So</w:t>
+      </w:r>
+      <w:proofErr w:type="gramEnd"/>
+      <w:r>
+        <w:t xml:space="preserve"> is your implementation of a lubricated dynamic model in a system the main contribution? Is the dynamic model of the bearing itself any different from previous models? Improve clarity</w:t>
       </w:r>
     </w:p>
     <w:p>
@@ -457,7 +501,15 @@
         </w:numPr>
       </w:pPr>
       <w:r>
-        <w:t>What about rough surface contact mechanics? Today's full rough contact models are very fast and routinely used for bearing predictions such as bearing life for example. What effect does roughness have on stiffness and dynamic response of contact? Real vs nominal area etc.. What is the typical roughness of bearing components?</w:t>
+        <w:t xml:space="preserve">What about rough surface contact mechanics? Today's full rough contact models are very fast and routinely used for bearing predictions such as bearing life for example. What effect does roughness have on stiffness and dynamic response of contact? Real vs nominal area </w:t>
+      </w:r>
+      <w:proofErr w:type="gramStart"/>
+      <w:r>
+        <w:t>etc..</w:t>
+      </w:r>
+      <w:proofErr w:type="gramEnd"/>
+      <w:r>
+        <w:t xml:space="preserve"> What is the typical roughness of bearing components?</w:t>
       </w:r>
     </w:p>
     <w:p>
@@ -508,7 +560,21 @@
         <w:rPr>
           <w:color w:val="4EA72E" w:themeColor="accent6"/>
         </w:rPr>
-        <w:t>Why is Hertz OK for point contact but not for line contact? It is the exact same theory? Rephrase</w:t>
+        <w:t xml:space="preserve">Why is Hertz OK for point contact but not for line contact? It is the exact same </w:t>
+      </w:r>
+      <w:proofErr w:type="gramStart"/>
+      <w:r>
+        <w:rPr>
+          <w:color w:val="4EA72E" w:themeColor="accent6"/>
+        </w:rPr>
+        <w:t>theory?</w:t>
+      </w:r>
+      <w:proofErr w:type="gramEnd"/>
+      <w:r>
+        <w:rPr>
+          <w:color w:val="4EA72E" w:themeColor="accent6"/>
+        </w:rPr>
+        <w:t xml:space="preserve"> Rephrase</w:t>
       </w:r>
     </w:p>
     <w:p>
@@ -537,43 +603,7 @@
         <w:rPr>
           <w:color w:val="0070C0"/>
         </w:rPr>
-        <w:t>. Cylind</w:t>
-      </w:r>
-      <w:r>
-        <w:rPr>
-          <w:color w:val="0070C0"/>
-        </w:rPr>
-        <w:t xml:space="preserve">rical rollers </w:t>
-      </w:r>
-      <w:r>
-        <w:rPr>
-          <w:color w:val="0070C0"/>
-        </w:rPr>
-        <w:t>have finite length, no</w:t>
-      </w:r>
-      <w:r>
-        <w:rPr>
-          <w:color w:val="0070C0"/>
-        </w:rPr>
-        <w:t>t modelled as</w:t>
-      </w:r>
-      <w:r>
-        <w:rPr>
-          <w:color w:val="0070C0"/>
-        </w:rPr>
-        <w:t xml:space="preserve"> infinitely long cylinders. </w:t>
-      </w:r>
-      <w:r>
-        <w:rPr>
-          <w:color w:val="0070C0"/>
-        </w:rPr>
-        <w:t>Therefore,</w:t>
-      </w:r>
-      <w:r>
-        <w:rPr>
-          <w:color w:val="0070C0"/>
-        </w:rPr>
-        <w:t xml:space="preserve"> adjustment required to capture edge effects</w:t>
+        <w:t>. Cylindrical rollers have finite length, not modelled as infinitely long cylinders. Therefore, adjustment required to capture edge effects</w:t>
       </w:r>
     </w:p>
     <w:p>
@@ -619,19 +649,7 @@
         <w:rPr>
           <w:color w:val="0070C0"/>
         </w:rPr>
-        <w:t xml:space="preserve"> that full numerical contact solutions are not viable for FMBD models requiring computationally</w:t>
-      </w:r>
-      <w:r>
-        <w:rPr>
-          <w:color w:val="0070C0"/>
-        </w:rPr>
-        <w:t xml:space="preserve"> efficien</w:t>
-      </w:r>
-      <w:r>
-        <w:rPr>
-          <w:color w:val="0070C0"/>
-        </w:rPr>
-        <w:t>cy. Therefore, focus was on Hertz based analytical methods.</w:t>
+        <w:t xml:space="preserve"> that full numerical contact solutions are not viable for FMBD models requiring computationally efficiency. Therefore, focus was on Hertz based analytical methods.</w:t>
       </w:r>
     </w:p>
     <w:p>
@@ -682,7 +700,49 @@
         <w:rPr>
           <w:color w:val="4EA72E" w:themeColor="accent6"/>
         </w:rPr>
-        <w:t>Add comment on tribofilms in boundary section: so what protects/lubricates the contact here? Solid, chemically formed boundary (tribofilms) that are 20-100nm in thickness.</w:t>
+        <w:t xml:space="preserve">Add comment on </w:t>
+      </w:r>
+      <w:proofErr w:type="spellStart"/>
+      <w:r>
+        <w:rPr>
+          <w:color w:val="4EA72E" w:themeColor="accent6"/>
+        </w:rPr>
+        <w:t>tribofilms</w:t>
+      </w:r>
+      <w:proofErr w:type="spellEnd"/>
+      <w:r>
+        <w:rPr>
+          <w:color w:val="4EA72E" w:themeColor="accent6"/>
+        </w:rPr>
+        <w:t xml:space="preserve"> in boundary section: </w:t>
+      </w:r>
+      <w:proofErr w:type="gramStart"/>
+      <w:r>
+        <w:rPr>
+          <w:color w:val="4EA72E" w:themeColor="accent6"/>
+        </w:rPr>
+        <w:t>so</w:t>
+      </w:r>
+      <w:proofErr w:type="gramEnd"/>
+      <w:r>
+        <w:rPr>
+          <w:color w:val="4EA72E" w:themeColor="accent6"/>
+        </w:rPr>
+        <w:t xml:space="preserve"> what protects/lubricates the contact here? Solid, chemically formed boundary (</w:t>
+      </w:r>
+      <w:proofErr w:type="spellStart"/>
+      <w:r>
+        <w:rPr>
+          <w:color w:val="4EA72E" w:themeColor="accent6"/>
+        </w:rPr>
+        <w:t>tribofilms</w:t>
+      </w:r>
+      <w:proofErr w:type="spellEnd"/>
+      <w:r>
+        <w:rPr>
+          <w:color w:val="4EA72E" w:themeColor="accent6"/>
+        </w:rPr>
+        <w:t>) that are 20-100nm in thickness.</w:t>
       </w:r>
     </w:p>
     <w:p>
@@ -699,7 +759,21 @@
         <w:rPr>
           <w:color w:val="0070C0"/>
         </w:rPr>
-        <w:t>Added comment on tribofilms to boundary section of 2.3.6</w:t>
+        <w:t xml:space="preserve">Added comment on </w:t>
+      </w:r>
+      <w:proofErr w:type="spellStart"/>
+      <w:r>
+        <w:rPr>
+          <w:color w:val="0070C0"/>
+        </w:rPr>
+        <w:t>tribofilms</w:t>
+      </w:r>
+      <w:proofErr w:type="spellEnd"/>
+      <w:r>
+        <w:rPr>
+          <w:color w:val="0070C0"/>
+        </w:rPr>
+        <w:t xml:space="preserve"> to boundary section of 2.3.6</w:t>
       </w:r>
     </w:p>
     <w:p>
@@ -763,7 +837,39 @@
         </w:numPr>
       </w:pPr>
       <w:r>
-        <w:t>At the end of Lit Survey, add a section to clarify how this Lit Survey justifies the need for your work i.e. what you hope the work will be able to tel us that we do not know already ? What is the evidence that your approach is needed and can make a valid contribution? Why do we need tribo dynamic multi body analysis (inc effect so EHD films) and why do we need ANNs to be able to study these bearings better than we can with existing tools?</w:t>
+        <w:t xml:space="preserve">At the end of Lit Survey, add a section to clarify how this Lit Survey justifies the need for your work i.e. what you hope the work will be able to </w:t>
+      </w:r>
+      <w:proofErr w:type="spellStart"/>
+      <w:r>
+        <w:t>tel</w:t>
+      </w:r>
+      <w:proofErr w:type="spellEnd"/>
+      <w:r>
+        <w:t xml:space="preserve"> us that we do not know </w:t>
+      </w:r>
+      <w:proofErr w:type="gramStart"/>
+      <w:r>
+        <w:t>already ?</w:t>
+      </w:r>
+      <w:proofErr w:type="gramEnd"/>
+      <w:r>
+        <w:t xml:space="preserve"> What is the evidence that your approach is needed and can make a valid contribution? Why do we need </w:t>
+      </w:r>
+      <w:proofErr w:type="spellStart"/>
+      <w:r>
+        <w:t>tribo</w:t>
+      </w:r>
+      <w:proofErr w:type="spellEnd"/>
+      <w:r>
+        <w:t xml:space="preserve"> dynamic multi body analysis (</w:t>
+      </w:r>
+      <w:proofErr w:type="spellStart"/>
+      <w:r>
+        <w:t>inc</w:t>
+      </w:r>
+      <w:proofErr w:type="spellEnd"/>
+      <w:r>
+        <w:t xml:space="preserve"> effect so EHD films) and why do we need ANNs to be able to study these bearings better than we can with existing tools?</w:t>
       </w:r>
     </w:p>
     <w:p>
@@ -771,8 +877,13 @@
         <w:pStyle w:val="Heading2"/>
       </w:pPr>
       <w:r>
-        <w:t>Chapter 3 - Experimental Tribodynamics</w:t>
-      </w:r>
+        <w:t xml:space="preserve">Chapter 3 - Experimental </w:t>
+      </w:r>
+      <w:proofErr w:type="spellStart"/>
+      <w:r>
+        <w:t>Tribodynamics</w:t>
+      </w:r>
+      <w:proofErr w:type="spellEnd"/>
     </w:p>
     <w:p>
       <w:pPr>
@@ -794,7 +905,35 @@
         <w:rPr>
           <w:color w:val="4EA72E" w:themeColor="accent6"/>
         </w:rPr>
-        <w:t xml:space="preserve">so ~30mm Dm, which gives NDm ~450k. This is not usually considered as high speed bearing. </w:t>
+        <w:t xml:space="preserve">so ~30mm Dm, which gives </w:t>
+      </w:r>
+      <w:proofErr w:type="spellStart"/>
+      <w:r>
+        <w:rPr>
+          <w:color w:val="4EA72E" w:themeColor="accent6"/>
+        </w:rPr>
+        <w:t>NDm</w:t>
+      </w:r>
+      <w:proofErr w:type="spellEnd"/>
+      <w:r>
+        <w:rPr>
+          <w:color w:val="4EA72E" w:themeColor="accent6"/>
+        </w:rPr>
+        <w:t xml:space="preserve"> ~450k. This is not usually considered as </w:t>
+      </w:r>
+      <w:proofErr w:type="gramStart"/>
+      <w:r>
+        <w:rPr>
+          <w:color w:val="4EA72E" w:themeColor="accent6"/>
+        </w:rPr>
+        <w:t>high speed</w:t>
+      </w:r>
+      <w:proofErr w:type="gramEnd"/>
+      <w:r>
+        <w:rPr>
+          <w:color w:val="4EA72E" w:themeColor="accent6"/>
+        </w:rPr>
+        <w:t xml:space="preserve"> bearing. </w:t>
       </w:r>
       <w:r>
         <w:rPr>
@@ -831,11 +970,33 @@
         </w:rPr>
         <w:t xml:space="preserve">. </w:t>
       </w:r>
-      <w:r>
-        <w:rPr>
-          <w:color w:val="0070C0"/>
-        </w:rPr>
-        <w:t>nDm here is 578k since Dm is 38.5. Classified as high-speed (&lt;500k) as discussed in new nDm section</w:t>
+      <w:proofErr w:type="spellStart"/>
+      <w:r>
+        <w:rPr>
+          <w:color w:val="0070C0"/>
+        </w:rPr>
+        <w:t>nDm</w:t>
+      </w:r>
+      <w:proofErr w:type="spellEnd"/>
+      <w:r>
+        <w:rPr>
+          <w:color w:val="0070C0"/>
+        </w:rPr>
+        <w:t xml:space="preserve"> here is 578k since Dm is 38.5. Classified as high-speed (&lt;500k) as discussed in new </w:t>
+      </w:r>
+      <w:proofErr w:type="spellStart"/>
+      <w:r>
+        <w:rPr>
+          <w:color w:val="0070C0"/>
+        </w:rPr>
+        <w:t>nDm</w:t>
+      </w:r>
+      <w:proofErr w:type="spellEnd"/>
+      <w:r>
+        <w:rPr>
+          <w:color w:val="0070C0"/>
+        </w:rPr>
+        <w:t xml:space="preserve"> section</w:t>
       </w:r>
       <w:r>
         <w:rPr>
@@ -876,19 +1037,21 @@
         <w:rPr>
           <w:color w:val="0070C0"/>
         </w:rPr>
-        <w:t xml:space="preserve">Contact pressures are presented in the </w:t>
-      </w:r>
-      <w:r>
-        <w:rPr>
-          <w:color w:val="0070C0"/>
-        </w:rPr>
-        <w:t>results section and</w:t>
-      </w:r>
-      <w:r>
-        <w:rPr>
-          <w:color w:val="0070C0"/>
-        </w:rPr>
-        <w:t xml:space="preserve"> vary depending on dynamic response of rig (eg. resonance). A single nominal value would not be representative here.</w:t>
+        <w:t>Contact pressures are presented in the results section and vary depending on dynamic response of rig (</w:t>
+      </w:r>
+      <w:proofErr w:type="spellStart"/>
+      <w:r>
+        <w:rPr>
+          <w:color w:val="0070C0"/>
+        </w:rPr>
+        <w:t>eg.</w:t>
+      </w:r>
+      <w:proofErr w:type="spellEnd"/>
+      <w:r>
+        <w:rPr>
+          <w:color w:val="0070C0"/>
+        </w:rPr>
+        <w:t xml:space="preserve"> resonance). A single nominal value would not be representative here.</w:t>
       </w:r>
     </w:p>
     <w:p>
@@ -899,7 +1062,23 @@
         </w:numPr>
       </w:pPr>
       <w:r>
-        <w:t>How necessary is the iteration scheme here given the minimal impact of load on film? How does ignoring  this compare to other sources of error, for example accuracy of your location measurements? Add a short discussion with some values to illustrate  sensitivity of solution(s) to this if possible</w:t>
+        <w:t xml:space="preserve">How necessary is the iteration scheme here given the minimal impact of load on film? How does </w:t>
+      </w:r>
+      <w:proofErr w:type="gramStart"/>
+      <w:r>
+        <w:t>ignoring  this</w:t>
+      </w:r>
+      <w:proofErr w:type="gramEnd"/>
+      <w:r>
+        <w:t xml:space="preserve"> compare to other sources of error, for example accuracy of your location measurements? Add a short discussion with some values to </w:t>
+      </w:r>
+      <w:proofErr w:type="gramStart"/>
+      <w:r>
+        <w:t>illustrate  sensitivity</w:t>
+      </w:r>
+      <w:proofErr w:type="gramEnd"/>
+      <w:r>
+        <w:t xml:space="preserve"> of solution(s) to this if possible</w:t>
       </w:r>
     </w:p>
     <w:p>
@@ -950,7 +1129,21 @@
         <w:rPr>
           <w:color w:val="000000" w:themeColor="text1"/>
         </w:rPr>
-        <w:t>What acceleration is this from 0-15000rpm in 4s? Was this accounted for in the EHL film predictions? What entrainment speed? Are there inlet shear heating effects? You go through a lot of trouble to describe the 1D Reynolds solver but these other factors may be just as (or even more) important. Add brief discussion.</w:t>
+        <w:t xml:space="preserve">What acceleration is this from 0-15000rpm in 4s? Was this accounted for in the EHL film predictions? What entrainment speed? Are there inlet shear heating effects? You go through a lot of trouble to describe the 1D Reynolds </w:t>
+      </w:r>
+      <w:proofErr w:type="gramStart"/>
+      <w:r>
+        <w:rPr>
+          <w:color w:val="000000" w:themeColor="text1"/>
+        </w:rPr>
+        <w:t>solver</w:t>
+      </w:r>
+      <w:proofErr w:type="gramEnd"/>
+      <w:r>
+        <w:rPr>
+          <w:color w:val="000000" w:themeColor="text1"/>
+        </w:rPr>
+        <w:t xml:space="preserve"> but these other factors may be just as (or even more) important. Add brief discussion.</w:t>
       </w:r>
     </w:p>
     <w:p>
@@ -1001,7 +1194,21 @@
         <w:rPr>
           <w:color w:val="E97132" w:themeColor="accent2"/>
         </w:rPr>
-        <w:t>Was temperature effect on lubricant viscosity accounted for? Also inlet shear heating?</w:t>
+        <w:t xml:space="preserve">Was temperature effect on lubricant viscosity accounted for? </w:t>
+      </w:r>
+      <w:proofErr w:type="gramStart"/>
+      <w:r>
+        <w:rPr>
+          <w:color w:val="E97132" w:themeColor="accent2"/>
+        </w:rPr>
+        <w:t>Also</w:t>
+      </w:r>
+      <w:proofErr w:type="gramEnd"/>
+      <w:r>
+        <w:rPr>
+          <w:color w:val="E97132" w:themeColor="accent2"/>
+        </w:rPr>
+        <w:t xml:space="preserve"> inlet shear heating?</w:t>
       </w:r>
     </w:p>
     <w:p>
@@ -1018,7 +1225,21 @@
         <w:rPr>
           <w:color w:val="E97132" w:themeColor="accent2"/>
         </w:rPr>
-        <w:t>This is a lot of effort to calculate bearing EHD film thickness. But did you account for other potentially important effects such as inlet shear heating? How much do these predictions differ from a standard EHD regression equation approach using thermal correction such as that of Gupta, say? Please discuss and clarify this.</w:t>
+        <w:t xml:space="preserve">This is a lot of effort to calculate bearing EHD film thickness. But did </w:t>
+      </w:r>
+      <w:proofErr w:type="spellStart"/>
+      <w:r>
+        <w:rPr>
+          <w:color w:val="E97132" w:themeColor="accent2"/>
+        </w:rPr>
+        <w:t>you</w:t>
+      </w:r>
+      <w:proofErr w:type="spellEnd"/>
+      <w:r>
+        <w:rPr>
+          <w:color w:val="E97132" w:themeColor="accent2"/>
+        </w:rPr>
+        <w:t xml:space="preserve"> account for other potentially important effects such as inlet shear heating? How much do these predictions differ from a standard EHD regression equation approach using thermal correction such as that of Gupta, say? Please discuss and clarify this.</w:t>
       </w:r>
     </w:p>
     <w:p>
@@ -1129,20 +1350,15 @@
           <w:ilvl w:val="0"/>
           <w:numId w:val="10"/>
         </w:numPr>
-      </w:pPr>
-      <w:r>
+        <w:rPr>
+          <w:color w:val="4EA72E" w:themeColor="accent6"/>
+        </w:rPr>
+      </w:pPr>
+      <w:r>
+        <w:rPr>
+          <w:color w:val="4EA72E" w:themeColor="accent6"/>
+        </w:rPr>
         <w:t>Add some detail to Fig 3.1 to indicate what are the input parameters to the 'Experimental Test'.</w:t>
-      </w:r>
-    </w:p>
-    <w:p>
-      <w:pPr>
-        <w:numPr>
-          <w:ilvl w:val="0"/>
-          <w:numId w:val="10"/>
-        </w:numPr>
-      </w:pPr>
-      <w:r>
-        <w:t>Section 3.1/3.2 - add further justification for this methodology e.g. similar previous work, how is yours different, how will it enable the novelty etc.</w:t>
       </w:r>
     </w:p>
     <w:p>
@@ -1151,6 +1367,34 @@
           <w:ilvl w:val="1"/>
           <w:numId w:val="10"/>
         </w:numPr>
+        <w:rPr>
+          <w:color w:val="0070C0"/>
+        </w:rPr>
+      </w:pPr>
+      <w:r>
+        <w:rPr>
+          <w:color w:val="0070C0"/>
+        </w:rPr>
+        <w:t>More comprehensive flowchart added, which more closely links to the subsections</w:t>
+      </w:r>
+    </w:p>
+    <w:p>
+      <w:pPr>
+        <w:numPr>
+          <w:ilvl w:val="0"/>
+          <w:numId w:val="10"/>
+        </w:numPr>
+      </w:pPr>
+      <w:r>
+        <w:t>Section 3.1/3.2 - add further justification for this methodology e.g. similar previous work, how is yours different, how will it enable the novelty etc.</w:t>
+      </w:r>
+    </w:p>
+    <w:p>
+      <w:pPr>
+        <w:numPr>
+          <w:ilvl w:val="1"/>
+          <w:numId w:val="10"/>
+        </w:numPr>
       </w:pPr>
       <w:r>
         <w:t>Not directly stated, but the design intent of the rig was to continue with validation. The designs and technical drawings for the adaptations were done in the scope of the PhD, but did not materialize due to lab access during Covid and moving to AVL.</w:t>
@@ -1233,7 +1477,15 @@
         </w:numPr>
       </w:pPr>
       <w:r>
-        <w:t>Elaborate on mechansim of film acting as interference wedge</w:t>
+        <w:t xml:space="preserve">Elaborate on </w:t>
+      </w:r>
+      <w:proofErr w:type="spellStart"/>
+      <w:r>
+        <w:t>mechansim</w:t>
+      </w:r>
+      <w:proofErr w:type="spellEnd"/>
+      <w:r>
+        <w:t xml:space="preserve"> of film acting as interference wedge</w:t>
       </w:r>
     </w:p>
     <w:p>
@@ -1288,7 +1540,15 @@
         </w:numPr>
       </w:pPr>
       <w:r>
-        <w:t>So essentially this allows you to plug in your bearing model from Chapter 3 into this system level software, right? This is OK but please clarify the novelty in this part of the work (co-simulation). This could be the implementation or the results as discussed.</w:t>
+        <w:t xml:space="preserve">So essentially this allows you to plug in your bearing model from Chapter 3 into this system level software, right? This is OK but please clarify the novelty in this part of the work (co-simulation). This could be the </w:t>
+      </w:r>
+      <w:proofErr w:type="gramStart"/>
+      <w:r>
+        <w:t>implementation</w:t>
+      </w:r>
+      <w:proofErr w:type="gramEnd"/>
+      <w:r>
+        <w:t xml:space="preserve"> or the results as discussed.</w:t>
       </w:r>
     </w:p>
     <w:p>
@@ -1322,13 +1582,7 @@
         <w:rPr>
           <w:color w:val="0070C0"/>
         </w:rPr>
-        <w:t>This is already explained in section 4.3.2, including what isn't modelled (flexible bodies in representative excitation model and stator tooth forces due to minimal lateral contribution once resolved).</w:t>
-      </w:r>
-      <w:r>
-        <w:rPr>
-          <w:color w:val="0070C0"/>
-        </w:rPr>
-        <w:t xml:space="preserve"> Refined description</w:t>
+        <w:t>This is already explained in section 4.3.2, including what isn't modelled (flexible bodies in representative excitation model and stator tooth forces due to minimal lateral contribution once resolved). Refined description</w:t>
       </w:r>
     </w:p>
     <w:p>
@@ -1345,7 +1599,21 @@
         <w:rPr>
           <w:color w:val="000000" w:themeColor="text1"/>
         </w:rPr>
-        <w:t>Can you add a line or two to provide a physical explanation of why the elastic deformation is so much bigger for the lubricated case vs dry given that externally  applied loads are the same? How is the housing modelled here?</w:t>
+        <w:t xml:space="preserve">Can you add a line or two to provide a physical explanation of why the elastic deformation is so much bigger for the lubricated case vs dry given that </w:t>
+      </w:r>
+      <w:proofErr w:type="gramStart"/>
+      <w:r>
+        <w:rPr>
+          <w:color w:val="000000" w:themeColor="text1"/>
+        </w:rPr>
+        <w:t>externally  applied</w:t>
+      </w:r>
+      <w:proofErr w:type="gramEnd"/>
+      <w:r>
+        <w:rPr>
+          <w:color w:val="000000" w:themeColor="text1"/>
+        </w:rPr>
+        <w:t xml:space="preserve"> loads are the same? How is the housing modelled here?</w:t>
       </w:r>
     </w:p>
     <w:p>
@@ -1581,7 +1849,21 @@
         <w:rPr>
           <w:color w:val="E97132" w:themeColor="accent2"/>
         </w:rPr>
-        <w:t>At these speeds the standard EHD theory is not valid due to inlet shear heating effects but there are several corrections out there (based on experimental data). Did you try to use Gupta correction for example? This needs discussing with relevant references (also mentioned above in a previous comment)</w:t>
+        <w:t xml:space="preserve">At these speeds the standard EHD theory is not valid due to inlet shear heating effects but there are several corrections out there (based on experimental data). Did you try to use Gupta correction for example? </w:t>
+      </w:r>
+      <w:proofErr w:type="gramStart"/>
+      <w:r>
+        <w:rPr>
+          <w:color w:val="E97132" w:themeColor="accent2"/>
+        </w:rPr>
+        <w:t>This needs</w:t>
+      </w:r>
+      <w:proofErr w:type="gramEnd"/>
+      <w:r>
+        <w:rPr>
+          <w:color w:val="E97132" w:themeColor="accent2"/>
+        </w:rPr>
+        <w:t xml:space="preserve"> discussing with relevant references (also mentioned above in a previous comment)</w:t>
       </w:r>
     </w:p>
     <w:p>
@@ -1611,11 +1893,33 @@
           <w:color w:val="000000" w:themeColor="text1"/>
         </w:rPr>
       </w:pPr>
+      <w:proofErr w:type="gramStart"/>
       <w:r>
         <w:rPr>
           <w:color w:val="000000" w:themeColor="text1"/>
         </w:rPr>
-        <w:t xml:space="preserve">So if thermal effects are not included in your present solution what is the reason for the observed differences? I would have excepted this to be the biggest effect.  </w:t>
+        <w:t>So</w:t>
+      </w:r>
+      <w:proofErr w:type="gramEnd"/>
+      <w:r>
+        <w:rPr>
+          <w:color w:val="000000" w:themeColor="text1"/>
+        </w:rPr>
+        <w:t xml:space="preserve"> if thermal effects are not included in your present solution what is the reason for the observed differences? I would have </w:t>
+      </w:r>
+      <w:proofErr w:type="gramStart"/>
+      <w:r>
+        <w:rPr>
+          <w:color w:val="000000" w:themeColor="text1"/>
+        </w:rPr>
+        <w:t>excepted</w:t>
+      </w:r>
+      <w:proofErr w:type="gramEnd"/>
+      <w:r>
+        <w:rPr>
+          <w:color w:val="000000" w:themeColor="text1"/>
+        </w:rPr>
+        <w:t xml:space="preserve"> this to be the biggest effect.  </w:t>
       </w:r>
     </w:p>
     <w:p>
@@ -1717,7 +2021,21 @@
         <w:rPr>
           <w:color w:val="000000" w:themeColor="text1"/>
         </w:rPr>
-        <w:t>Yes, but ideally you should compare model predictions to a completely new set of data available in literature (e.g. Maclaren et al, high speed film thickness data or similar). It would  have been a good addition to this chapter but there is no time for this now, something to think about in the future. The possibility and the value of this should be mentioned though.</w:t>
+        <w:t xml:space="preserve">Yes, but ideally you should compare model predictions to a completely new set of data available in literature (e.g. Maclaren et al, high speed film thickness data or similar). It </w:t>
+      </w:r>
+      <w:proofErr w:type="gramStart"/>
+      <w:r>
+        <w:rPr>
+          <w:color w:val="000000" w:themeColor="text1"/>
+        </w:rPr>
+        <w:t>would  have</w:t>
+      </w:r>
+      <w:proofErr w:type="gramEnd"/>
+      <w:r>
+        <w:rPr>
+          <w:color w:val="000000" w:themeColor="text1"/>
+        </w:rPr>
+        <w:t xml:space="preserve"> been a good addition to this chapter but there is no time for this now, something to think about in the future. The possibility and the value of this should be mentioned though.</w:t>
       </w:r>
     </w:p>
     <w:p>
@@ -1734,8 +2052,30 @@
         <w:rPr>
           <w:color w:val="000000" w:themeColor="text1"/>
         </w:rPr>
-        <w:t>Clarify why large discrepency at high speed between analytical and numerical predicitions</w:t>
-      </w:r>
+        <w:t xml:space="preserve">Clarify why large </w:t>
+      </w:r>
+      <w:proofErr w:type="spellStart"/>
+      <w:r>
+        <w:rPr>
+          <w:color w:val="000000" w:themeColor="text1"/>
+        </w:rPr>
+        <w:t>discrepency</w:t>
+      </w:r>
+      <w:proofErr w:type="spellEnd"/>
+      <w:r>
+        <w:rPr>
+          <w:color w:val="000000" w:themeColor="text1"/>
+        </w:rPr>
+        <w:t xml:space="preserve"> at high speed between analytical and numerical </w:t>
+      </w:r>
+      <w:proofErr w:type="spellStart"/>
+      <w:r>
+        <w:rPr>
+          <w:color w:val="000000" w:themeColor="text1"/>
+        </w:rPr>
+        <w:t>predicitions</w:t>
+      </w:r>
+      <w:proofErr w:type="spellEnd"/>
     </w:p>
     <w:p>
       <w:pPr>
@@ -3633,6 +3973,7 @@
   <w:style w:type="character" w:default="1" w:styleId="DefaultParagraphFont">
     <w:name w:val="Default Paragraph Font"/>
     <w:uiPriority w:val="1"/>
+    <w:semiHidden/>
     <w:unhideWhenUsed/>
   </w:style>
   <w:style w:type="table" w:default="1" w:styleId="TableNormal">

</xml_diff>

<commit_message>
Experimental tribodynamics and FMBD section corrections
</commit_message>
<xml_diff>
--- a/Corrections/Harry Questa - Corrections.docx
+++ b/Corrections/Harry Questa - Corrections.docx
@@ -75,10 +75,16 @@
       <w:pPr>
         <w:numPr>
           <w:ilvl w:val="0"/>
-          <w:numId w:val="1"/>
-        </w:numPr>
-      </w:pPr>
-      <w:r>
+          <w:numId w:val="4"/>
+        </w:numPr>
+        <w:rPr>
+          <w:color w:val="000000" w:themeColor="text1"/>
+        </w:rPr>
+      </w:pPr>
+      <w:r>
+        <w:rPr>
+          <w:color w:val="000000" w:themeColor="text1"/>
+        </w:rPr>
         <w:t>Consider adding a few sentences describing 'outputs' of your work to the abstract, it is a little 'spoiler-free' currently.</w:t>
       </w:r>
     </w:p>
@@ -94,47 +100,148 @@
       <w:pPr>
         <w:numPr>
           <w:ilvl w:val="0"/>
-          <w:numId w:val="3"/>
-        </w:numPr>
-      </w:pPr>
-      <w:r>
+          <w:numId w:val="4"/>
+        </w:numPr>
+        <w:rPr>
+          <w:color w:val="4EA72E" w:themeColor="accent6"/>
+        </w:rPr>
+      </w:pPr>
+      <w:r>
+        <w:rPr>
+          <w:color w:val="4EA72E" w:themeColor="accent6"/>
+        </w:rPr>
         <w:t>Consider structuring aim and objectives differently e.g. 'Aim', 'Scope of Research',</w:t>
       </w:r>
       <w:r>
+        <w:rPr>
+          <w:color w:val="4EA72E" w:themeColor="accent6"/>
+        </w:rPr>
         <w:t xml:space="preserve"> </w:t>
       </w:r>
       <w:r>
+        <w:rPr>
+          <w:color w:val="4EA72E" w:themeColor="accent6"/>
+        </w:rPr>
         <w:t>'Sub-aims', 'Objectives', 'Tasks', in some combination.</w:t>
       </w:r>
     </w:p>
     <w:p>
       <w:pPr>
         <w:numPr>
-          <w:ilvl w:val="0"/>
-          <w:numId w:val="3"/>
-        </w:numPr>
-      </w:pPr>
-      <w:r>
+          <w:ilvl w:val="1"/>
+          <w:numId w:val="4"/>
+        </w:numPr>
+        <w:rPr>
+          <w:color w:val="0070C0"/>
+        </w:rPr>
+      </w:pPr>
+      <w:r>
+        <w:rPr>
+          <w:color w:val="0070C0"/>
+        </w:rPr>
+        <w:t>Addressed in Aim, Objectives, Research tasks. These are more clearly defined as per their definition.</w:t>
+      </w:r>
+    </w:p>
+    <w:p>
+      <w:pPr>
+        <w:numPr>
+          <w:ilvl w:val="0"/>
+          <w:numId w:val="4"/>
+        </w:numPr>
+        <w:rPr>
+          <w:color w:val="4EA72E" w:themeColor="accent6"/>
+        </w:rPr>
+      </w:pPr>
+      <w:r>
+        <w:rPr>
+          <w:color w:val="4EA72E" w:themeColor="accent6"/>
+        </w:rPr>
         <w:t xml:space="preserve">What's a 'point' vs 'aim' vs 'objective' There seems to be a </w:t>
       </w:r>
       <w:proofErr w:type="gramStart"/>
       <w:r>
+        <w:rPr>
+          <w:color w:val="4EA72E" w:themeColor="accent6"/>
+        </w:rPr>
         <w:t>lot</w:t>
       </w:r>
       <w:proofErr w:type="gramEnd"/>
       <w:r>
+        <w:rPr>
+          <w:color w:val="4EA72E" w:themeColor="accent6"/>
+        </w:rPr>
         <w:t xml:space="preserve"> overlap in the above text and list below. Improve and rationalise as discussed in viva...</w:t>
       </w:r>
     </w:p>
     <w:p>
       <w:pPr>
         <w:numPr>
-          <w:ilvl w:val="0"/>
-          <w:numId w:val="3"/>
-        </w:numPr>
-      </w:pPr>
-      <w:r>
+          <w:ilvl w:val="1"/>
+          <w:numId w:val="4"/>
+        </w:numPr>
+        <w:rPr>
+          <w:color w:val="0070C0"/>
+        </w:rPr>
+      </w:pPr>
+      <w:r>
+        <w:rPr>
+          <w:color w:val="0070C0"/>
+        </w:rPr>
+        <w:t>As above</w:t>
+      </w:r>
+      <w:r>
+        <w:rPr>
+          <w:color w:val="0070C0"/>
+        </w:rPr>
+        <w:t>.</w:t>
+      </w:r>
+    </w:p>
+    <w:p>
+      <w:pPr>
+        <w:numPr>
+          <w:ilvl w:val="0"/>
+          <w:numId w:val="4"/>
+        </w:numPr>
+        <w:rPr>
+          <w:color w:val="4EA72E" w:themeColor="accent6"/>
+        </w:rPr>
+      </w:pPr>
+      <w:r>
+        <w:rPr>
+          <w:color w:val="4EA72E" w:themeColor="accent6"/>
+        </w:rPr>
         <w:t>Can you add some examples of speeds for motor/transmission bearings in rpm but also m/s entrainment</w:t>
+      </w:r>
+    </w:p>
+    <w:p>
+      <w:pPr>
+        <w:numPr>
+          <w:ilvl w:val="1"/>
+          <w:numId w:val="4"/>
+        </w:numPr>
+        <w:rPr>
+          <w:color w:val="0070C0"/>
+        </w:rPr>
+      </w:pPr>
+      <w:r>
+        <w:rPr>
+          <w:color w:val="0070C0"/>
+        </w:rPr>
+        <w:t xml:space="preserve">Added typical speed, </w:t>
+      </w:r>
+      <w:proofErr w:type="spellStart"/>
+      <w:r>
+        <w:rPr>
+          <w:color w:val="0070C0"/>
+        </w:rPr>
+        <w:t>nDm</w:t>
+      </w:r>
+      <w:proofErr w:type="spellEnd"/>
+      <w:r>
+        <w:rPr>
+          <w:color w:val="0070C0"/>
+        </w:rPr>
+        <w:t xml:space="preserve"> and entrainment values to introduction.</w:t>
       </w:r>
     </w:p>
     <w:p>
@@ -279,21 +386,13 @@
         <w:rPr>
           <w:color w:val="0070C0"/>
         </w:rPr>
-        <w:t xml:space="preserve">Added section 2.1.3 to Literature </w:t>
-      </w:r>
-      <w:proofErr w:type="spellStart"/>
-      <w:r>
-        <w:rPr>
-          <w:color w:val="0070C0"/>
-        </w:rPr>
-        <w:t>Raeview</w:t>
-      </w:r>
-      <w:proofErr w:type="spellEnd"/>
-      <w:r>
-        <w:rPr>
-          <w:color w:val="0070C0"/>
-        </w:rPr>
-        <w:t xml:space="preserve"> under "Characterisation of High-Speed Bearings"</w:t>
+        <w:t>Added section 2.1.3 to Literature Review under "Characterisation of High-Speed Bearings"</w:t>
+      </w:r>
+      <w:r>
+        <w:rPr>
+          <w:color w:val="0070C0"/>
+        </w:rPr>
+        <w:t>.</w:t>
       </w:r>
     </w:p>
     <w:p>
@@ -372,6 +471,12 @@
         </w:rPr>
         <w:t>Reordered</w:t>
       </w:r>
+      <w:r>
+        <w:rPr>
+          <w:color w:val="0070C0"/>
+        </w:rPr>
+        <w:t>.</w:t>
+      </w:r>
     </w:p>
     <w:p>
       <w:pPr>
@@ -420,130 +525,695 @@
           <w:ilvl w:val="0"/>
           <w:numId w:val="4"/>
         </w:numPr>
-      </w:pPr>
-      <w:r>
-        <w:t>Load</w:t>
-      </w:r>
-      <w:r>
-        <w:t xml:space="preserve"> has minimal effect on EHL </w:t>
+        <w:rPr>
+          <w:color w:val="4EA72E" w:themeColor="accent6"/>
+        </w:rPr>
+      </w:pPr>
+      <w:r>
+        <w:rPr>
+          <w:color w:val="4EA72E" w:themeColor="accent6"/>
+        </w:rPr>
+        <w:lastRenderedPageBreak/>
+        <w:t xml:space="preserve">Load has minimal effect on EHL </w:t>
       </w:r>
       <w:proofErr w:type="gramStart"/>
       <w:r>
+        <w:rPr>
+          <w:color w:val="4EA72E" w:themeColor="accent6"/>
+        </w:rPr>
         <w:t>film</w:t>
       </w:r>
       <w:proofErr w:type="gramEnd"/>
       <w:r>
-        <w:t xml:space="preserve"> so this</w:t>
-      </w:r>
-      <w:r>
-        <w:t xml:space="preserve"> (fixed preload)</w:t>
-      </w:r>
-      <w:r>
-        <w:t xml:space="preserve"> is perhaps a sensible approach that balances computational time with results of practical value. Why not persist with this is, what error does it introduce?</w:t>
-      </w:r>
-    </w:p>
-    <w:p>
-      <w:pPr>
-        <w:numPr>
-          <w:ilvl w:val="0"/>
+        <w:rPr>
+          <w:color w:val="4EA72E" w:themeColor="accent6"/>
+        </w:rPr>
+        <w:t xml:space="preserve"> so this (fixed preload) is perhaps a sensible approach that balances computational time with results of practical value. Why not persist with this is, what error does it introduce?</w:t>
+      </w:r>
+    </w:p>
+    <w:p>
+      <w:pPr>
+        <w:numPr>
+          <w:ilvl w:val="1"/>
           <w:numId w:val="4"/>
         </w:numPr>
-      </w:pPr>
+        <w:rPr>
+          <w:color w:val="0070C0"/>
+        </w:rPr>
+      </w:pPr>
+      <w:r>
+        <w:rPr>
+          <w:color w:val="0070C0"/>
+        </w:rPr>
+        <w:t>Added an explanation to this section regarding constant preload modelling.</w:t>
+      </w:r>
+      <w:r>
+        <w:rPr>
+          <w:color w:val="0070C0"/>
+        </w:rPr>
+        <w:t xml:space="preserve"> Film variation contributes to deformation variation and hence stiffness errors.</w:t>
+      </w:r>
+    </w:p>
+    <w:p>
+      <w:pPr>
+        <w:numPr>
+          <w:ilvl w:val="0"/>
+          <w:numId w:val="4"/>
+        </w:numPr>
+        <w:rPr>
+          <w:color w:val="4EA72E" w:themeColor="accent6"/>
+        </w:rPr>
+      </w:pPr>
+      <w:r>
+        <w:rPr>
+          <w:color w:val="4EA72E" w:themeColor="accent6"/>
+        </w:rPr>
+        <w:t>W</w:t>
+      </w:r>
+      <w:r>
+        <w:rPr>
+          <w:color w:val="4EA72E" w:themeColor="accent6"/>
+        </w:rPr>
+        <w:t xml:space="preserve">hat are the typical accelerations in such bearing applications? Can we have a simple assessment of </w:t>
+      </w:r>
       <w:proofErr w:type="gramStart"/>
       <w:r>
+        <w:rPr>
+          <w:color w:val="4EA72E" w:themeColor="accent6"/>
+        </w:rPr>
+        <w:t>whether or not</w:t>
+      </w:r>
+      <w:proofErr w:type="gramEnd"/>
+      <w:r>
+        <w:rPr>
+          <w:color w:val="4EA72E" w:themeColor="accent6"/>
+        </w:rPr>
+        <w:t xml:space="preserve"> the static models are applicable for a given situation</w:t>
+      </w:r>
+      <w:r>
+        <w:rPr>
+          <w:color w:val="4EA72E" w:themeColor="accent6"/>
+        </w:rPr>
+        <w:t>.</w:t>
+      </w:r>
+    </w:p>
+    <w:p>
+      <w:pPr>
+        <w:numPr>
+          <w:ilvl w:val="1"/>
+          <w:numId w:val="4"/>
+        </w:numPr>
+        <w:rPr>
+          <w:color w:val="0070C0"/>
+        </w:rPr>
+      </w:pPr>
+      <w:r>
+        <w:rPr>
+          <w:color w:val="0070C0"/>
+        </w:rPr>
+        <w:t>Justified the requirement for dynamic models due to the time-varying forces not being captured by static models</w:t>
+      </w:r>
+      <w:r>
+        <w:rPr>
+          <w:color w:val="0070C0"/>
+        </w:rPr>
+        <w:t>.</w:t>
+      </w:r>
+    </w:p>
+    <w:p>
+      <w:pPr>
+        <w:numPr>
+          <w:ilvl w:val="0"/>
+          <w:numId w:val="4"/>
+        </w:numPr>
+        <w:rPr>
+          <w:color w:val="4EA72E" w:themeColor="accent6"/>
+        </w:rPr>
+      </w:pPr>
+      <w:proofErr w:type="gramStart"/>
+      <w:r>
+        <w:rPr>
+          <w:color w:val="4EA72E" w:themeColor="accent6"/>
+        </w:rPr>
         <w:t>So</w:t>
       </w:r>
       <w:proofErr w:type="gramEnd"/>
       <w:r>
+        <w:rPr>
+          <w:color w:val="4EA72E" w:themeColor="accent6"/>
+        </w:rPr>
         <w:t xml:space="preserve"> is your implementation of a lubricated dynamic model in a system the main contribution? Is the dynamic model of the bearing itself any different from previous models? Improve clarity</w:t>
       </w:r>
     </w:p>
     <w:p>
       <w:pPr>
         <w:numPr>
-          <w:ilvl w:val="0"/>
+          <w:ilvl w:val="1"/>
           <w:numId w:val="4"/>
         </w:numPr>
         <w:rPr>
-          <w:color w:val="4EA72E" w:themeColor="accent6"/>
-        </w:rPr>
-      </w:pPr>
-      <w:r>
-        <w:rPr>
-          <w:color w:val="4EA72E" w:themeColor="accent6"/>
+          <w:color w:val="0070C0"/>
+        </w:rPr>
+      </w:pPr>
+      <w:r>
+        <w:rPr>
+          <w:color w:val="0070C0"/>
+        </w:rPr>
+        <w:t xml:space="preserve">Whilst the lubricated model is my own development, the main novelty </w:t>
+      </w:r>
+      <w:r>
+        <w:rPr>
+          <w:color w:val="0070C0"/>
+        </w:rPr>
+        <w:t xml:space="preserve">in this area </w:t>
+      </w:r>
+      <w:r>
+        <w:rPr>
+          <w:color w:val="0070C0"/>
+        </w:rPr>
+        <w:t xml:space="preserve">is implementation </w:t>
+      </w:r>
+      <w:r>
+        <w:rPr>
+          <w:color w:val="0070C0"/>
+        </w:rPr>
+        <w:t xml:space="preserve">into </w:t>
+      </w:r>
+      <w:r>
+        <w:rPr>
+          <w:color w:val="0070C0"/>
+        </w:rPr>
+        <w:t>a system</w:t>
+      </w:r>
+      <w:r>
+        <w:rPr>
+          <w:color w:val="0070C0"/>
+        </w:rPr>
+        <w:t>-</w:t>
+      </w:r>
+      <w:r>
+        <w:rPr>
+          <w:color w:val="0070C0"/>
+        </w:rPr>
+        <w:t>level flexible model</w:t>
+      </w:r>
+      <w:r>
+        <w:rPr>
+          <w:color w:val="0070C0"/>
+        </w:rPr>
+        <w:t xml:space="preserve"> and assessment of film contribution</w:t>
+      </w:r>
+      <w:r>
+        <w:rPr>
+          <w:color w:val="0070C0"/>
+        </w:rPr>
+        <w:t xml:space="preserve">. This is clarified in the chapter contributions. </w:t>
+      </w:r>
+    </w:p>
+    <w:p>
+      <w:pPr>
+        <w:numPr>
+          <w:ilvl w:val="0"/>
+          <w:numId w:val="4"/>
+        </w:numPr>
+        <w:rPr>
+          <w:color w:val="4EA72E" w:themeColor="accent6"/>
+        </w:rPr>
+      </w:pPr>
+      <w:r>
+        <w:rPr>
+          <w:color w:val="4EA72E" w:themeColor="accent6"/>
+        </w:rPr>
+        <w:t>Elaborate on what the time-varying forces in electrified vehicle transmissions are</w:t>
+      </w:r>
+    </w:p>
+    <w:p>
+      <w:pPr>
+        <w:numPr>
+          <w:ilvl w:val="1"/>
+          <w:numId w:val="4"/>
+        </w:numPr>
+        <w:rPr>
+          <w:color w:val="0070C0"/>
+        </w:rPr>
+      </w:pPr>
+      <w:r>
+        <w:rPr>
+          <w:color w:val="0070C0"/>
+        </w:rPr>
+        <w:t>Added to subsection 2.12 at start of Literature Review</w:t>
+      </w:r>
+      <w:r>
+        <w:rPr>
+          <w:color w:val="0070C0"/>
+        </w:rPr>
+        <w:t>.</w:t>
+      </w:r>
+    </w:p>
+    <w:p>
+      <w:pPr>
+        <w:numPr>
+          <w:ilvl w:val="0"/>
+          <w:numId w:val="4"/>
+        </w:numPr>
+        <w:rPr>
+          <w:color w:val="4EA72E" w:themeColor="accent6"/>
+        </w:rPr>
+      </w:pPr>
+      <w:r>
+        <w:rPr>
+          <w:color w:val="4EA72E" w:themeColor="accent6"/>
+        </w:rPr>
+        <w:t xml:space="preserve">What about rough surface contact mechanics? Today's full rough contact models are very fast and routinely used for bearing predictions such as bearing life for example. What effect does roughness have on stiffness and dynamic response of contact? Real vs nominal area </w:t>
+      </w:r>
+      <w:proofErr w:type="gramStart"/>
+      <w:r>
+        <w:rPr>
+          <w:color w:val="4EA72E" w:themeColor="accent6"/>
+        </w:rPr>
+        <w:t>etc..</w:t>
+      </w:r>
+      <w:proofErr w:type="gramEnd"/>
+      <w:r>
+        <w:rPr>
+          <w:color w:val="4EA72E" w:themeColor="accent6"/>
+        </w:rPr>
+        <w:t xml:space="preserve"> What is the typical roughness of bearing components?</w:t>
+      </w:r>
+    </w:p>
+    <w:p>
+      <w:pPr>
+        <w:numPr>
+          <w:ilvl w:val="1"/>
+          <w:numId w:val="4"/>
+        </w:numPr>
+        <w:rPr>
+          <w:color w:val="0070C0"/>
+        </w:rPr>
+      </w:pPr>
+      <w:r>
+        <w:rPr>
+          <w:color w:val="0070C0"/>
+        </w:rPr>
+        <w:t>Real contact area is much smaller than nominal area since only asperity peaks support the load. These act as compliant microcontacts, hence stiffness is lower than smooth Hertzian assumption with a more linear response.</w:t>
+      </w:r>
+    </w:p>
+    <w:p>
+      <w:pPr>
+        <w:numPr>
+          <w:ilvl w:val="1"/>
+          <w:numId w:val="4"/>
+        </w:numPr>
+        <w:rPr>
+          <w:color w:val="0070C0"/>
+        </w:rPr>
+      </w:pPr>
+      <w:r>
+        <w:rPr>
+          <w:color w:val="0070C0"/>
+        </w:rPr>
+        <w:t>Rough-surface contact models were not included because the bearings operate predominantly in the full</w:t>
+      </w:r>
+      <w:r>
+        <w:rPr>
+          <w:color w:val="0070C0"/>
+        </w:rPr>
+        <w:noBreakHyphen/>
+        <w:t>film EHL regime</w:t>
+      </w:r>
+      <w:r>
+        <w:rPr>
+          <w:color w:val="0070C0"/>
+        </w:rPr>
+        <w:t>.</w:t>
+      </w:r>
+    </w:p>
+    <w:p>
+      <w:pPr>
+        <w:numPr>
+          <w:ilvl w:val="1"/>
+          <w:numId w:val="4"/>
+        </w:numPr>
+        <w:rPr>
+          <w:color w:val="0070C0"/>
+        </w:rPr>
+      </w:pPr>
+      <w:r>
+        <w:rPr>
+          <w:color w:val="0070C0"/>
+        </w:rPr>
+        <w:t xml:space="preserve">Surface topography measurements are presented in Section 2.2.9. </w:t>
+      </w:r>
+      <w:r>
+        <w:rPr>
+          <w:color w:val="0070C0"/>
+        </w:rPr>
+        <w:t>This g</w:t>
+      </w:r>
+      <w:r>
+        <w:rPr>
+          <w:color w:val="0070C0"/>
+        </w:rPr>
+        <w:t xml:space="preserve">ave </w:t>
+      </w:r>
+      <w:r>
+        <w:rPr>
+          <w:color w:val="0070C0"/>
+        </w:rPr>
+        <w:t>a lambda value of 2.59 for the thinnest EHL film at 1000</w:t>
+      </w:r>
+      <w:r>
+        <w:rPr>
+          <w:color w:val="0070C0"/>
+        </w:rPr>
+        <w:t xml:space="preserve"> rpm in Chapter 4. </w:t>
+      </w:r>
+      <w:r>
+        <w:rPr>
+          <w:color w:val="0070C0"/>
+        </w:rPr>
+        <w:t xml:space="preserve">Asperity interaction </w:t>
+      </w:r>
+      <w:r>
+        <w:rPr>
+          <w:color w:val="0070C0"/>
+        </w:rPr>
+        <w:t xml:space="preserve">was therefore </w:t>
+      </w:r>
+      <w:r>
+        <w:rPr>
+          <w:color w:val="0070C0"/>
+        </w:rPr>
+        <w:t>not considered as the EHL film fully support</w:t>
+      </w:r>
+      <w:r>
+        <w:rPr>
+          <w:color w:val="0070C0"/>
+        </w:rPr>
+        <w:t xml:space="preserve">ed </w:t>
+      </w:r>
+      <w:r>
+        <w:rPr>
+          <w:color w:val="0070C0"/>
+        </w:rPr>
+        <w:t>the load.</w:t>
+      </w:r>
+    </w:p>
+    <w:p>
+      <w:pPr>
+        <w:numPr>
+          <w:ilvl w:val="0"/>
+          <w:numId w:val="4"/>
+        </w:numPr>
+        <w:rPr>
+          <w:color w:val="4EA72E" w:themeColor="accent6"/>
+        </w:rPr>
+      </w:pPr>
+      <w:r>
+        <w:rPr>
+          <w:color w:val="4EA72E" w:themeColor="accent6"/>
+        </w:rPr>
+        <w:t>State main assumption in Hertz Theory</w:t>
+      </w:r>
+    </w:p>
+    <w:p>
+      <w:pPr>
+        <w:numPr>
+          <w:ilvl w:val="1"/>
+          <w:numId w:val="4"/>
+        </w:numPr>
+        <w:rPr>
+          <w:color w:val="0070C0"/>
+        </w:rPr>
+      </w:pPr>
+      <w:r>
+        <w:rPr>
+          <w:color w:val="0070C0"/>
+        </w:rPr>
+        <w:t>Added to Section 2.2.1</w:t>
+      </w:r>
+      <w:r>
+        <w:rPr>
+          <w:color w:val="0070C0"/>
+        </w:rPr>
+        <w:t>.</w:t>
+      </w:r>
+    </w:p>
+    <w:p>
+      <w:pPr>
+        <w:numPr>
+          <w:ilvl w:val="0"/>
+          <w:numId w:val="4"/>
+        </w:numPr>
+        <w:rPr>
+          <w:color w:val="4EA72E" w:themeColor="accent6"/>
+        </w:rPr>
+      </w:pPr>
+      <w:r>
+        <w:rPr>
+          <w:color w:val="4EA72E" w:themeColor="accent6"/>
+        </w:rPr>
+        <w:t xml:space="preserve">Why is Hertz OK for point contact but not for line contact? It is the exact same </w:t>
+      </w:r>
+      <w:proofErr w:type="gramStart"/>
+      <w:r>
+        <w:rPr>
+          <w:color w:val="4EA72E" w:themeColor="accent6"/>
+        </w:rPr>
+        <w:t>theory?</w:t>
+      </w:r>
+      <w:proofErr w:type="gramEnd"/>
+      <w:r>
+        <w:rPr>
+          <w:color w:val="4EA72E" w:themeColor="accent6"/>
+        </w:rPr>
+        <w:t xml:space="preserve"> Rephrase</w:t>
+      </w:r>
+    </w:p>
+    <w:p>
+      <w:pPr>
+        <w:numPr>
+          <w:ilvl w:val="1"/>
+          <w:numId w:val="4"/>
+        </w:numPr>
+        <w:rPr>
+          <w:color w:val="4EA72E" w:themeColor="accent6"/>
+        </w:rPr>
+      </w:pPr>
+      <w:r>
+        <w:rPr>
+          <w:color w:val="0070C0"/>
+        </w:rPr>
+        <w:t>Clarified</w:t>
+      </w:r>
+      <w:r>
+        <w:rPr>
+          <w:color w:val="0070C0"/>
+        </w:rPr>
+        <w:t xml:space="preserve"> in 2.2.2</w:t>
+      </w:r>
+      <w:r>
+        <w:rPr>
+          <w:color w:val="0070C0"/>
+        </w:rPr>
+        <w:t>. Cylindrical rollers have finite length, not modelled as infinitely long cylinders. Therefore, adjustment required to capture edge effects</w:t>
+      </w:r>
+      <w:r>
+        <w:rPr>
+          <w:color w:val="0070C0"/>
+        </w:rPr>
+        <w:t>.</w:t>
+      </w:r>
+    </w:p>
+    <w:p>
+      <w:pPr>
+        <w:numPr>
+          <w:ilvl w:val="0"/>
+          <w:numId w:val="4"/>
+        </w:numPr>
+        <w:rPr>
+          <w:color w:val="4EA72E" w:themeColor="accent6"/>
+        </w:rPr>
+      </w:pPr>
+      <w:r>
+        <w:rPr>
+          <w:color w:val="4EA72E" w:themeColor="accent6"/>
+        </w:rPr>
+        <w:t>For accurate predictions (including bearing life predictions) none of this is used, but a full numerical contact model is used instead, which can even include roughness and asperity stress history. I think you need to update the text to clarify this</w:t>
+      </w:r>
+    </w:p>
+    <w:p>
+      <w:pPr>
+        <w:numPr>
+          <w:ilvl w:val="1"/>
+          <w:numId w:val="4"/>
+        </w:numPr>
+        <w:rPr>
+          <w:color w:val="0070C0"/>
+        </w:rPr>
+      </w:pPr>
+      <w:r>
+        <w:rPr>
+          <w:color w:val="0070C0"/>
         </w:rPr>
         <w:lastRenderedPageBreak/>
-        <w:t>Elaborate on what the time-varying forces in electrified vehicle transmissions are</w:t>
-      </w:r>
-    </w:p>
-    <w:p>
-      <w:pPr>
-        <w:numPr>
-          <w:ilvl w:val="1"/>
+        <w:t>Clarified</w:t>
+      </w:r>
+      <w:r>
+        <w:rPr>
+          <w:color w:val="0070C0"/>
+        </w:rPr>
+        <w:t xml:space="preserve"> in text</w:t>
+      </w:r>
+      <w:r>
+        <w:rPr>
+          <w:color w:val="0070C0"/>
+        </w:rPr>
+        <w:t xml:space="preserve"> that full numerical contact solutions are not viable for FMBD models requiring computationally efficiency. Therefore, focus was on Hertz based analytical methods.</w:t>
+      </w:r>
+    </w:p>
+    <w:p>
+      <w:pPr>
+        <w:numPr>
+          <w:ilvl w:val="0"/>
           <w:numId w:val="4"/>
         </w:numPr>
         <w:rPr>
-          <w:color w:val="0070C0"/>
-        </w:rPr>
-      </w:pPr>
-      <w:r>
-        <w:rPr>
-          <w:color w:val="0070C0"/>
-        </w:rPr>
-        <w:t>Added to subsection 2.12 at start of Literature Review</w:t>
-      </w:r>
-    </w:p>
-    <w:p>
-      <w:pPr>
-        <w:numPr>
-          <w:ilvl w:val="0"/>
+          <w:color w:val="4EA72E" w:themeColor="accent6"/>
+        </w:rPr>
+      </w:pPr>
+      <w:r>
+        <w:rPr>
+          <w:color w:val="4EA72E" w:themeColor="accent6"/>
+        </w:rPr>
+        <w:t>How/why does starvation occur in bearings? Explain briefly</w:t>
+      </w:r>
+    </w:p>
+    <w:p>
+      <w:pPr>
+        <w:numPr>
+          <w:ilvl w:val="1"/>
           <w:numId w:val="4"/>
         </w:numPr>
-      </w:pPr>
-      <w:r>
-        <w:t xml:space="preserve">What about rough surface contact mechanics? Today's full rough contact models are very fast and routinely used for bearing predictions such as bearing life for example. What effect does roughness have on stiffness and dynamic response of contact? Real vs nominal area </w:t>
+        <w:rPr>
+          <w:color w:val="0070C0"/>
+        </w:rPr>
+      </w:pPr>
+      <w:r>
+        <w:rPr>
+          <w:color w:val="0070C0"/>
+        </w:rPr>
+        <w:t>Mechanism explained in 2.4.2 Starvation. Explanation refined.</w:t>
+      </w:r>
+    </w:p>
+    <w:p>
+      <w:pPr>
+        <w:numPr>
+          <w:ilvl w:val="0"/>
+          <w:numId w:val="4"/>
+        </w:numPr>
+        <w:rPr>
+          <w:color w:val="4EA72E" w:themeColor="accent6"/>
+        </w:rPr>
+      </w:pPr>
+      <w:r>
+        <w:rPr>
+          <w:color w:val="4EA72E" w:themeColor="accent6"/>
+        </w:rPr>
+        <w:t xml:space="preserve">Add comment on </w:t>
+      </w:r>
+      <w:proofErr w:type="spellStart"/>
+      <w:r>
+        <w:rPr>
+          <w:color w:val="4EA72E" w:themeColor="accent6"/>
+        </w:rPr>
+        <w:t>tribofilms</w:t>
+      </w:r>
+      <w:proofErr w:type="spellEnd"/>
+      <w:r>
+        <w:rPr>
+          <w:color w:val="4EA72E" w:themeColor="accent6"/>
+        </w:rPr>
+        <w:t xml:space="preserve"> in boundary section: </w:t>
       </w:r>
       <w:proofErr w:type="gramStart"/>
       <w:r>
-        <w:t>etc..</w:t>
+        <w:rPr>
+          <w:color w:val="4EA72E" w:themeColor="accent6"/>
+        </w:rPr>
+        <w:t>so</w:t>
       </w:r>
       <w:proofErr w:type="gramEnd"/>
       <w:r>
-        <w:t xml:space="preserve"> What is the typical roughness of bearing components?</w:t>
-      </w:r>
-    </w:p>
-    <w:p>
-      <w:pPr>
-        <w:numPr>
-          <w:ilvl w:val="0"/>
+        <w:rPr>
+          <w:color w:val="4EA72E" w:themeColor="accent6"/>
+        </w:rPr>
+        <w:t xml:space="preserve"> what protects/lubricates the contact here? Solid, chemically formed boundary (</w:t>
+      </w:r>
+      <w:proofErr w:type="spellStart"/>
+      <w:r>
+        <w:rPr>
+          <w:color w:val="4EA72E" w:themeColor="accent6"/>
+        </w:rPr>
+        <w:t>tribofilms</w:t>
+      </w:r>
+      <w:proofErr w:type="spellEnd"/>
+      <w:r>
+        <w:rPr>
+          <w:color w:val="4EA72E" w:themeColor="accent6"/>
+        </w:rPr>
+        <w:t>) that are 20-100nm in thickness.</w:t>
+      </w:r>
+    </w:p>
+    <w:p>
+      <w:pPr>
+        <w:numPr>
+          <w:ilvl w:val="1"/>
           <w:numId w:val="4"/>
         </w:numPr>
         <w:rPr>
-          <w:color w:val="4EA72E" w:themeColor="accent6"/>
-        </w:rPr>
-      </w:pPr>
-      <w:r>
-        <w:rPr>
-          <w:color w:val="4EA72E" w:themeColor="accent6"/>
-        </w:rPr>
-        <w:t>State main assumption in Hertz Theory</w:t>
-      </w:r>
-    </w:p>
-    <w:p>
-      <w:pPr>
-        <w:numPr>
-          <w:ilvl w:val="1"/>
+          <w:color w:val="0070C0"/>
+        </w:rPr>
+      </w:pPr>
+      <w:r>
+        <w:rPr>
+          <w:color w:val="0070C0"/>
+        </w:rPr>
+        <w:t xml:space="preserve">Added comment on </w:t>
+      </w:r>
+      <w:proofErr w:type="spellStart"/>
+      <w:r>
+        <w:rPr>
+          <w:color w:val="0070C0"/>
+        </w:rPr>
+        <w:t>tribofilms</w:t>
+      </w:r>
+      <w:proofErr w:type="spellEnd"/>
+      <w:r>
+        <w:rPr>
+          <w:color w:val="0070C0"/>
+        </w:rPr>
+        <w:t xml:space="preserve"> to boundary section of 2.3.6</w:t>
+      </w:r>
+      <w:r>
+        <w:rPr>
+          <w:color w:val="0070C0"/>
+        </w:rPr>
+        <w:t>.</w:t>
+      </w:r>
+    </w:p>
+    <w:p>
+      <w:pPr>
+        <w:numPr>
+          <w:ilvl w:val="0"/>
           <w:numId w:val="4"/>
         </w:numPr>
-        <w:rPr>
-          <w:color w:val="0070C0"/>
-        </w:rPr>
-      </w:pPr>
-      <w:r>
-        <w:rPr>
-          <w:color w:val="0070C0"/>
-        </w:rPr>
-        <w:t>Added to Section 2.2.1</w:t>
+      </w:pPr>
+      <w:r>
+        <w:t>Add further detail about the state of the art in EHL modelling (see further corrections form Amir)</w:t>
+      </w:r>
+      <w:r>
+        <w:t>. Experimental EHD studies, Gupta inlet heating correction factor, CFD models?</w:t>
       </w:r>
     </w:p>
     <w:p>
@@ -552,235 +1222,567 @@
           <w:ilvl w:val="0"/>
           <w:numId w:val="4"/>
         </w:numPr>
-        <w:rPr>
-          <w:color w:val="4EA72E" w:themeColor="accent6"/>
-        </w:rPr>
-      </w:pPr>
-      <w:r>
-        <w:rPr>
-          <w:color w:val="4EA72E" w:themeColor="accent6"/>
-        </w:rPr>
-        <w:t xml:space="preserve">Why is Hertz OK for point contact but not for line contact? It is the exact same </w:t>
+      </w:pPr>
+      <w:r>
+        <w:t xml:space="preserve">At the end of Lit Survey, add a section to clarify how this Lit Survey justifies the need for your work i.e. what you hope the work will be able to </w:t>
+      </w:r>
+      <w:proofErr w:type="spellStart"/>
+      <w:r>
+        <w:t>tel</w:t>
+      </w:r>
+      <w:proofErr w:type="spellEnd"/>
+      <w:r>
+        <w:t xml:space="preserve"> us that we do not know </w:t>
       </w:r>
       <w:proofErr w:type="gramStart"/>
       <w:r>
-        <w:rPr>
-          <w:color w:val="4EA72E" w:themeColor="accent6"/>
-        </w:rPr>
-        <w:t>theory?</w:t>
+        <w:t>already ?</w:t>
       </w:r>
       <w:proofErr w:type="gramEnd"/>
       <w:r>
-        <w:rPr>
-          <w:color w:val="4EA72E" w:themeColor="accent6"/>
-        </w:rPr>
-        <w:t xml:space="preserve"> Rephrase</w:t>
-      </w:r>
-    </w:p>
-    <w:p>
-      <w:pPr>
-        <w:numPr>
-          <w:ilvl w:val="1"/>
-          <w:numId w:val="4"/>
-        </w:numPr>
-        <w:rPr>
-          <w:color w:val="4EA72E" w:themeColor="accent6"/>
-        </w:rPr>
-      </w:pPr>
-      <w:r>
-        <w:rPr>
-          <w:color w:val="0070C0"/>
-        </w:rPr>
-        <w:t>Clarified</w:t>
-      </w:r>
-      <w:r>
-        <w:rPr>
-          <w:color w:val="0070C0"/>
-        </w:rPr>
-        <w:t xml:space="preserve"> in 2.2.2</w:t>
-      </w:r>
-      <w:r>
-        <w:rPr>
-          <w:color w:val="0070C0"/>
-        </w:rPr>
-        <w:t>. Cylindrical rollers have finite length, not modelled as infinitely long cylinders. Therefore, adjustment required to capture edge effects</w:t>
-      </w:r>
-    </w:p>
-    <w:p>
-      <w:pPr>
-        <w:numPr>
-          <w:ilvl w:val="0"/>
-          <w:numId w:val="4"/>
-        </w:numPr>
-        <w:rPr>
-          <w:color w:val="4EA72E" w:themeColor="accent6"/>
-        </w:rPr>
-      </w:pPr>
-      <w:r>
-        <w:rPr>
-          <w:color w:val="4EA72E" w:themeColor="accent6"/>
-        </w:rPr>
-        <w:t>For accurate predictions (including bearing life predictions) none of this is used, but a full numerical contact model is used instead, which can even include roughness and asperity stress history. I think you need to update the text to clarify this</w:t>
-      </w:r>
-    </w:p>
-    <w:p>
-      <w:pPr>
-        <w:numPr>
-          <w:ilvl w:val="1"/>
-          <w:numId w:val="4"/>
-        </w:numPr>
-        <w:rPr>
-          <w:color w:val="0070C0"/>
-        </w:rPr>
-      </w:pPr>
-      <w:r>
-        <w:rPr>
-          <w:color w:val="0070C0"/>
-        </w:rPr>
-        <w:t>Clarified</w:t>
-      </w:r>
-      <w:r>
-        <w:rPr>
-          <w:color w:val="0070C0"/>
-        </w:rPr>
-        <w:t xml:space="preserve"> in text</w:t>
-      </w:r>
-      <w:r>
-        <w:rPr>
-          <w:color w:val="0070C0"/>
-        </w:rPr>
-        <w:t xml:space="preserve"> that full numerical contact solutions are not viable for FMBD models requiring computationally efficiency. Therefore, focus was on Hertz based analytical methods.</w:t>
-      </w:r>
-    </w:p>
-    <w:p>
-      <w:pPr>
-        <w:numPr>
-          <w:ilvl w:val="0"/>
-          <w:numId w:val="4"/>
-        </w:numPr>
-        <w:rPr>
-          <w:color w:val="4EA72E" w:themeColor="accent6"/>
-        </w:rPr>
-      </w:pPr>
-      <w:r>
-        <w:rPr>
-          <w:color w:val="4EA72E" w:themeColor="accent6"/>
-        </w:rPr>
-        <w:t>How/why does starvation occur in bearings? Explain briefly</w:t>
-      </w:r>
-    </w:p>
-    <w:p>
-      <w:pPr>
-        <w:numPr>
-          <w:ilvl w:val="1"/>
-          <w:numId w:val="4"/>
-        </w:numPr>
-        <w:rPr>
-          <w:color w:val="0070C0"/>
-        </w:rPr>
-      </w:pPr>
-      <w:r>
-        <w:rPr>
-          <w:color w:val="0070C0"/>
-        </w:rPr>
-        <w:t>Mechanism explained in 2.4.2 Starvation. Explanation refined.</w:t>
-      </w:r>
-    </w:p>
-    <w:p>
-      <w:pPr>
-        <w:numPr>
-          <w:ilvl w:val="0"/>
-          <w:numId w:val="4"/>
-        </w:numPr>
-        <w:rPr>
-          <w:color w:val="4EA72E" w:themeColor="accent6"/>
-        </w:rPr>
-      </w:pPr>
-      <w:r>
-        <w:rPr>
-          <w:color w:val="4EA72E" w:themeColor="accent6"/>
-        </w:rPr>
-        <w:t xml:space="preserve">Add comment on </w:t>
+        <w:t xml:space="preserve"> What is the evidence that your approach is needed and can make a valid contribution? Why do we need </w:t>
       </w:r>
       <w:proofErr w:type="spellStart"/>
       <w:r>
-        <w:rPr>
-          <w:color w:val="4EA72E" w:themeColor="accent6"/>
-        </w:rPr>
-        <w:t>tribofilms</w:t>
+        <w:t>tribo</w:t>
       </w:r>
       <w:proofErr w:type="spellEnd"/>
       <w:r>
-        <w:rPr>
-          <w:color w:val="4EA72E" w:themeColor="accent6"/>
-        </w:rPr>
-        <w:t xml:space="preserve"> in boundary section: </w:t>
+        <w:t xml:space="preserve"> dynamic multi body analysis (</w:t>
+      </w:r>
+      <w:proofErr w:type="spellStart"/>
+      <w:r>
+        <w:t>inc</w:t>
+      </w:r>
+      <w:proofErr w:type="spellEnd"/>
+      <w:r>
+        <w:t xml:space="preserve"> effect so EHD films) and why do we need ANNs to be able to study these bearings better than we can with existing tools?</w:t>
+      </w:r>
+    </w:p>
+    <w:p>
+      <w:pPr>
+        <w:pStyle w:val="Heading2"/>
+      </w:pPr>
+      <w:r>
+        <w:t xml:space="preserve">Chapter 3 - Experimental </w:t>
+      </w:r>
+      <w:proofErr w:type="spellStart"/>
+      <w:r>
+        <w:t>Tribodynamics</w:t>
+      </w:r>
+      <w:proofErr w:type="spellEnd"/>
+    </w:p>
+    <w:p>
+      <w:pPr>
+        <w:numPr>
+          <w:ilvl w:val="0"/>
+          <w:numId w:val="10"/>
+        </w:numPr>
+        <w:rPr>
+          <w:color w:val="4EA72E" w:themeColor="accent6"/>
+        </w:rPr>
+      </w:pPr>
+      <w:r>
+        <w:rPr>
+          <w:color w:val="4EA72E" w:themeColor="accent6"/>
+        </w:rPr>
+        <w:t xml:space="preserve">Add bearing NDM value from experimental test. </w:t>
+      </w:r>
+      <w:r>
+        <w:rPr>
+          <w:color w:val="4EA72E" w:themeColor="accent6"/>
+        </w:rPr>
+        <w:t xml:space="preserve">so ~30mm Dm, which gives </w:t>
+      </w:r>
+      <w:proofErr w:type="spellStart"/>
+      <w:r>
+        <w:rPr>
+          <w:color w:val="4EA72E" w:themeColor="accent6"/>
+        </w:rPr>
+        <w:t>NDm</w:t>
+      </w:r>
+      <w:proofErr w:type="spellEnd"/>
+      <w:r>
+        <w:rPr>
+          <w:color w:val="4EA72E" w:themeColor="accent6"/>
+        </w:rPr>
+        <w:t xml:space="preserve"> ~450k. This is not usually considered as </w:t>
       </w:r>
       <w:proofErr w:type="gramStart"/>
       <w:r>
         <w:rPr>
           <w:color w:val="4EA72E" w:themeColor="accent6"/>
         </w:rPr>
-        <w:t>so</w:t>
+        <w:t>high speed</w:t>
       </w:r>
       <w:proofErr w:type="gramEnd"/>
       <w:r>
         <w:rPr>
           <w:color w:val="4EA72E" w:themeColor="accent6"/>
         </w:rPr>
-        <w:t xml:space="preserve"> what protects/lubricates the contact here? Solid, chemically formed boundary (</w:t>
+        <w:t xml:space="preserve"> bearing. </w:t>
+      </w:r>
+      <w:r>
+        <w:rPr>
+          <w:color w:val="4EA72E" w:themeColor="accent6"/>
+        </w:rPr>
+        <w:t>Discuss what is considered high-speed in relation to automotive</w:t>
+      </w:r>
+      <w:r>
+        <w:rPr>
+          <w:color w:val="4EA72E" w:themeColor="accent6"/>
+        </w:rPr>
+        <w:t>.</w:t>
+      </w:r>
+    </w:p>
+    <w:p>
+      <w:pPr>
+        <w:numPr>
+          <w:ilvl w:val="1"/>
+          <w:numId w:val="10"/>
+        </w:numPr>
+        <w:rPr>
+          <w:color w:val="0070C0"/>
+        </w:rPr>
+      </w:pPr>
+      <w:r>
+        <w:rPr>
+          <w:color w:val="0070C0"/>
+        </w:rPr>
+        <w:t>Discussion on what is considered high-speed is now included in new section 2.1.3 in literature review</w:t>
+      </w:r>
+      <w:r>
+        <w:rPr>
+          <w:color w:val="0070C0"/>
+        </w:rPr>
+        <w:t xml:space="preserve">. </w:t>
       </w:r>
       <w:proofErr w:type="spellStart"/>
       <w:r>
         <w:rPr>
-          <w:color w:val="4EA72E" w:themeColor="accent6"/>
-        </w:rPr>
-        <w:t>tribofilms</w:t>
+          <w:color w:val="0070C0"/>
+        </w:rPr>
+        <w:t>nDm</w:t>
       </w:r>
       <w:proofErr w:type="spellEnd"/>
       <w:r>
         <w:rPr>
-          <w:color w:val="4EA72E" w:themeColor="accent6"/>
-        </w:rPr>
-        <w:t>) that are 20-100nm in thickness.</w:t>
-      </w:r>
-    </w:p>
-    <w:p>
-      <w:pPr>
-        <w:numPr>
-          <w:ilvl w:val="1"/>
-          <w:numId w:val="4"/>
-        </w:numPr>
-        <w:rPr>
-          <w:color w:val="0070C0"/>
-        </w:rPr>
-      </w:pPr>
-      <w:r>
-        <w:rPr>
-          <w:color w:val="0070C0"/>
-        </w:rPr>
-        <w:t xml:space="preserve">Added comment on </w:t>
+          <w:color w:val="0070C0"/>
+        </w:rPr>
+        <w:t xml:space="preserve"> here is 578k since Dm is 38.5. Classified as high-speed (&lt;500k) as discussed in new </w:t>
       </w:r>
       <w:proofErr w:type="spellStart"/>
       <w:r>
         <w:rPr>
           <w:color w:val="0070C0"/>
         </w:rPr>
-        <w:t>tribofilms</w:t>
+        <w:t>nDm</w:t>
       </w:r>
       <w:proofErr w:type="spellEnd"/>
       <w:r>
         <w:rPr>
           <w:color w:val="0070C0"/>
         </w:rPr>
-        <w:t xml:space="preserve"> to boundary section of 2.3.6</w:t>
-      </w:r>
-    </w:p>
-    <w:p>
-      <w:pPr>
-        <w:numPr>
-          <w:ilvl w:val="0"/>
-          <w:numId w:val="4"/>
+        <w:t xml:space="preserve"> section</w:t>
+      </w:r>
+      <w:r>
+        <w:rPr>
+          <w:color w:val="0070C0"/>
+        </w:rPr>
+        <w:t>.</w:t>
+      </w:r>
+    </w:p>
+    <w:p>
+      <w:pPr>
+        <w:numPr>
+          <w:ilvl w:val="0"/>
+          <w:numId w:val="10"/>
+        </w:numPr>
+        <w:rPr>
+          <w:color w:val="4EA72E" w:themeColor="accent6"/>
+        </w:rPr>
+      </w:pPr>
+      <w:r>
+        <w:rPr>
+          <w:color w:val="4EA72E" w:themeColor="accent6"/>
+        </w:rPr>
+        <w:t>What pressures in experimental test</w:t>
+      </w:r>
+    </w:p>
+    <w:p>
+      <w:pPr>
+        <w:numPr>
+          <w:ilvl w:val="1"/>
+          <w:numId w:val="10"/>
+        </w:numPr>
+        <w:rPr>
+          <w:color w:val="0070C0"/>
+        </w:rPr>
+      </w:pPr>
+      <w:r>
+        <w:rPr>
+          <w:color w:val="0070C0"/>
+        </w:rPr>
+        <w:t>Contact pressures are presented in the results section and vary depending on dynamic response of rig (</w:t>
+      </w:r>
+      <w:proofErr w:type="spellStart"/>
+      <w:r>
+        <w:rPr>
+          <w:color w:val="0070C0"/>
+        </w:rPr>
+        <w:t>eg.</w:t>
+      </w:r>
+      <w:proofErr w:type="spellEnd"/>
+      <w:r>
+        <w:rPr>
+          <w:color w:val="0070C0"/>
+        </w:rPr>
+        <w:t xml:space="preserve"> resonance). A single nominal value would not be representative here.</w:t>
+      </w:r>
+    </w:p>
+    <w:p>
+      <w:pPr>
+        <w:numPr>
+          <w:ilvl w:val="0"/>
+          <w:numId w:val="10"/>
+        </w:numPr>
+        <w:rPr>
+          <w:color w:val="4EA72E" w:themeColor="accent6"/>
+        </w:rPr>
+      </w:pPr>
+      <w:r>
+        <w:rPr>
+          <w:color w:val="4EA72E" w:themeColor="accent6"/>
+        </w:rPr>
+        <w:t xml:space="preserve">How necessary is the iteration scheme here given the minimal impact of load on film? How does </w:t>
+      </w:r>
+      <w:proofErr w:type="gramStart"/>
+      <w:r>
+        <w:rPr>
+          <w:color w:val="4EA72E" w:themeColor="accent6"/>
+        </w:rPr>
+        <w:t>ignoring  this</w:t>
+      </w:r>
+      <w:proofErr w:type="gramEnd"/>
+      <w:r>
+        <w:rPr>
+          <w:color w:val="4EA72E" w:themeColor="accent6"/>
+        </w:rPr>
+        <w:t xml:space="preserve"> compare to other sources of error, for example accuracy of your location measurements? Add a short discussion with some values to </w:t>
+      </w:r>
+      <w:proofErr w:type="gramStart"/>
+      <w:r>
+        <w:rPr>
+          <w:color w:val="4EA72E" w:themeColor="accent6"/>
+        </w:rPr>
+        <w:t>illustrate  sensitivity</w:t>
+      </w:r>
+      <w:proofErr w:type="gramEnd"/>
+      <w:r>
+        <w:rPr>
+          <w:color w:val="4EA72E" w:themeColor="accent6"/>
+        </w:rPr>
+        <w:t xml:space="preserve"> of solution(s) to this if possible</w:t>
+      </w:r>
+    </w:p>
+    <w:p>
+      <w:pPr>
+        <w:numPr>
+          <w:ilvl w:val="1"/>
+          <w:numId w:val="10"/>
+        </w:numPr>
+        <w:rPr>
+          <w:color w:val="0070C0"/>
+        </w:rPr>
+      </w:pPr>
+      <w:r>
+        <w:rPr>
+          <w:color w:val="0070C0"/>
+        </w:rPr>
+        <w:t>Add</w:t>
+      </w:r>
+      <w:r>
+        <w:rPr>
+          <w:color w:val="0070C0"/>
+        </w:rPr>
+        <w:t xml:space="preserve">ed this to Section 2.8.8. </w:t>
+      </w:r>
+      <w:r>
+        <w:rPr>
+          <w:color w:val="0070C0"/>
+        </w:rPr>
+        <w:t>Because the influence of contact load on film thickness is small compared with the entraining motion</w:t>
+      </w:r>
+      <w:r>
+        <w:rPr>
+          <w:color w:val="0070C0"/>
+        </w:rPr>
+        <w:t xml:space="preserve">, </w:t>
+      </w:r>
+      <w:r>
+        <w:rPr>
+          <w:color w:val="0070C0"/>
+        </w:rPr>
+        <w:t>the solution is only weakly sensitive to load updates. Therefore, the convergence tolerance can be relaxed to reduce computational cost</w:t>
+      </w:r>
+      <w:r>
+        <w:rPr>
+          <w:color w:val="0070C0"/>
+        </w:rPr>
+        <w:t>.</w:t>
+      </w:r>
+    </w:p>
+    <w:p>
+      <w:pPr>
+        <w:numPr>
+          <w:ilvl w:val="1"/>
+          <w:numId w:val="10"/>
+        </w:numPr>
+        <w:rPr>
+          <w:color w:val="0070C0"/>
+        </w:rPr>
+      </w:pPr>
+      <w:r>
+        <w:rPr>
+          <w:color w:val="0070C0"/>
+        </w:rPr>
+        <w:t>The</w:t>
+      </w:r>
+      <w:r>
+        <w:rPr>
+          <w:color w:val="0070C0"/>
+        </w:rPr>
+        <w:t xml:space="preserve"> objective of this section was to develop the models that would be used in the system-level dynamic simulations, so the inclusion of this is still valid</w:t>
+      </w:r>
+      <w:r>
+        <w:rPr>
+          <w:color w:val="0070C0"/>
+        </w:rPr>
+        <w:t xml:space="preserve"> and does not affect section conclusions.</w:t>
+      </w:r>
+    </w:p>
+    <w:p>
+      <w:pPr>
+        <w:numPr>
+          <w:ilvl w:val="1"/>
+          <w:numId w:val="10"/>
+        </w:numPr>
+        <w:rPr>
+          <w:color w:val="0070C0"/>
+        </w:rPr>
+      </w:pPr>
+      <w:r>
+        <w:rPr>
+          <w:color w:val="0070C0"/>
+        </w:rPr>
+        <w:t xml:space="preserve">For the FMBD section, since the film wedge significantly affects the contact deformation </w:t>
+      </w:r>
+      <w:proofErr w:type="spellStart"/>
+      <w:r>
+        <w:rPr>
+          <w:color w:val="0070C0"/>
+        </w:rPr>
+        <w:t>a</w:t>
+      </w:r>
+      <w:r>
+        <w:rPr>
+          <w:color w:val="0070C0"/>
+        </w:rPr>
+        <w:t>and</w:t>
+      </w:r>
+      <w:proofErr w:type="spellEnd"/>
+      <w:r>
+        <w:rPr>
+          <w:color w:val="0070C0"/>
+        </w:rPr>
+        <w:t xml:space="preserve"> hence load, relaxing this too much actually resulted in convergence in the system </w:t>
+      </w:r>
+      <w:r>
+        <w:rPr>
+          <w:color w:val="0070C0"/>
+        </w:rPr>
+        <w:lastRenderedPageBreak/>
+        <w:t>level model. This effect was exacerbated by the explicit nature of the co-simulation methodology.</w:t>
+      </w:r>
+    </w:p>
+    <w:p>
+      <w:pPr>
+        <w:numPr>
+          <w:ilvl w:val="0"/>
+          <w:numId w:val="10"/>
+        </w:numPr>
+        <w:rPr>
+          <w:color w:val="4EA72E" w:themeColor="accent6"/>
+        </w:rPr>
+      </w:pPr>
+      <w:r>
+        <w:rPr>
+          <w:color w:val="4EA72E" w:themeColor="accent6"/>
+        </w:rPr>
+        <w:t>Clarify if rig was built by candidate</w:t>
+      </w:r>
+    </w:p>
+    <w:p>
+      <w:pPr>
+        <w:numPr>
+          <w:ilvl w:val="1"/>
+          <w:numId w:val="10"/>
+        </w:numPr>
+        <w:rPr>
+          <w:color w:val="0070C0"/>
+        </w:rPr>
+      </w:pPr>
+      <w:r>
+        <w:rPr>
+          <w:color w:val="0070C0"/>
+        </w:rPr>
+        <w:t>Added to footnotes</w:t>
+      </w:r>
+      <w:r>
+        <w:rPr>
+          <w:color w:val="0070C0"/>
+        </w:rPr>
+        <w:t>.</w:t>
+      </w:r>
+    </w:p>
+    <w:p>
+      <w:pPr>
+        <w:numPr>
+          <w:ilvl w:val="0"/>
+          <w:numId w:val="10"/>
+        </w:numPr>
+        <w:rPr>
+          <w:color w:val="000000" w:themeColor="text1"/>
+        </w:rPr>
+      </w:pPr>
+      <w:r>
+        <w:rPr>
+          <w:color w:val="000000" w:themeColor="text1"/>
+        </w:rPr>
+        <w:t xml:space="preserve">What acceleration is this from 0-15000rpm in 4s? Was this accounted for in the EHL film predictions? What entrainment speed? Are there inlet shear heating effects? You go through a lot of trouble to describe the 1D Reynolds </w:t>
+      </w:r>
+      <w:proofErr w:type="gramStart"/>
+      <w:r>
+        <w:rPr>
+          <w:color w:val="000000" w:themeColor="text1"/>
+        </w:rPr>
+        <w:t>solver</w:t>
+      </w:r>
+      <w:proofErr w:type="gramEnd"/>
+      <w:r>
+        <w:rPr>
+          <w:color w:val="000000" w:themeColor="text1"/>
+        </w:rPr>
+        <w:t xml:space="preserve"> but these other factors may be just as (or even more) important. Add brief discussion.</w:t>
+      </w:r>
+    </w:p>
+    <w:p>
+      <w:pPr>
+        <w:numPr>
+          <w:ilvl w:val="1"/>
+          <w:numId w:val="10"/>
+        </w:numPr>
+        <w:rPr>
+          <w:color w:val="000000" w:themeColor="text1"/>
+        </w:rPr>
+      </w:pPr>
+      <w:r>
+        <w:rPr>
+          <w:color w:val="000000" w:themeColor="text1"/>
+        </w:rPr>
+        <w:t xml:space="preserve">The purpose of this was not to obtain transient analysis, but a methodology to use in quasi-dynamic time-domain solvers.  STFFT segmented snapshots. Whilst I completely agree these are not technically </w:t>
+      </w:r>
+      <w:proofErr w:type="gramStart"/>
+      <w:r>
+        <w:rPr>
+          <w:color w:val="000000" w:themeColor="text1"/>
+        </w:rPr>
+        <w:t>steady-state</w:t>
+      </w:r>
+      <w:proofErr w:type="gramEnd"/>
+      <w:r>
+        <w:rPr>
+          <w:color w:val="000000" w:themeColor="text1"/>
+        </w:rPr>
+        <w:t xml:space="preserve">, they provided </w:t>
+      </w:r>
+      <w:proofErr w:type="gramStart"/>
+      <w:r>
+        <w:rPr>
+          <w:color w:val="000000" w:themeColor="text1"/>
+        </w:rPr>
+        <w:t>a .</w:t>
+      </w:r>
+      <w:proofErr w:type="gramEnd"/>
+      <w:r>
+        <w:rPr>
+          <w:color w:val="000000" w:themeColor="text1"/>
+        </w:rPr>
+        <w:t xml:space="preserve"> A lot of further analysis was done with this test rig including the use of an electromagnetic shaker to. Unfortunately, the thesis</w:t>
+      </w:r>
+    </w:p>
+    <w:p>
+      <w:pPr>
+        <w:numPr>
+          <w:ilvl w:val="1"/>
+          <w:numId w:val="10"/>
+        </w:numPr>
+        <w:rPr>
+          <w:color w:val="000000" w:themeColor="text1"/>
+        </w:rPr>
+      </w:pPr>
+      <w:r>
+        <w:rPr>
+          <w:color w:val="000000" w:themeColor="text1"/>
+        </w:rPr>
+        <w:t>Inlet shear heating covered on a global level</w:t>
+      </w:r>
+    </w:p>
+    <w:p>
+      <w:pPr>
+        <w:numPr>
+          <w:ilvl w:val="0"/>
+          <w:numId w:val="10"/>
+        </w:numPr>
+        <w:rPr>
+          <w:color w:val="4EA72E" w:themeColor="accent6"/>
+        </w:rPr>
+      </w:pPr>
+      <w:r>
+        <w:rPr>
+          <w:color w:val="4EA72E" w:themeColor="accent6"/>
+        </w:rPr>
+        <w:t>Film is determined by inlet conditions where pressures are much lower than in the contact, in 10s MPa. Correct this to make clear (sec 3.3.3)</w:t>
+      </w:r>
+    </w:p>
+    <w:p>
+      <w:pPr>
+        <w:numPr>
+          <w:ilvl w:val="1"/>
+          <w:numId w:val="10"/>
+        </w:numPr>
+        <w:rPr>
+          <w:color w:val="0070C0"/>
+        </w:rPr>
+      </w:pPr>
+      <w:r>
+        <w:rPr>
+          <w:color w:val="0070C0"/>
+        </w:rPr>
+        <w:t>Corrected description of film formation</w:t>
+      </w:r>
+      <w:r>
+        <w:rPr>
+          <w:color w:val="0070C0"/>
+        </w:rPr>
+        <w:t>.</w:t>
+      </w:r>
+    </w:p>
+    <w:p>
+      <w:pPr>
+        <w:numPr>
+          <w:ilvl w:val="0"/>
+          <w:numId w:val="10"/>
         </w:numPr>
         <w:rPr>
           <w:color w:val="E97132" w:themeColor="accent2"/>
@@ -790,100 +1792,53 @@
         <w:rPr>
           <w:color w:val="E97132" w:themeColor="accent2"/>
         </w:rPr>
-        <w:t>Add further detail about the state of the art in EHL modelling (see further corrections form Amir)</w:t>
-      </w:r>
+        <w:t xml:space="preserve">Was temperature effect on lubricant viscosity accounted for? </w:t>
+      </w:r>
+      <w:proofErr w:type="gramStart"/>
       <w:r>
         <w:rPr>
           <w:color w:val="E97132" w:themeColor="accent2"/>
         </w:rPr>
-        <w:t xml:space="preserve">. </w:t>
-      </w:r>
+        <w:t>Also</w:t>
+      </w:r>
+      <w:proofErr w:type="gramEnd"/>
       <w:r>
         <w:rPr>
           <w:color w:val="E97132" w:themeColor="accent2"/>
         </w:rPr>
-        <w:t>Experimental EHD studies</w:t>
-      </w:r>
-      <w:r>
+        <w:t xml:space="preserve"> inlet shear heating?</w:t>
+      </w:r>
+    </w:p>
+    <w:p>
+      <w:pPr>
+        <w:numPr>
+          <w:ilvl w:val="0"/>
+          <w:numId w:val="10"/>
+        </w:numPr>
         <w:rPr>
           <w:color w:val="E97132" w:themeColor="accent2"/>
         </w:rPr>
-        <w:t xml:space="preserve">, </w:t>
-      </w:r>
+      </w:pPr>
       <w:r>
         <w:rPr>
           <w:color w:val="E97132" w:themeColor="accent2"/>
         </w:rPr>
-        <w:t>Gupta inlet heating correction factor</w:t>
-      </w:r>
+        <w:t xml:space="preserve">This is a lot of effort to calculate bearing EHD film thickness. But did </w:t>
+      </w:r>
+      <w:proofErr w:type="spellStart"/>
       <w:r>
         <w:rPr>
           <w:color w:val="E97132" w:themeColor="accent2"/>
         </w:rPr>
-        <w:t xml:space="preserve">, </w:t>
-      </w:r>
+        <w:t>you</w:t>
+      </w:r>
+      <w:proofErr w:type="spellEnd"/>
       <w:r>
         <w:rPr>
           <w:color w:val="E97132" w:themeColor="accent2"/>
         </w:rPr>
-        <w:t>CFD models?</w:t>
-      </w:r>
-    </w:p>
-    <w:p>
-      <w:pPr>
-        <w:numPr>
-          <w:ilvl w:val="0"/>
-          <w:numId w:val="4"/>
-        </w:numPr>
-      </w:pPr>
-      <w:r>
-        <w:t xml:space="preserve">At the end of Lit Survey, add a section to clarify how this Lit Survey justifies the need for your work i.e. what you hope the work will be able to </w:t>
-      </w:r>
-      <w:proofErr w:type="spellStart"/>
-      <w:r>
-        <w:t>tel</w:t>
-      </w:r>
-      <w:proofErr w:type="spellEnd"/>
-      <w:r>
-        <w:t xml:space="preserve"> us that we do not know </w:t>
-      </w:r>
-      <w:proofErr w:type="gramStart"/>
-      <w:r>
-        <w:t>already ?</w:t>
-      </w:r>
-      <w:proofErr w:type="gramEnd"/>
-      <w:r>
-        <w:t xml:space="preserve"> What is the evidence that your approach is needed and can make a valid contribution? Why do we need </w:t>
-      </w:r>
-      <w:proofErr w:type="spellStart"/>
-      <w:r>
-        <w:t>tribo</w:t>
-      </w:r>
-      <w:proofErr w:type="spellEnd"/>
-      <w:r>
-        <w:t xml:space="preserve"> dynamic multi body analysis (</w:t>
-      </w:r>
-      <w:proofErr w:type="spellStart"/>
-      <w:r>
-        <w:t>inc</w:t>
-      </w:r>
-      <w:proofErr w:type="spellEnd"/>
-      <w:r>
-        <w:t xml:space="preserve"> effect so EHD films) and why do we need ANNs to be able to study these bearings better than we can with existing tools?</w:t>
-      </w:r>
-    </w:p>
-    <w:p>
-      <w:pPr>
-        <w:pStyle w:val="Heading2"/>
-      </w:pPr>
-      <w:r>
-        <w:t xml:space="preserve">Chapter 3 - Experimental </w:t>
-      </w:r>
-      <w:proofErr w:type="spellStart"/>
-      <w:r>
-        <w:t>Tribodynamics</w:t>
-      </w:r>
-      <w:proofErr w:type="spellEnd"/>
+        <w:t xml:space="preserve"> account for other potentially important effects such as inlet shear heating? How much do these predictions differ from a standard EHD regression equation approach using thermal correction such as that of Gupta, say? Please discuss and clarify this.</w:t>
+      </w:r>
     </w:p>
     <w:p>
       <w:pPr>
@@ -899,51 +1854,108 @@
         <w:rPr>
           <w:color w:val="4EA72E" w:themeColor="accent6"/>
         </w:rPr>
-        <w:t xml:space="preserve">Add bearing NDM value from experimental test. </w:t>
-      </w:r>
-      <w:r>
-        <w:rPr>
-          <w:color w:val="4EA72E" w:themeColor="accent6"/>
-        </w:rPr>
-        <w:t xml:space="preserve">so ~30mm Dm, which gives </w:t>
-      </w:r>
-      <w:proofErr w:type="spellStart"/>
-      <w:r>
-        <w:rPr>
-          <w:color w:val="4EA72E" w:themeColor="accent6"/>
-        </w:rPr>
-        <w:t>NDm</w:t>
-      </w:r>
-      <w:proofErr w:type="spellEnd"/>
-      <w:r>
-        <w:rPr>
-          <w:color w:val="4EA72E" w:themeColor="accent6"/>
-        </w:rPr>
-        <w:t xml:space="preserve"> ~450k. This is not usually considered as </w:t>
-      </w:r>
-      <w:proofErr w:type="gramStart"/>
-      <w:r>
-        <w:rPr>
-          <w:color w:val="4EA72E" w:themeColor="accent6"/>
-        </w:rPr>
-        <w:t>high speed</w:t>
-      </w:r>
-      <w:proofErr w:type="gramEnd"/>
-      <w:r>
-        <w:rPr>
-          <w:color w:val="4EA72E" w:themeColor="accent6"/>
-        </w:rPr>
-        <w:t xml:space="preserve"> bearing. </w:t>
-      </w:r>
-      <w:r>
-        <w:rPr>
-          <w:color w:val="4EA72E" w:themeColor="accent6"/>
-        </w:rPr>
-        <w:t>Discuss what is considered high-speed in relation to automotive</w:t>
-      </w:r>
-      <w:r>
-        <w:rPr>
-          <w:color w:val="4EA72E" w:themeColor="accent6"/>
+        <w:t>Improve description of figure 3.13</w:t>
+      </w:r>
+    </w:p>
+    <w:p>
+      <w:pPr>
+        <w:numPr>
+          <w:ilvl w:val="1"/>
+          <w:numId w:val="10"/>
+        </w:numPr>
+        <w:rPr>
+          <w:color w:val="0070C0"/>
+        </w:rPr>
+      </w:pPr>
+      <w:r>
+        <w:rPr>
+          <w:color w:val="0070C0"/>
+        </w:rPr>
+        <w:t>Contact oscillation and change of regime explained in the text as discussed in the viva.</w:t>
+      </w:r>
+    </w:p>
+    <w:p>
+      <w:pPr>
+        <w:numPr>
+          <w:ilvl w:val="0"/>
+          <w:numId w:val="10"/>
+        </w:numPr>
+        <w:rPr>
+          <w:color w:val="4EA72E" w:themeColor="accent6"/>
+        </w:rPr>
+      </w:pPr>
+      <w:r>
+        <w:rPr>
+          <w:color w:val="4EA72E" w:themeColor="accent6"/>
+        </w:rPr>
+        <w:t>Explain differences in Figure 3.16 better</w:t>
+      </w:r>
+    </w:p>
+    <w:p>
+      <w:pPr>
+        <w:numPr>
+          <w:ilvl w:val="1"/>
+          <w:numId w:val="10"/>
+        </w:numPr>
+        <w:rPr>
+          <w:color w:val="0070C0"/>
+        </w:rPr>
+      </w:pPr>
+      <w:r>
+        <w:rPr>
+          <w:color w:val="0070C0"/>
+        </w:rPr>
+        <w:t>Added reference to film acting as interference wedge at the start of section and made the description clearer to reflect what was discussed in the viva.</w:t>
+      </w:r>
+    </w:p>
+    <w:p>
+      <w:pPr>
+        <w:numPr>
+          <w:ilvl w:val="0"/>
+          <w:numId w:val="10"/>
+        </w:numPr>
+        <w:rPr>
+          <w:color w:val="4EA72E" w:themeColor="accent6"/>
+        </w:rPr>
+      </w:pPr>
+      <w:r>
+        <w:rPr>
+          <w:color w:val="4EA72E" w:themeColor="accent6"/>
+        </w:rPr>
+        <w:t>What is the accuracy of the displacement measurements</w:t>
+      </w:r>
+    </w:p>
+    <w:p>
+      <w:pPr>
+        <w:numPr>
+          <w:ilvl w:val="1"/>
+          <w:numId w:val="10"/>
+        </w:numPr>
+        <w:rPr>
+          <w:color w:val="0070C0"/>
+        </w:rPr>
+      </w:pPr>
+      <w:r>
+        <w:rPr>
+          <w:color w:val="0070C0"/>
+        </w:rPr>
+        <w:t xml:space="preserve">Added specifications to 3.2.5 </w:t>
+      </w:r>
+      <w:r>
+        <w:rPr>
+          <w:color w:val="0070C0"/>
+        </w:rPr>
+        <w:t>–</w:t>
+      </w:r>
+      <w:r>
+        <w:rPr>
+          <w:color w:val="0070C0"/>
+        </w:rPr>
+        <w:t xml:space="preserve"> Instrumentation</w:t>
+      </w:r>
+      <w:r>
+        <w:rPr>
+          <w:color w:val="0070C0"/>
         </w:rPr>
         <w:t>.</w:t>
       </w:r>
@@ -951,52 +1963,35 @@
     <w:p>
       <w:pPr>
         <w:numPr>
-          <w:ilvl w:val="1"/>
+          <w:ilvl w:val="0"/>
           <w:numId w:val="10"/>
         </w:numPr>
         <w:rPr>
-          <w:color w:val="0070C0"/>
-        </w:rPr>
-      </w:pPr>
-      <w:r>
-        <w:rPr>
-          <w:color w:val="0070C0"/>
-        </w:rPr>
-        <w:t>Discussion on what is considered high-speed is now included in new section 2.1.3 in literature review</w:t>
-      </w:r>
-      <w:r>
-        <w:rPr>
-          <w:color w:val="0070C0"/>
-        </w:rPr>
-        <w:t xml:space="preserve">. </w:t>
-      </w:r>
-      <w:proofErr w:type="spellStart"/>
-      <w:r>
-        <w:rPr>
-          <w:color w:val="0070C0"/>
-        </w:rPr>
-        <w:t>nDm</w:t>
-      </w:r>
-      <w:proofErr w:type="spellEnd"/>
-      <w:r>
-        <w:rPr>
-          <w:color w:val="0070C0"/>
-        </w:rPr>
-        <w:t xml:space="preserve"> here is 578k since Dm is 38.5. Classified as high-speed (&lt;500k) as discussed in new </w:t>
-      </w:r>
-      <w:proofErr w:type="spellStart"/>
-      <w:r>
-        <w:rPr>
-          <w:color w:val="0070C0"/>
-        </w:rPr>
-        <w:t>nDm</w:t>
-      </w:r>
-      <w:proofErr w:type="spellEnd"/>
-      <w:r>
-        <w:rPr>
-          <w:color w:val="0070C0"/>
-        </w:rPr>
-        <w:t xml:space="preserve"> section</w:t>
+          <w:color w:val="4EA72E" w:themeColor="accent6"/>
+        </w:rPr>
+      </w:pPr>
+      <w:r>
+        <w:rPr>
+          <w:color w:val="4EA72E" w:themeColor="accent6"/>
+        </w:rPr>
+        <w:t>Add some detail to Fig 3.1 to indicate what are the input parameters to the 'Experimental Test'.</w:t>
+      </w:r>
+    </w:p>
+    <w:p>
+      <w:pPr>
+        <w:numPr>
+          <w:ilvl w:val="1"/>
+          <w:numId w:val="10"/>
+        </w:numPr>
+        <w:rPr>
+          <w:color w:val="0070C0"/>
+        </w:rPr>
+      </w:pPr>
+      <w:r>
+        <w:rPr>
+          <w:color w:val="0070C0"/>
+        </w:rPr>
+        <w:t>More comprehensive flowchart added, which more closely links to the subsections</w:t>
       </w:r>
       <w:r>
         <w:rPr>
@@ -1011,16 +2006,9 @@
           <w:ilvl w:val="0"/>
           <w:numId w:val="10"/>
         </w:numPr>
-        <w:rPr>
-          <w:color w:val="4EA72E" w:themeColor="accent6"/>
-        </w:rPr>
-      </w:pPr>
-      <w:r>
-        <w:rPr>
-          <w:color w:val="4EA72E" w:themeColor="accent6"/>
-        </w:rPr>
-        <w:lastRenderedPageBreak/>
-        <w:t>What pressures in experimental test</w:t>
+      </w:pPr>
+      <w:r>
+        <w:t>Section 3.1/3.2 - add further justification for this methodology e.g. similar previous work, how is yours different, how will it enable the novelty etc.</w:t>
       </w:r>
     </w:p>
     <w:p>
@@ -1029,375 +2017,9 @@
           <w:ilvl w:val="1"/>
           <w:numId w:val="10"/>
         </w:numPr>
-        <w:rPr>
-          <w:color w:val="0070C0"/>
-        </w:rPr>
-      </w:pPr>
-      <w:r>
-        <w:rPr>
-          <w:color w:val="0070C0"/>
-        </w:rPr>
-        <w:t>Contact pressures are presented in the results section and vary depending on dynamic response of rig (</w:t>
-      </w:r>
-      <w:proofErr w:type="spellStart"/>
-      <w:r>
-        <w:rPr>
-          <w:color w:val="0070C0"/>
-        </w:rPr>
-        <w:t>eg.</w:t>
-      </w:r>
-      <w:proofErr w:type="spellEnd"/>
-      <w:r>
-        <w:rPr>
-          <w:color w:val="0070C0"/>
-        </w:rPr>
-        <w:t xml:space="preserve"> resonance). A single nominal value would not be representative here.</w:t>
-      </w:r>
-    </w:p>
-    <w:p>
-      <w:pPr>
-        <w:numPr>
-          <w:ilvl w:val="0"/>
-          <w:numId w:val="10"/>
-        </w:numPr>
-      </w:pPr>
-      <w:r>
-        <w:t xml:space="preserve">How necessary is the iteration scheme here given the minimal impact of load on film? How does </w:t>
-      </w:r>
-      <w:proofErr w:type="gramStart"/>
-      <w:r>
-        <w:t>ignoring  this</w:t>
-      </w:r>
-      <w:proofErr w:type="gramEnd"/>
-      <w:r>
-        <w:t xml:space="preserve"> compare to other sources of error, for example accuracy of your location measurements? Add a short discussion with some values to </w:t>
-      </w:r>
-      <w:proofErr w:type="gramStart"/>
-      <w:r>
-        <w:t>illustrate  sensitivity</w:t>
-      </w:r>
-      <w:proofErr w:type="gramEnd"/>
-      <w:r>
-        <w:t xml:space="preserve"> of solution(s) to this if possible</w:t>
-      </w:r>
-    </w:p>
-    <w:p>
-      <w:pPr>
-        <w:numPr>
-          <w:ilvl w:val="0"/>
-          <w:numId w:val="10"/>
-        </w:numPr>
-        <w:rPr>
-          <w:color w:val="4EA72E" w:themeColor="accent6"/>
-        </w:rPr>
-      </w:pPr>
-      <w:r>
-        <w:rPr>
-          <w:color w:val="4EA72E" w:themeColor="accent6"/>
-        </w:rPr>
-        <w:t>Clarify if rig was built by candidate</w:t>
-      </w:r>
-    </w:p>
-    <w:p>
-      <w:pPr>
-        <w:numPr>
-          <w:ilvl w:val="1"/>
-          <w:numId w:val="10"/>
-        </w:numPr>
-        <w:rPr>
-          <w:color w:val="0070C0"/>
-        </w:rPr>
-      </w:pPr>
-      <w:r>
-        <w:rPr>
-          <w:color w:val="0070C0"/>
-        </w:rPr>
-        <w:t>Added to footnotes</w:t>
-      </w:r>
-    </w:p>
-    <w:p>
-      <w:pPr>
-        <w:numPr>
-          <w:ilvl w:val="0"/>
-          <w:numId w:val="10"/>
-        </w:numPr>
-        <w:rPr>
-          <w:color w:val="000000" w:themeColor="text1"/>
-        </w:rPr>
-      </w:pPr>
-      <w:r>
-        <w:rPr>
-          <w:color w:val="000000" w:themeColor="text1"/>
-        </w:rPr>
-        <w:t xml:space="preserve">What acceleration is this from 0-15000rpm in 4s? Was this accounted for in the EHL film predictions? What entrainment speed? Are there inlet shear heating effects? You go through a lot of trouble to describe the 1D Reynolds </w:t>
-      </w:r>
-      <w:proofErr w:type="gramStart"/>
-      <w:r>
-        <w:rPr>
-          <w:color w:val="000000" w:themeColor="text1"/>
-        </w:rPr>
-        <w:t>solver</w:t>
-      </w:r>
-      <w:proofErr w:type="gramEnd"/>
-      <w:r>
-        <w:rPr>
-          <w:color w:val="000000" w:themeColor="text1"/>
-        </w:rPr>
-        <w:t xml:space="preserve"> but these other factors may be just as (or even more) important. Add brief discussion.</w:t>
-      </w:r>
-    </w:p>
-    <w:p>
-      <w:pPr>
-        <w:numPr>
-          <w:ilvl w:val="0"/>
-          <w:numId w:val="10"/>
-        </w:numPr>
-        <w:rPr>
-          <w:color w:val="4EA72E" w:themeColor="accent6"/>
-        </w:rPr>
-      </w:pPr>
-      <w:r>
-        <w:rPr>
-          <w:color w:val="4EA72E" w:themeColor="accent6"/>
-        </w:rPr>
-        <w:t>Film is determined by inlet conditions where pressures are much lower than in the contact, in 10s MPa. Correct this to make clear (sec 3.3.3)</w:t>
-      </w:r>
-    </w:p>
-    <w:p>
-      <w:pPr>
-        <w:numPr>
-          <w:ilvl w:val="1"/>
-          <w:numId w:val="10"/>
-        </w:numPr>
-        <w:rPr>
-          <w:color w:val="0070C0"/>
-        </w:rPr>
-      </w:pPr>
-      <w:r>
-        <w:rPr>
-          <w:color w:val="0070C0"/>
-        </w:rPr>
-        <w:t>Corrected description of film formation</w:t>
-      </w:r>
-    </w:p>
-    <w:p>
-      <w:pPr>
-        <w:numPr>
-          <w:ilvl w:val="0"/>
-          <w:numId w:val="10"/>
-        </w:numPr>
-        <w:rPr>
-          <w:color w:val="E97132" w:themeColor="accent2"/>
-        </w:rPr>
-      </w:pPr>
-      <w:r>
-        <w:rPr>
-          <w:color w:val="E97132" w:themeColor="accent2"/>
-        </w:rPr>
-        <w:t xml:space="preserve">Was temperature effect on lubricant viscosity accounted for? </w:t>
-      </w:r>
-      <w:proofErr w:type="gramStart"/>
-      <w:r>
-        <w:rPr>
-          <w:color w:val="E97132" w:themeColor="accent2"/>
-        </w:rPr>
-        <w:t>Also</w:t>
-      </w:r>
-      <w:proofErr w:type="gramEnd"/>
-      <w:r>
-        <w:rPr>
-          <w:color w:val="E97132" w:themeColor="accent2"/>
-        </w:rPr>
-        <w:t xml:space="preserve"> inlet shear heating?</w:t>
-      </w:r>
-    </w:p>
-    <w:p>
-      <w:pPr>
-        <w:numPr>
-          <w:ilvl w:val="0"/>
-          <w:numId w:val="10"/>
-        </w:numPr>
-        <w:rPr>
-          <w:color w:val="E97132" w:themeColor="accent2"/>
-        </w:rPr>
-      </w:pPr>
-      <w:r>
-        <w:rPr>
-          <w:color w:val="E97132" w:themeColor="accent2"/>
-        </w:rPr>
-        <w:t xml:space="preserve">This is a lot of effort to calculate bearing EHD film thickness. But did </w:t>
-      </w:r>
-      <w:proofErr w:type="spellStart"/>
-      <w:r>
-        <w:rPr>
-          <w:color w:val="E97132" w:themeColor="accent2"/>
-        </w:rPr>
-        <w:t>you</w:t>
-      </w:r>
-      <w:proofErr w:type="spellEnd"/>
-      <w:r>
-        <w:rPr>
-          <w:color w:val="E97132" w:themeColor="accent2"/>
-        </w:rPr>
-        <w:t xml:space="preserve"> account for other potentially important effects such as inlet shear heating? How much do these predictions differ from a standard EHD regression equation approach using thermal correction such as that of Gupta, say? Please discuss and clarify this.</w:t>
-      </w:r>
-    </w:p>
-    <w:p>
-      <w:pPr>
-        <w:numPr>
-          <w:ilvl w:val="0"/>
-          <w:numId w:val="10"/>
-        </w:numPr>
-        <w:rPr>
-          <w:color w:val="4EA72E" w:themeColor="accent6"/>
-        </w:rPr>
-      </w:pPr>
-      <w:r>
-        <w:rPr>
-          <w:color w:val="4EA72E" w:themeColor="accent6"/>
-        </w:rPr>
-        <w:t>Improve description of figure 3.13</w:t>
-      </w:r>
-    </w:p>
-    <w:p>
-      <w:pPr>
-        <w:numPr>
-          <w:ilvl w:val="1"/>
-          <w:numId w:val="10"/>
-        </w:numPr>
-        <w:rPr>
-          <w:color w:val="0070C0"/>
-        </w:rPr>
-      </w:pPr>
-      <w:r>
-        <w:rPr>
-          <w:color w:val="0070C0"/>
-        </w:rPr>
-        <w:t>Contact oscillation and change of regime explained in the text as discussed in the viva.</w:t>
-      </w:r>
-    </w:p>
-    <w:p>
-      <w:pPr>
-        <w:numPr>
-          <w:ilvl w:val="0"/>
-          <w:numId w:val="10"/>
-        </w:numPr>
-        <w:rPr>
-          <w:color w:val="4EA72E" w:themeColor="accent6"/>
-        </w:rPr>
-      </w:pPr>
-      <w:r>
-        <w:rPr>
-          <w:color w:val="4EA72E" w:themeColor="accent6"/>
-        </w:rPr>
-        <w:t>Explain differences in Figure 3.16 better</w:t>
-      </w:r>
-    </w:p>
-    <w:p>
-      <w:pPr>
-        <w:numPr>
-          <w:ilvl w:val="1"/>
-          <w:numId w:val="10"/>
-        </w:numPr>
-        <w:rPr>
-          <w:color w:val="0070C0"/>
-        </w:rPr>
-      </w:pPr>
-      <w:r>
-        <w:rPr>
-          <w:color w:val="0070C0"/>
-        </w:rPr>
-        <w:t>Added reference to film acting as interference wedge at the start of section and made the description clearer to reflect what was discussed in the viva.</w:t>
-      </w:r>
-    </w:p>
-    <w:p>
-      <w:pPr>
-        <w:numPr>
-          <w:ilvl w:val="0"/>
-          <w:numId w:val="10"/>
-        </w:numPr>
-        <w:rPr>
-          <w:color w:val="4EA72E" w:themeColor="accent6"/>
-        </w:rPr>
-      </w:pPr>
-      <w:r>
-        <w:rPr>
-          <w:color w:val="4EA72E" w:themeColor="accent6"/>
-        </w:rPr>
-        <w:t>What is the accuracy of the displacement measurements</w:t>
-      </w:r>
-    </w:p>
-    <w:p>
-      <w:pPr>
-        <w:numPr>
-          <w:ilvl w:val="1"/>
-          <w:numId w:val="10"/>
-        </w:numPr>
-        <w:rPr>
-          <w:color w:val="0070C0"/>
-        </w:rPr>
-      </w:pPr>
-      <w:r>
-        <w:rPr>
-          <w:color w:val="0070C0"/>
-        </w:rPr>
-        <w:t>Added specifications to 3.2.5 - Instrumentation</w:t>
-      </w:r>
-    </w:p>
-    <w:p>
-      <w:pPr>
-        <w:numPr>
-          <w:ilvl w:val="0"/>
-          <w:numId w:val="10"/>
-        </w:numPr>
-        <w:rPr>
-          <w:color w:val="4EA72E" w:themeColor="accent6"/>
-        </w:rPr>
-      </w:pPr>
-      <w:r>
-        <w:rPr>
-          <w:color w:val="4EA72E" w:themeColor="accent6"/>
-        </w:rPr>
-        <w:t>Add some detail to Fig 3.1 to indicate what are the input parameters to the 'Experimental Test'.</w:t>
-      </w:r>
-    </w:p>
-    <w:p>
-      <w:pPr>
-        <w:numPr>
-          <w:ilvl w:val="1"/>
-          <w:numId w:val="10"/>
-        </w:numPr>
-        <w:rPr>
-          <w:color w:val="0070C0"/>
-        </w:rPr>
-      </w:pPr>
-      <w:r>
-        <w:rPr>
-          <w:color w:val="0070C0"/>
-        </w:rPr>
-        <w:t>More comprehensive flowchart added, which more closely links to the subsections</w:t>
-      </w:r>
-    </w:p>
-    <w:p>
-      <w:pPr>
-        <w:numPr>
-          <w:ilvl w:val="0"/>
-          <w:numId w:val="10"/>
-        </w:numPr>
-      </w:pPr>
-      <w:r>
-        <w:t>Section 3.1/3.2 - add further justification for this methodology e.g. similar previous work, how is yours different, how will it enable the novelty etc.</w:t>
-      </w:r>
-    </w:p>
-    <w:p>
-      <w:pPr>
-        <w:numPr>
-          <w:ilvl w:val="1"/>
-          <w:numId w:val="10"/>
-        </w:numPr>
-      </w:pPr>
-      <w:r>
-        <w:t>Not directly stated, but the design intent of the rig was to continue with validation. The designs and technical drawings for the adaptations were done in the scope of the PhD, but did not materialize due to lab access during Covid and moving to AVL.</w:t>
+      </w:pPr>
+      <w:r>
+        <w:t>Add chapter contributions section</w:t>
       </w:r>
     </w:p>
     <w:p>
@@ -1475,31 +2097,1011 @@
           <w:ilvl w:val="0"/>
           <w:numId w:val="10"/>
         </w:numPr>
-      </w:pPr>
-      <w:r>
-        <w:t xml:space="preserve">Elaborate on </w:t>
+        <w:rPr>
+          <w:color w:val="4EA72E" w:themeColor="accent6"/>
+        </w:rPr>
+      </w:pPr>
+      <w:r>
+        <w:rPr>
+          <w:color w:val="4EA72E" w:themeColor="accent6"/>
+        </w:rPr>
+        <w:t>This gives good justification to the need for your work ... Such a big increase in bearing load would result in a massive reduction in bearing life, right?  But we do not account for it in bearing life calculations. Should we? Or is this specific to conditions and assumptions here? Discuss either way.</w:t>
+      </w:r>
+    </w:p>
+    <w:p>
+      <w:pPr>
+        <w:numPr>
+          <w:ilvl w:val="1"/>
+          <w:numId w:val="10"/>
+        </w:numPr>
+        <w:rPr>
+          <w:color w:val="0070C0"/>
+        </w:rPr>
+      </w:pPr>
+      <w:r>
+        <w:rPr>
+          <w:color w:val="0070C0"/>
+        </w:rPr>
+        <w:t xml:space="preserve">Added the significance of the finding and the non-conservative estimate used by lifetime models for lightly loaded bearings at high-speed. </w:t>
+      </w:r>
+    </w:p>
+    <w:p>
+      <w:pPr>
+        <w:pStyle w:val="Heading2"/>
+      </w:pPr>
+      <w:r>
+        <w:t>Chapter 4 – FMBD Modelling</w:t>
+      </w:r>
+    </w:p>
+    <w:p>
+      <w:pPr>
+        <w:numPr>
+          <w:ilvl w:val="0"/>
+          <w:numId w:val="6"/>
+        </w:numPr>
+        <w:rPr>
+          <w:color w:val="4EA72E" w:themeColor="accent6"/>
+        </w:rPr>
+      </w:pPr>
+      <w:r>
+        <w:rPr>
+          <w:color w:val="4EA72E" w:themeColor="accent6"/>
+        </w:rPr>
+        <w:t>Make it clear where you are describing the development of the model, which sections are your own creation, which are adapted from others, which is the same as others (as appropriate).</w:t>
+      </w:r>
+    </w:p>
+    <w:p>
+      <w:pPr>
+        <w:numPr>
+          <w:ilvl w:val="1"/>
+          <w:numId w:val="6"/>
+        </w:numPr>
+        <w:rPr>
+          <w:color w:val="0070C0"/>
+        </w:rPr>
+      </w:pPr>
+      <w:r>
+        <w:rPr>
+          <w:color w:val="0070C0"/>
+        </w:rPr>
+        <w:t>Partially highlighted</w:t>
+      </w:r>
+      <w:r>
+        <w:rPr>
+          <w:color w:val="0070C0"/>
+        </w:rPr>
+        <w:t xml:space="preserve"> in the Chapter Contributions section</w:t>
+      </w:r>
+      <w:r>
+        <w:rPr>
+          <w:color w:val="0070C0"/>
+        </w:rPr>
+        <w:t>, with additional note</w:t>
+      </w:r>
+      <w:r>
+        <w:rPr>
+          <w:color w:val="0070C0"/>
+        </w:rPr>
+        <w:t>s</w:t>
+      </w:r>
+      <w:r>
+        <w:rPr>
+          <w:color w:val="0070C0"/>
+        </w:rPr>
+        <w:t xml:space="preserve"> that the system level model was developed and</w:t>
+      </w:r>
+      <w:r>
+        <w:rPr>
+          <w:color w:val="0070C0"/>
+        </w:rPr>
+        <w:t xml:space="preserve"> system of equations</w:t>
+      </w:r>
+      <w:r>
+        <w:rPr>
+          <w:color w:val="0070C0"/>
+        </w:rPr>
+        <w:t xml:space="preserve"> solved in AVL EXCITE Power Unit.</w:t>
+      </w:r>
+    </w:p>
+    <w:p>
+      <w:pPr>
+        <w:numPr>
+          <w:ilvl w:val="0"/>
+          <w:numId w:val="6"/>
+        </w:numPr>
+        <w:rPr>
+          <w:color w:val="4EA72E" w:themeColor="accent6"/>
+        </w:rPr>
+      </w:pPr>
+      <w:r>
+        <w:rPr>
+          <w:color w:val="4EA72E" w:themeColor="accent6"/>
+        </w:rPr>
+        <w:t>How much of your input is needed to model this using this ready-made software? Is the contribution here the link between your component level model and this system level software? Please clarify</w:t>
+      </w:r>
+    </w:p>
+    <w:p>
+      <w:pPr>
+        <w:numPr>
+          <w:ilvl w:val="1"/>
+          <w:numId w:val="6"/>
+        </w:numPr>
+        <w:rPr>
+          <w:color w:val="0070C0"/>
+        </w:rPr>
+      </w:pPr>
+      <w:r>
+        <w:rPr>
+          <w:color w:val="0070C0"/>
+        </w:rPr>
+        <w:t>Now highlighted in the Chapter Contributions section and in the descriptions of the methodology as addressed in point 1.</w:t>
+      </w:r>
+    </w:p>
+    <w:p>
+      <w:pPr>
+        <w:numPr>
+          <w:ilvl w:val="0"/>
+          <w:numId w:val="6"/>
+        </w:numPr>
+        <w:rPr>
+          <w:color w:val="4EA72E" w:themeColor="accent6"/>
+        </w:rPr>
+      </w:pPr>
+      <w:r>
+        <w:rPr>
+          <w:color w:val="4EA72E" w:themeColor="accent6"/>
+        </w:rPr>
+        <w:t xml:space="preserve">So essentially this allows you to plug in your bearing model from Chapter 3 into this system level software, right? This is OK but please clarify the novelty in this part of the work (co-simulation). This could be the </w:t>
+      </w:r>
+      <w:proofErr w:type="gramStart"/>
+      <w:r>
+        <w:rPr>
+          <w:color w:val="4EA72E" w:themeColor="accent6"/>
+        </w:rPr>
+        <w:t>implementation</w:t>
+      </w:r>
+      <w:proofErr w:type="gramEnd"/>
+      <w:r>
+        <w:rPr>
+          <w:color w:val="4EA72E" w:themeColor="accent6"/>
+        </w:rPr>
+        <w:t xml:space="preserve"> or the results as discussed.</w:t>
+      </w:r>
+    </w:p>
+    <w:p>
+      <w:pPr>
+        <w:numPr>
+          <w:ilvl w:val="1"/>
+          <w:numId w:val="6"/>
+        </w:numPr>
+        <w:rPr>
+          <w:color w:val="0070C0"/>
+        </w:rPr>
+      </w:pPr>
+      <w:r>
+        <w:rPr>
+          <w:color w:val="0070C0"/>
+        </w:rPr>
+        <w:t>As above.</w:t>
+      </w:r>
+    </w:p>
+    <w:p>
+      <w:pPr>
+        <w:numPr>
+          <w:ilvl w:val="0"/>
+          <w:numId w:val="6"/>
+        </w:numPr>
+        <w:rPr>
+          <w:color w:val="4EA72E" w:themeColor="accent6"/>
+        </w:rPr>
+      </w:pPr>
+      <w:r>
+        <w:rPr>
+          <w:color w:val="4EA72E" w:themeColor="accent6"/>
+        </w:rPr>
+        <w:t>How is the dynamic response of gears pair (and the motor itself) modelled here? Briefly explain</w:t>
+      </w:r>
+    </w:p>
+    <w:p>
+      <w:pPr>
+        <w:numPr>
+          <w:ilvl w:val="1"/>
+          <w:numId w:val="6"/>
+        </w:numPr>
+        <w:rPr>
+          <w:color w:val="0070C0"/>
+        </w:rPr>
+      </w:pPr>
+      <w:r>
+        <w:rPr>
+          <w:color w:val="0070C0"/>
+        </w:rPr>
+        <w:t xml:space="preserve">This is already explained in section 4.3.2, including what isn't modelled (flexible bodies in </w:t>
+      </w:r>
+      <w:r>
+        <w:rPr>
+          <w:color w:val="0070C0"/>
+        </w:rPr>
+        <w:t xml:space="preserve">the </w:t>
+      </w:r>
+      <w:r>
+        <w:rPr>
+          <w:color w:val="0070C0"/>
+        </w:rPr>
+        <w:t>representative excitation model and stator tooth forces due to minimal lateral contribution once resolved). Refined description</w:t>
+      </w:r>
+      <w:r>
+        <w:rPr>
+          <w:color w:val="0070C0"/>
+        </w:rPr>
+        <w:t>.</w:t>
+      </w:r>
+    </w:p>
+    <w:p>
+      <w:pPr>
+        <w:numPr>
+          <w:ilvl w:val="0"/>
+          <w:numId w:val="6"/>
+        </w:numPr>
+        <w:rPr>
+          <w:color w:val="4EA72E" w:themeColor="accent6"/>
+        </w:rPr>
+      </w:pPr>
+      <w:r>
+        <w:rPr>
+          <w:color w:val="4EA72E" w:themeColor="accent6"/>
+        </w:rPr>
+        <w:t xml:space="preserve">Can you add a line or two to provide a physical explanation of why the elastic deformation is so much bigger for the lubricated case vs dry given that </w:t>
+      </w:r>
+      <w:proofErr w:type="gramStart"/>
+      <w:r>
+        <w:rPr>
+          <w:color w:val="4EA72E" w:themeColor="accent6"/>
+        </w:rPr>
+        <w:t>externally  applied</w:t>
+      </w:r>
+      <w:proofErr w:type="gramEnd"/>
+      <w:r>
+        <w:rPr>
+          <w:color w:val="4EA72E" w:themeColor="accent6"/>
+        </w:rPr>
+        <w:t xml:space="preserve"> loads are the same? How is the housing modelled here?</w:t>
+      </w:r>
+    </w:p>
+    <w:p>
+      <w:pPr>
+        <w:numPr>
+          <w:ilvl w:val="1"/>
+          <w:numId w:val="6"/>
+        </w:numPr>
+        <w:rPr>
+          <w:color w:val="0070C0"/>
+        </w:rPr>
+      </w:pPr>
+      <w:r>
+        <w:rPr>
+          <w:color w:val="0070C0"/>
+        </w:rPr>
+        <w:lastRenderedPageBreak/>
+        <w:t xml:space="preserve">Explained in paragraph 2 of section 4.4. </w:t>
+      </w:r>
+      <w:r>
+        <w:rPr>
+          <w:color w:val="0070C0"/>
+        </w:rPr>
+        <w:t>This is due to the higher levels of deformation at the contact as the lubricant is entrained, which increases with the shaft rotational velocity. Due to the low operating clearance in the bearing, the film acts as a speed-dependant interference element between the elements and races. This behaviour was experimentally observed by Dietl, concluding that the oil-wedge between the rolling elements and raceways reduces the internal clearance of the bearing and increases its stiffness</w:t>
+      </w:r>
+    </w:p>
+    <w:p>
+      <w:pPr>
+        <w:numPr>
+          <w:ilvl w:val="1"/>
+          <w:numId w:val="6"/>
+        </w:numPr>
+        <w:rPr>
+          <w:color w:val="0070C0"/>
+        </w:rPr>
+      </w:pPr>
+      <w:r>
+        <w:rPr>
+          <w:color w:val="0070C0"/>
+        </w:rPr>
+        <w:t>Housing is modelled as rigid, outlined in the methodology.</w:t>
+      </w:r>
+    </w:p>
+    <w:p>
+      <w:pPr>
+        <w:numPr>
+          <w:ilvl w:val="0"/>
+          <w:numId w:val="6"/>
+        </w:numPr>
+        <w:rPr>
+          <w:color w:val="4EA72E" w:themeColor="accent6"/>
+        </w:rPr>
+      </w:pPr>
+      <w:r>
+        <w:rPr>
+          <w:color w:val="4EA72E" w:themeColor="accent6"/>
+        </w:rPr>
+        <w:t>Relatively small variation. Does this help to show that there is no need to accurately model film dependence on load as mentioned before? Discuss briefly if you think it worthwhile but OK to ignore.</w:t>
+      </w:r>
+    </w:p>
+    <w:p>
+      <w:pPr>
+        <w:numPr>
+          <w:ilvl w:val="1"/>
+          <w:numId w:val="6"/>
+        </w:numPr>
+        <w:rPr>
+          <w:color w:val="0070C0"/>
+        </w:rPr>
+      </w:pPr>
+      <w:r>
+        <w:rPr>
+          <w:color w:val="0070C0"/>
+        </w:rPr>
+        <w:t xml:space="preserve">Covered in </w:t>
+      </w:r>
+      <w:r>
+        <w:rPr>
+          <w:color w:val="0070C0"/>
+        </w:rPr>
+        <w:t xml:space="preserve">previous answer, with amendment to </w:t>
+      </w:r>
+      <w:r>
+        <w:rPr>
+          <w:color w:val="0070C0"/>
+        </w:rPr>
+        <w:t>Chapter 3, section 2.8.8.</w:t>
+      </w:r>
+    </w:p>
+    <w:p>
+      <w:pPr>
+        <w:numPr>
+          <w:ilvl w:val="1"/>
+          <w:numId w:val="6"/>
+        </w:numPr>
+        <w:rPr>
+          <w:color w:val="0070C0"/>
+        </w:rPr>
+      </w:pPr>
+      <w:r>
+        <w:rPr>
+          <w:color w:val="0070C0"/>
+        </w:rPr>
+        <w:t>Moreover, computational methods such as pre-estimation of film thickness to achieve fast film convergence can be employed.</w:t>
+      </w:r>
+    </w:p>
+    <w:p>
+      <w:pPr>
+        <w:numPr>
+          <w:ilvl w:val="0"/>
+          <w:numId w:val="6"/>
+        </w:numPr>
+        <w:rPr>
+          <w:color w:val="4EA72E" w:themeColor="accent6"/>
+        </w:rPr>
+      </w:pPr>
+      <w:r>
+        <w:rPr>
+          <w:color w:val="4EA72E" w:themeColor="accent6"/>
+        </w:rPr>
+        <w:t>Fig 4.6 - text says peak torque is 68 Nm, but graph suggest 80 something.</w:t>
+      </w:r>
+    </w:p>
+    <w:p>
+      <w:pPr>
+        <w:numPr>
+          <w:ilvl w:val="1"/>
+          <w:numId w:val="6"/>
+        </w:numPr>
+        <w:rPr>
+          <w:color w:val="0070C0"/>
+        </w:rPr>
+      </w:pPr>
+      <w:r>
+        <w:rPr>
+          <w:color w:val="0070C0"/>
+        </w:rPr>
+        <w:t>Clarified as maximum average torque delivered by PMSM</w:t>
+      </w:r>
+    </w:p>
+    <w:p>
+      <w:pPr>
+        <w:numPr>
+          <w:ilvl w:val="0"/>
+          <w:numId w:val="6"/>
+        </w:numPr>
+        <w:rPr>
+          <w:color w:val="4EA72E" w:themeColor="accent6"/>
+        </w:rPr>
+      </w:pPr>
+      <w:r>
+        <w:rPr>
+          <w:color w:val="4EA72E" w:themeColor="accent6"/>
+        </w:rPr>
+        <w:t>Table 4.2 - state where these are from.</w:t>
+      </w:r>
+    </w:p>
+    <w:p>
+      <w:pPr>
+        <w:numPr>
+          <w:ilvl w:val="1"/>
+          <w:numId w:val="6"/>
+        </w:numPr>
+        <w:rPr>
+          <w:color w:val="0070C0"/>
+        </w:rPr>
+      </w:pPr>
+      <w:r>
+        <w:rPr>
+          <w:color w:val="0070C0"/>
+        </w:rPr>
+        <w:t>Th</w:t>
+      </w:r>
+      <w:r>
+        <w:rPr>
+          <w:color w:val="0070C0"/>
+        </w:rPr>
+        <w:t>ese correspond to a light transmission oil. The lubricant and rheological parameters were provided by AVL</w:t>
+      </w:r>
+      <w:r>
+        <w:rPr>
+          <w:color w:val="0070C0"/>
+        </w:rPr>
+        <w:t>.</w:t>
+      </w:r>
+    </w:p>
+    <w:p>
+      <w:pPr>
+        <w:numPr>
+          <w:ilvl w:val="0"/>
+          <w:numId w:val="6"/>
+        </w:numPr>
+        <w:rPr>
+          <w:color w:val="4EA72E" w:themeColor="accent6"/>
+        </w:rPr>
+      </w:pPr>
+      <w:r>
+        <w:rPr>
+          <w:color w:val="4EA72E" w:themeColor="accent6"/>
+        </w:rPr>
+        <w:t>Fig 4.11 is pretty much unreadable - have as a full landscape page?</w:t>
+      </w:r>
+    </w:p>
+    <w:p>
+      <w:pPr>
+        <w:numPr>
+          <w:ilvl w:val="1"/>
+          <w:numId w:val="6"/>
+        </w:numPr>
+        <w:rPr>
+          <w:color w:val="0070C0"/>
+        </w:rPr>
+      </w:pPr>
+      <w:r>
+        <w:rPr>
+          <w:color w:val="0070C0"/>
+        </w:rPr>
+        <w:t>Amended</w:t>
+      </w:r>
+      <w:r>
+        <w:rPr>
+          <w:color w:val="0070C0"/>
+        </w:rPr>
+        <w:t xml:space="preserve"> to full landscape page</w:t>
+      </w:r>
+    </w:p>
+    <w:p>
+      <w:pPr>
+        <w:numPr>
+          <w:ilvl w:val="0"/>
+          <w:numId w:val="6"/>
+        </w:numPr>
+      </w:pPr>
+      <w:r>
+        <w:t>Chapter discussion/conclusions - please add some comments about how much your new methods improve the more classical methods.</w:t>
+      </w:r>
+    </w:p>
+    <w:p>
+      <w:pPr>
+        <w:numPr>
+          <w:ilvl w:val="0"/>
+          <w:numId w:val="6"/>
+        </w:numPr>
+        <w:rPr>
+          <w:color w:val="4EA72E" w:themeColor="accent6"/>
+        </w:rPr>
+      </w:pPr>
+      <w:r>
+        <w:rPr>
+          <w:color w:val="4EA72E" w:themeColor="accent6"/>
+        </w:rPr>
+        <w:t>Comment on the significance of the huge increase in contact force.</w:t>
+      </w:r>
+    </w:p>
+    <w:p>
+      <w:pPr>
+        <w:numPr>
+          <w:ilvl w:val="1"/>
+          <w:numId w:val="6"/>
+        </w:numPr>
+        <w:rPr>
+          <w:color w:val="0070C0"/>
+        </w:rPr>
+      </w:pPr>
+      <w:r>
+        <w:rPr>
+          <w:color w:val="0070C0"/>
+        </w:rPr>
+        <w:t xml:space="preserve">Furthermore, underestimation of the contact forces will also lead to a miscalculation of contact pressures, impacting future sub-surface stress and wear analyses for the life predictions of these crucial </w:t>
+      </w:r>
+      <w:proofErr w:type="gramStart"/>
+      <w:r>
+        <w:rPr>
+          <w:color w:val="0070C0"/>
+        </w:rPr>
+        <w:t>critical  machine</w:t>
+      </w:r>
+      <w:proofErr w:type="gramEnd"/>
+      <w:r>
+        <w:rPr>
+          <w:color w:val="0070C0"/>
+        </w:rPr>
+        <w:t xml:space="preserve"> elements.</w:t>
+      </w:r>
+    </w:p>
+    <w:p>
+      <w:pPr>
+        <w:pStyle w:val="Heading2"/>
+      </w:pPr>
+      <w:r>
+        <w:t>Chapter 5 - ANN</w:t>
+      </w:r>
+    </w:p>
+    <w:p>
+      <w:pPr>
+        <w:numPr>
+          <w:ilvl w:val="0"/>
+          <w:numId w:val="11"/>
+        </w:numPr>
+        <w:rPr>
+          <w:color w:val="000000" w:themeColor="text1"/>
+        </w:rPr>
+      </w:pPr>
+      <w:r>
+        <w:rPr>
+          <w:color w:val="000000" w:themeColor="text1"/>
+        </w:rPr>
+        <w:t>Chapter 5 - make it clearer from where the various techniques that you've combined for the ANN method.</w:t>
+      </w:r>
+    </w:p>
+    <w:p>
+      <w:pPr>
+        <w:numPr>
+          <w:ilvl w:val="1"/>
+          <w:numId w:val="11"/>
+        </w:numPr>
+        <w:rPr>
+          <w:color w:val="000000" w:themeColor="text1"/>
+        </w:rPr>
+      </w:pPr>
+      <w:r>
+        <w:rPr>
+          <w:color w:val="000000" w:themeColor="text1"/>
+        </w:rPr>
+        <w:t>Add chapter contributions section</w:t>
+      </w:r>
+    </w:p>
+    <w:p>
+      <w:pPr>
+        <w:numPr>
+          <w:ilvl w:val="0"/>
+          <w:numId w:val="11"/>
+        </w:numPr>
+        <w:rPr>
+          <w:color w:val="000000" w:themeColor="text1"/>
+        </w:rPr>
+      </w:pPr>
+      <w:r>
+        <w:rPr>
+          <w:color w:val="000000" w:themeColor="text1"/>
+        </w:rPr>
+        <w:t>Statements on regression equations not being valid outside of bounds of data used to generate: This is often stated in the thesis but not properly justified with evidence. Is there any evidence that these analytical (regression) equations for EHL are not sufficiently accurate in this context? Including this would help to justify your approach.</w:t>
+      </w:r>
+    </w:p>
+    <w:p>
+      <w:pPr>
+        <w:numPr>
+          <w:ilvl w:val="1"/>
+          <w:numId w:val="11"/>
+        </w:numPr>
+        <w:rPr>
+          <w:color w:val="000000" w:themeColor="text1"/>
+        </w:rPr>
+      </w:pPr>
+      <w:r>
+        <w:rPr>
+          <w:color w:val="000000" w:themeColor="text1"/>
+        </w:rPr>
+        <w:t>This was shown in Chapter</w:t>
+      </w:r>
+    </w:p>
+    <w:p>
+      <w:pPr>
+        <w:numPr>
+          <w:ilvl w:val="1"/>
+          <w:numId w:val="11"/>
+        </w:numPr>
+        <w:rPr>
+          <w:color w:val="000000" w:themeColor="text1"/>
+        </w:rPr>
+      </w:pPr>
+      <w:r>
+        <w:rPr>
+          <w:color w:val="000000" w:themeColor="text1"/>
+        </w:rPr>
+        <w:t>Find a way to answer this to address the below comments</w:t>
+      </w:r>
+      <w:r>
+        <w:rPr>
+          <w:color w:val="000000" w:themeColor="text1"/>
+        </w:rPr>
+        <w:t xml:space="preserve"> </w:t>
+      </w:r>
+    </w:p>
+    <w:p>
+      <w:pPr>
+        <w:numPr>
+          <w:ilvl w:val="0"/>
+          <w:numId w:val="11"/>
+        </w:numPr>
+        <w:rPr>
+          <w:color w:val="E97132" w:themeColor="accent2"/>
+        </w:rPr>
+      </w:pPr>
+      <w:r>
+        <w:rPr>
+          <w:color w:val="E97132" w:themeColor="accent2"/>
+        </w:rPr>
+        <w:lastRenderedPageBreak/>
+        <w:t xml:space="preserve">At these speeds the standard EHD theory is not valid due to inlet shear heating effects but there are several corrections out there (based on experimental data). Did you try to use Gupta correction for example? </w:t>
+      </w:r>
+      <w:proofErr w:type="gramStart"/>
+      <w:r>
+        <w:rPr>
+          <w:color w:val="E97132" w:themeColor="accent2"/>
+        </w:rPr>
+        <w:t>This needs</w:t>
+      </w:r>
+      <w:proofErr w:type="gramEnd"/>
+      <w:r>
+        <w:rPr>
+          <w:color w:val="E97132" w:themeColor="accent2"/>
+        </w:rPr>
+        <w:t xml:space="preserve"> discussing with relevant references (also mentioned above in a previous comment)</w:t>
+      </w:r>
+    </w:p>
+    <w:p>
+      <w:pPr>
+        <w:numPr>
+          <w:ilvl w:val="0"/>
+          <w:numId w:val="11"/>
+        </w:numPr>
+        <w:rPr>
+          <w:color w:val="000000" w:themeColor="text1"/>
+        </w:rPr>
+      </w:pPr>
+      <w:r>
+        <w:rPr>
+          <w:color w:val="000000" w:themeColor="text1"/>
+        </w:rPr>
+        <w:t>Clarify who did what with regards to the ANN section</w:t>
+      </w:r>
+    </w:p>
+    <w:p>
+      <w:pPr>
+        <w:numPr>
+          <w:ilvl w:val="1"/>
+          <w:numId w:val="11"/>
+        </w:numPr>
+        <w:rPr>
+          <w:color w:val="000000" w:themeColor="text1"/>
+        </w:rPr>
+      </w:pPr>
+      <w:r>
+        <w:rPr>
+          <w:color w:val="000000" w:themeColor="text1"/>
+        </w:rPr>
+        <w:t>Add in a footnote</w:t>
+      </w:r>
+    </w:p>
+    <w:p>
+      <w:pPr>
+        <w:numPr>
+          <w:ilvl w:val="0"/>
+          <w:numId w:val="11"/>
+        </w:numPr>
+        <w:rPr>
+          <w:color w:val="000000" w:themeColor="text1"/>
+        </w:rPr>
+      </w:pPr>
+      <w:proofErr w:type="gramStart"/>
+      <w:r>
+        <w:rPr>
+          <w:color w:val="000000" w:themeColor="text1"/>
+        </w:rPr>
+        <w:t>So</w:t>
+      </w:r>
+      <w:proofErr w:type="gramEnd"/>
+      <w:r>
+        <w:rPr>
+          <w:color w:val="000000" w:themeColor="text1"/>
+        </w:rPr>
+        <w:t xml:space="preserve"> if thermal effects are not included in your present solution what is the reason for the observed differences? I would have </w:t>
+      </w:r>
+      <w:proofErr w:type="gramStart"/>
+      <w:r>
+        <w:rPr>
+          <w:color w:val="000000" w:themeColor="text1"/>
+        </w:rPr>
+        <w:t>excepted</w:t>
+      </w:r>
+      <w:proofErr w:type="gramEnd"/>
+      <w:r>
+        <w:rPr>
+          <w:color w:val="000000" w:themeColor="text1"/>
+        </w:rPr>
+        <w:t xml:space="preserve"> this to be the biggest effect.  </w:t>
+      </w:r>
+    </w:p>
+    <w:p>
+      <w:pPr>
+        <w:numPr>
+          <w:ilvl w:val="0"/>
+          <w:numId w:val="11"/>
+        </w:numPr>
+        <w:rPr>
+          <w:color w:val="4EA72E" w:themeColor="accent6"/>
+        </w:rPr>
+      </w:pPr>
+      <w:r>
+        <w:rPr>
+          <w:color w:val="4EA72E" w:themeColor="accent6"/>
+        </w:rPr>
+        <w:t>How did you determine 9 input variables?</w:t>
+      </w:r>
+    </w:p>
+    <w:p>
+      <w:pPr>
+        <w:numPr>
+          <w:ilvl w:val="1"/>
+          <w:numId w:val="11"/>
+        </w:numPr>
+        <w:rPr>
+          <w:color w:val="0070C0"/>
+        </w:rPr>
+      </w:pPr>
+      <w:r>
+        <w:rPr>
+          <w:color w:val="0070C0"/>
+        </w:rPr>
+        <w:t>Required variables for the EHL film thickness calculation.</w:t>
+      </w:r>
+    </w:p>
+    <w:p>
+      <w:pPr>
+        <w:numPr>
+          <w:ilvl w:val="0"/>
+          <w:numId w:val="11"/>
+        </w:numPr>
+        <w:rPr>
+          <w:color w:val="000000" w:themeColor="text1"/>
+        </w:rPr>
+      </w:pPr>
+      <w:r>
+        <w:rPr>
+          <w:color w:val="000000" w:themeColor="text1"/>
+        </w:rPr>
+        <w:t>OK, I can see the value of this (Greenwood boundaries). But how different is the present approach to that in [92]? Please add text to clarify the differences and hence novelty of your work.</w:t>
+      </w:r>
+    </w:p>
+    <w:p>
+      <w:pPr>
+        <w:numPr>
+          <w:ilvl w:val="0"/>
+          <w:numId w:val="11"/>
+        </w:numPr>
+        <w:rPr>
+          <w:color w:val="E97132" w:themeColor="accent2"/>
+        </w:rPr>
+      </w:pPr>
+      <w:r>
+        <w:rPr>
+          <w:color w:val="E97132" w:themeColor="accent2"/>
+        </w:rPr>
+        <w:t>Isothermal valid for high speeds? Comment</w:t>
+      </w:r>
+    </w:p>
+    <w:p>
+      <w:pPr>
+        <w:numPr>
+          <w:ilvl w:val="0"/>
+          <w:numId w:val="11"/>
+        </w:numPr>
+        <w:rPr>
+          <w:color w:val="4EA72E" w:themeColor="accent6"/>
+        </w:rPr>
+      </w:pPr>
+      <w:r>
+        <w:rPr>
+          <w:color w:val="4EA72E" w:themeColor="accent6"/>
+        </w:rPr>
+        <w:t>Why not validate ANN against experiment?</w:t>
+      </w:r>
+    </w:p>
+    <w:p>
+      <w:pPr>
+        <w:numPr>
+          <w:ilvl w:val="1"/>
+          <w:numId w:val="11"/>
+        </w:numPr>
+        <w:rPr>
+          <w:color w:val="0070C0"/>
+        </w:rPr>
+      </w:pPr>
+      <w:r>
+        <w:rPr>
+          <w:color w:val="0070C0"/>
+        </w:rPr>
+        <w:t>The ANN is validated against a data set generated from the numerical EHL model that it has not been used to train it. Validating against experiment is effectively validating the numerical EHL model against the experimental data, since it was not trained on the experimental data.</w:t>
+      </w:r>
+    </w:p>
+    <w:p>
+      <w:pPr>
+        <w:numPr>
+          <w:ilvl w:val="0"/>
+          <w:numId w:val="11"/>
+        </w:numPr>
+        <w:rPr>
+          <w:color w:val="4EA72E" w:themeColor="accent6"/>
+        </w:rPr>
+      </w:pPr>
+      <w:r>
+        <w:rPr>
+          <w:color w:val="4EA72E" w:themeColor="accent6"/>
+        </w:rPr>
+        <w:t xml:space="preserve">Yes, but ideally you should compare model predictions to a completely new set of data available in literature (e.g. Maclaren et al, high speed film thickness data or similar). It </w:t>
+      </w:r>
+      <w:proofErr w:type="gramStart"/>
+      <w:r>
+        <w:rPr>
+          <w:color w:val="4EA72E" w:themeColor="accent6"/>
+        </w:rPr>
+        <w:t>would  have</w:t>
+      </w:r>
+      <w:proofErr w:type="gramEnd"/>
+      <w:r>
+        <w:rPr>
+          <w:color w:val="4EA72E" w:themeColor="accent6"/>
+        </w:rPr>
+        <w:t xml:space="preserve"> been a good addition to this chapter but there is no time for this now, something to think about in the future. The possibility and the value of this should be mentioned though.</w:t>
+      </w:r>
+    </w:p>
+    <w:p>
+      <w:pPr>
+        <w:numPr>
+          <w:ilvl w:val="1"/>
+          <w:numId w:val="11"/>
+        </w:numPr>
+        <w:rPr>
+          <w:color w:val="0070C0"/>
+        </w:rPr>
+      </w:pPr>
+      <w:r>
+        <w:rPr>
+          <w:color w:val="0070C0"/>
+        </w:rPr>
+        <w:t xml:space="preserve">As above, this would not have proven the performance of the trained ANN, rather </w:t>
+      </w:r>
+      <w:r>
+        <w:rPr>
+          <w:color w:val="0070C0"/>
+        </w:rPr>
+        <w:t xml:space="preserve">it would have </w:t>
+      </w:r>
+      <w:r>
+        <w:rPr>
+          <w:color w:val="0070C0"/>
+        </w:rPr>
+        <w:t>compared the numerical EHL model used to train it against the experimental results.</w:t>
+      </w:r>
+    </w:p>
+    <w:p>
+      <w:pPr>
+        <w:numPr>
+          <w:ilvl w:val="1"/>
+          <w:numId w:val="11"/>
+        </w:numPr>
+        <w:rPr>
+          <w:color w:val="0070C0"/>
+        </w:rPr>
+      </w:pPr>
+      <w:r>
+        <w:rPr>
+          <w:color w:val="0070C0"/>
+        </w:rPr>
+        <w:t xml:space="preserve">However, training the ANN using experimental data is valid, and something that would have added strength to the thesis if there was more time and the experimental data was abundant enough to minimise training errors. This has been added to the future </w:t>
+      </w:r>
+      <w:proofErr w:type="gramStart"/>
+      <w:r>
+        <w:rPr>
+          <w:color w:val="0070C0"/>
+        </w:rPr>
+        <w:t>work, and</w:t>
+      </w:r>
+      <w:proofErr w:type="gramEnd"/>
+      <w:r>
+        <w:rPr>
+          <w:color w:val="0070C0"/>
+        </w:rPr>
+        <w:t xml:space="preserve"> forms a large part of the argument why ANNs used in this way can be a powerful tool.</w:t>
+      </w:r>
+    </w:p>
+    <w:p>
+      <w:pPr>
+        <w:numPr>
+          <w:ilvl w:val="0"/>
+          <w:numId w:val="11"/>
+        </w:numPr>
+        <w:rPr>
+          <w:color w:val="000000" w:themeColor="text1"/>
+        </w:rPr>
+      </w:pPr>
+      <w:r>
+        <w:rPr>
+          <w:color w:val="000000" w:themeColor="text1"/>
+        </w:rPr>
+        <w:t xml:space="preserve">Clarify why large </w:t>
       </w:r>
       <w:proofErr w:type="spellStart"/>
       <w:r>
-        <w:t>mechansim</w:t>
+        <w:rPr>
+          <w:color w:val="000000" w:themeColor="text1"/>
+        </w:rPr>
+        <w:t>discrepency</w:t>
       </w:r>
       <w:proofErr w:type="spellEnd"/>
       <w:r>
-        <w:t xml:space="preserve"> of film acting as interference wedge</w:t>
-      </w:r>
-    </w:p>
-    <w:p>
-      <w:pPr>
-        <w:numPr>
-          <w:ilvl w:val="0"/>
-          <w:numId w:val="10"/>
-        </w:numPr>
-      </w:pPr>
-      <w:r>
-        <w:t>This</w:t>
-      </w:r>
-      <w:r>
-        <w:t xml:space="preserve"> gives good justification to the need for your work ... Such a big increase in bearing load would result in a massive reduction in bearing life, right?  But we do not account for it in bearing life calculations. Should we? Or is this specific to conditions and assumptions here? Discuss either way.</w:t>
+        <w:rPr>
+          <w:color w:val="000000" w:themeColor="text1"/>
+        </w:rPr>
+        <w:t xml:space="preserve"> at high speed between analytical and numerical </w:t>
+      </w:r>
+      <w:proofErr w:type="spellStart"/>
+      <w:r>
+        <w:rPr>
+          <w:color w:val="000000" w:themeColor="text1"/>
+        </w:rPr>
+        <w:t>predicitions</w:t>
+      </w:r>
+      <w:proofErr w:type="spellEnd"/>
+    </w:p>
+    <w:p>
+      <w:pPr>
+        <w:numPr>
+          <w:ilvl w:val="1"/>
+          <w:numId w:val="11"/>
+        </w:numPr>
+        <w:rPr>
+          <w:color w:val="000000" w:themeColor="text1"/>
+        </w:rPr>
+      </w:pPr>
+      <w:r>
+        <w:rPr>
+          <w:color w:val="000000" w:themeColor="text1"/>
+        </w:rPr>
+        <w:t>As per previous comment</w:t>
       </w:r>
     </w:p>
     <w:p>
@@ -1507,607 +3109,90 @@
         <w:pStyle w:val="Heading2"/>
       </w:pPr>
       <w:r>
-        <w:t>Chapter 4 – FMBD Modelling</w:t>
-      </w:r>
-    </w:p>
-    <w:p>
-      <w:pPr>
-        <w:numPr>
-          <w:ilvl w:val="0"/>
-          <w:numId w:val="6"/>
-        </w:numPr>
-      </w:pPr>
-      <w:r>
-        <w:t>Make it clear where you are describing the development of the model, which sections are your own creation, which are adapted from others, which is the same as others (as appropriate).</w:t>
-      </w:r>
-    </w:p>
-    <w:p>
-      <w:pPr>
-        <w:numPr>
-          <w:ilvl w:val="0"/>
-          <w:numId w:val="6"/>
-        </w:numPr>
-      </w:pPr>
-      <w:r>
-        <w:t>How much of your input is needed to model this using this ready-made software? Is the contribution here the link between your component level model and this system level software? Please clarify</w:t>
-      </w:r>
-    </w:p>
-    <w:p>
-      <w:pPr>
-        <w:numPr>
-          <w:ilvl w:val="0"/>
-          <w:numId w:val="6"/>
-        </w:numPr>
-      </w:pPr>
-      <w:r>
-        <w:t xml:space="preserve">So essentially this allows you to plug in your bearing model from Chapter 3 into this system level software, right? This is OK but please clarify the novelty in this part of the work (co-simulation). This could be the </w:t>
-      </w:r>
-      <w:proofErr w:type="gramStart"/>
-      <w:r>
-        <w:t>implementation</w:t>
-      </w:r>
-      <w:proofErr w:type="gramEnd"/>
-      <w:r>
-        <w:t xml:space="preserve"> or the results as discussed.</w:t>
-      </w:r>
-    </w:p>
-    <w:p>
-      <w:pPr>
-        <w:numPr>
-          <w:ilvl w:val="0"/>
-          <w:numId w:val="6"/>
-        </w:numPr>
-        <w:rPr>
-          <w:color w:val="4EA72E" w:themeColor="accent6"/>
-        </w:rPr>
-      </w:pPr>
-      <w:r>
-        <w:rPr>
-          <w:color w:val="4EA72E" w:themeColor="accent6"/>
-        </w:rPr>
-        <w:t>How is the dynamic response of gears pair (and the motor itself) modelled here? Briefly explain</w:t>
-      </w:r>
-    </w:p>
-    <w:p>
-      <w:pPr>
-        <w:numPr>
-          <w:ilvl w:val="1"/>
-          <w:numId w:val="6"/>
-        </w:numPr>
-        <w:rPr>
-          <w:color w:val="0070C0"/>
-        </w:rPr>
-      </w:pPr>
-      <w:r>
-        <w:rPr>
-          <w:color w:val="0070C0"/>
-        </w:rPr>
-        <w:t>This is already explained in section 4.3.2, including what isn't modelled (flexible bodies in representative excitation model and stator tooth forces due to minimal lateral contribution once resolved). Refined description</w:t>
-      </w:r>
-    </w:p>
-    <w:p>
-      <w:pPr>
-        <w:numPr>
-          <w:ilvl w:val="0"/>
-          <w:numId w:val="6"/>
-        </w:numPr>
-        <w:rPr>
-          <w:color w:val="000000" w:themeColor="text1"/>
-        </w:rPr>
-      </w:pPr>
-      <w:r>
-        <w:rPr>
-          <w:color w:val="000000" w:themeColor="text1"/>
-        </w:rPr>
-        <w:t xml:space="preserve">Can you add a line or two to provide a physical explanation of why the elastic deformation is so much bigger for the lubricated case vs dry given that </w:t>
-      </w:r>
-      <w:proofErr w:type="gramStart"/>
-      <w:r>
-        <w:rPr>
-          <w:color w:val="000000" w:themeColor="text1"/>
-        </w:rPr>
-        <w:t>externally  applied</w:t>
-      </w:r>
-      <w:proofErr w:type="gramEnd"/>
-      <w:r>
-        <w:rPr>
-          <w:color w:val="000000" w:themeColor="text1"/>
-        </w:rPr>
-        <w:t xml:space="preserve"> loads are the same? How is the housing modelled here?</w:t>
-      </w:r>
-    </w:p>
-    <w:p>
-      <w:pPr>
-        <w:numPr>
-          <w:ilvl w:val="0"/>
-          <w:numId w:val="6"/>
-        </w:numPr>
-        <w:rPr>
-          <w:color w:val="000000" w:themeColor="text1"/>
-        </w:rPr>
-      </w:pPr>
-      <w:r>
-        <w:rPr>
-          <w:color w:val="000000" w:themeColor="text1"/>
-        </w:rPr>
-        <w:t>Relatively small variation. Does this help to show that there is no need to accurately model film dependence on load as mentioned before? Discuss briefly if you think it worthwhile but OK to ignore.</w:t>
-      </w:r>
-    </w:p>
-    <w:p>
-      <w:pPr>
-        <w:numPr>
-          <w:ilvl w:val="0"/>
-          <w:numId w:val="6"/>
-        </w:numPr>
-        <w:rPr>
-          <w:color w:val="000000" w:themeColor="text1"/>
-        </w:rPr>
-      </w:pPr>
-      <w:r>
-        <w:rPr>
-          <w:color w:val="000000" w:themeColor="text1"/>
-        </w:rPr>
-        <w:t>OK. How does this value compare to that from simple EHD regression predictions?</w:t>
-      </w:r>
-    </w:p>
-    <w:p>
-      <w:pPr>
-        <w:numPr>
-          <w:ilvl w:val="0"/>
-          <w:numId w:val="6"/>
-        </w:numPr>
-        <w:rPr>
-          <w:color w:val="4EA72E" w:themeColor="accent6"/>
-        </w:rPr>
-      </w:pPr>
-      <w:r>
-        <w:rPr>
-          <w:color w:val="4EA72E" w:themeColor="accent6"/>
-        </w:rPr>
-        <w:t>Fig 4.6 - text says peak torque is 68 Nm, but graph suggest 80 something.</w:t>
-      </w:r>
-    </w:p>
-    <w:p>
-      <w:pPr>
-        <w:numPr>
-          <w:ilvl w:val="1"/>
-          <w:numId w:val="6"/>
-        </w:numPr>
-        <w:rPr>
-          <w:color w:val="0070C0"/>
-        </w:rPr>
-      </w:pPr>
-      <w:r>
-        <w:rPr>
-          <w:color w:val="0070C0"/>
-        </w:rPr>
-        <w:t>Clarified as maximum average torque delivered by PMSM</w:t>
-      </w:r>
-    </w:p>
-    <w:p>
-      <w:pPr>
-        <w:numPr>
-          <w:ilvl w:val="0"/>
-          <w:numId w:val="6"/>
-        </w:numPr>
-        <w:rPr>
-          <w:color w:val="4EA72E" w:themeColor="accent6"/>
-        </w:rPr>
-      </w:pPr>
-      <w:r>
-        <w:rPr>
-          <w:color w:val="4EA72E" w:themeColor="accent6"/>
-        </w:rPr>
-        <w:t>Table 4.2 - state where these are from.</w:t>
-      </w:r>
-    </w:p>
-    <w:p>
-      <w:pPr>
-        <w:numPr>
-          <w:ilvl w:val="1"/>
-          <w:numId w:val="6"/>
-        </w:numPr>
-        <w:rPr>
-          <w:color w:val="0070C0"/>
-        </w:rPr>
-      </w:pPr>
-      <w:r>
-        <w:rPr>
-          <w:color w:val="0070C0"/>
+        <w:t>Chapter 6 - Conclusions</w:t>
+      </w:r>
+    </w:p>
+    <w:p>
+      <w:pPr>
+        <w:numPr>
+          <w:ilvl w:val="0"/>
+          <w:numId w:val="8"/>
+        </w:numPr>
+      </w:pPr>
+      <w:r>
+        <w:t>Chapter 6 - provide more evidence of the significance of your work.</w:t>
+      </w:r>
+    </w:p>
+    <w:p>
+      <w:pPr>
+        <w:numPr>
+          <w:ilvl w:val="0"/>
+          <w:numId w:val="8"/>
+        </w:numPr>
+      </w:pPr>
+      <w:r>
+        <w:t>Add limitations to future work</w:t>
+      </w:r>
+      <w:r>
+        <w:t xml:space="preserve"> section.</w:t>
+      </w:r>
+    </w:p>
+    <w:p>
+      <w:pPr>
+        <w:numPr>
+          <w:ilvl w:val="1"/>
+          <w:numId w:val="8"/>
+        </w:numPr>
+        <w:rPr>
+          <w:i/>
+          <w:iCs/>
+        </w:rPr>
+      </w:pPr>
+      <w:r>
+        <w:rPr>
+          <w:i/>
+          <w:iCs/>
         </w:rPr>
         <w:lastRenderedPageBreak/>
-        <w:t>Th</w:t>
-      </w:r>
-      <w:r>
-        <w:rPr>
-          <w:color w:val="0070C0"/>
-        </w:rPr>
-        <w:t>ese correspond to a light transmission oil. The lubricant and rheological parameters were provided by AVL</w:t>
-      </w:r>
-      <w:r>
-        <w:rPr>
-          <w:color w:val="0070C0"/>
-        </w:rPr>
-        <w:t>.</w:t>
-      </w:r>
-    </w:p>
-    <w:p>
-      <w:pPr>
-        <w:numPr>
-          <w:ilvl w:val="0"/>
-          <w:numId w:val="6"/>
-        </w:numPr>
-        <w:rPr>
-          <w:color w:val="4EA72E" w:themeColor="accent6"/>
-        </w:rPr>
-      </w:pPr>
-      <w:r>
-        <w:rPr>
-          <w:color w:val="4EA72E" w:themeColor="accent6"/>
-        </w:rPr>
-        <w:t>Fig 4.11 is pretty much unreadable - have as a full landscape page?</w:t>
-      </w:r>
-    </w:p>
-    <w:p>
-      <w:pPr>
-        <w:numPr>
-          <w:ilvl w:val="1"/>
-          <w:numId w:val="6"/>
-        </w:numPr>
-        <w:rPr>
-          <w:color w:val="0070C0"/>
-        </w:rPr>
-      </w:pPr>
-      <w:r>
-        <w:rPr>
-          <w:color w:val="0070C0"/>
-        </w:rPr>
-        <w:t>Amended</w:t>
-      </w:r>
-      <w:r>
-        <w:rPr>
-          <w:color w:val="0070C0"/>
-        </w:rPr>
-        <w:t xml:space="preserve"> to full landscape page</w:t>
-      </w:r>
-    </w:p>
-    <w:p>
-      <w:pPr>
-        <w:numPr>
-          <w:ilvl w:val="0"/>
-          <w:numId w:val="6"/>
-        </w:numPr>
-      </w:pPr>
-      <w:r>
-        <w:t>Chapter discussion/conclusions - please add some comments about how much your new methods improve the more classical methods.</w:t>
-      </w:r>
-    </w:p>
-    <w:p>
-      <w:pPr>
-        <w:numPr>
-          <w:ilvl w:val="0"/>
-          <w:numId w:val="6"/>
-        </w:numPr>
-      </w:pPr>
-      <w:r>
-        <w:t>Comment on the significance of the huge increase in contact force.</w:t>
-      </w:r>
-    </w:p>
-    <w:p>
-      <w:pPr>
-        <w:pStyle w:val="Heading2"/>
-      </w:pPr>
-      <w:r>
-        <w:t>Chapter 5 - ANN</w:t>
-      </w:r>
-    </w:p>
-    <w:p>
-      <w:pPr>
-        <w:numPr>
-          <w:ilvl w:val="0"/>
-          <w:numId w:val="11"/>
-        </w:numPr>
-        <w:rPr>
-          <w:color w:val="000000" w:themeColor="text1"/>
-        </w:rPr>
-      </w:pPr>
-      <w:r>
-        <w:rPr>
-          <w:color w:val="000000" w:themeColor="text1"/>
-        </w:rPr>
-        <w:t>Chapter 5 - make it clearer from where the various techniques that you've combined for the ANN method.</w:t>
-      </w:r>
-    </w:p>
-    <w:p>
-      <w:pPr>
-        <w:numPr>
-          <w:ilvl w:val="0"/>
-          <w:numId w:val="11"/>
-        </w:numPr>
-        <w:rPr>
-          <w:color w:val="000000" w:themeColor="text1"/>
-        </w:rPr>
-      </w:pPr>
-      <w:r>
-        <w:rPr>
-          <w:color w:val="000000" w:themeColor="text1"/>
-        </w:rPr>
-        <w:t>Statements on regression equations not being valid outside of bounds of data used to generate: This is often stated in the thesis but not properly justified with evidence. Is there any evidence that these analytical (regression) equations for EHL are not sufficiently accurate in this context? Including this would help to justify your approach.</w:t>
-      </w:r>
-    </w:p>
-    <w:p>
-      <w:pPr>
-        <w:numPr>
-          <w:ilvl w:val="0"/>
-          <w:numId w:val="11"/>
-        </w:numPr>
-        <w:rPr>
-          <w:color w:val="E97132" w:themeColor="accent2"/>
-        </w:rPr>
-      </w:pPr>
-      <w:r>
-        <w:rPr>
-          <w:color w:val="E97132" w:themeColor="accent2"/>
-        </w:rPr>
-        <w:t xml:space="preserve">At these speeds the standard EHD theory is not valid due to inlet shear heating effects but there are several corrections out there (based on experimental data). Did you try to use Gupta correction for example? </w:t>
-      </w:r>
-      <w:proofErr w:type="gramStart"/>
-      <w:r>
-        <w:rPr>
-          <w:color w:val="E97132" w:themeColor="accent2"/>
-        </w:rPr>
-        <w:t>This needs</w:t>
-      </w:r>
-      <w:proofErr w:type="gramEnd"/>
-      <w:r>
-        <w:rPr>
-          <w:color w:val="E97132" w:themeColor="accent2"/>
-        </w:rPr>
-        <w:t xml:space="preserve"> discussing with relevant references (also mentioned above in a previous comment)</w:t>
-      </w:r>
-    </w:p>
-    <w:p>
-      <w:pPr>
-        <w:numPr>
-          <w:ilvl w:val="0"/>
-          <w:numId w:val="11"/>
-        </w:numPr>
-        <w:rPr>
-          <w:color w:val="000000" w:themeColor="text1"/>
-        </w:rPr>
-      </w:pPr>
-      <w:r>
-        <w:rPr>
-          <w:color w:val="000000" w:themeColor="text1"/>
-        </w:rPr>
-        <w:t>Clarify who did what with regards to the ANN section</w:t>
-      </w:r>
-    </w:p>
-    <w:p>
-      <w:pPr>
-        <w:numPr>
-          <w:ilvl w:val="0"/>
-          <w:numId w:val="11"/>
-        </w:numPr>
-        <w:rPr>
-          <w:color w:val="000000" w:themeColor="text1"/>
-        </w:rPr>
-      </w:pPr>
-      <w:proofErr w:type="gramStart"/>
-      <w:r>
-        <w:rPr>
-          <w:color w:val="000000" w:themeColor="text1"/>
-        </w:rPr>
-        <w:t>So</w:t>
-      </w:r>
-      <w:proofErr w:type="gramEnd"/>
-      <w:r>
-        <w:rPr>
-          <w:color w:val="000000" w:themeColor="text1"/>
-        </w:rPr>
-        <w:t xml:space="preserve"> if thermal effects are not included in your present solution what is the reason for the observed differences? I would have </w:t>
-      </w:r>
-      <w:proofErr w:type="gramStart"/>
-      <w:r>
-        <w:rPr>
-          <w:color w:val="000000" w:themeColor="text1"/>
-        </w:rPr>
-        <w:t>excepted</w:t>
-      </w:r>
-      <w:proofErr w:type="gramEnd"/>
-      <w:r>
-        <w:rPr>
-          <w:color w:val="000000" w:themeColor="text1"/>
-        </w:rPr>
-        <w:t xml:space="preserve"> this to be the biggest effect.  </w:t>
-      </w:r>
-    </w:p>
-    <w:p>
-      <w:pPr>
-        <w:numPr>
-          <w:ilvl w:val="0"/>
-          <w:numId w:val="11"/>
-        </w:numPr>
-        <w:rPr>
-          <w:color w:val="4EA72E" w:themeColor="accent6"/>
-        </w:rPr>
-      </w:pPr>
-      <w:r>
-        <w:rPr>
-          <w:color w:val="4EA72E" w:themeColor="accent6"/>
-        </w:rPr>
-        <w:t>How did you determine 9 input variables?</w:t>
-      </w:r>
-    </w:p>
-    <w:p>
-      <w:pPr>
-        <w:numPr>
-          <w:ilvl w:val="1"/>
-          <w:numId w:val="11"/>
-        </w:numPr>
-        <w:rPr>
-          <w:color w:val="0070C0"/>
-        </w:rPr>
-      </w:pPr>
-      <w:r>
-        <w:rPr>
-          <w:color w:val="0070C0"/>
-        </w:rPr>
-        <w:t>Required variables for the EHL film thickness calculation.</w:t>
-      </w:r>
-    </w:p>
-    <w:p>
-      <w:pPr>
-        <w:numPr>
-          <w:ilvl w:val="0"/>
-          <w:numId w:val="11"/>
-        </w:numPr>
-        <w:rPr>
-          <w:color w:val="000000" w:themeColor="text1"/>
-        </w:rPr>
-      </w:pPr>
-      <w:r>
-        <w:rPr>
-          <w:color w:val="000000" w:themeColor="text1"/>
-        </w:rPr>
-        <w:t>OK, I can see the value of this (Greenwood boundaries). But how different is the present approach to that in [92]? Please add text to clarify the differences and hence novelty of your work.</w:t>
-      </w:r>
-    </w:p>
-    <w:p>
-      <w:pPr>
-        <w:numPr>
-          <w:ilvl w:val="0"/>
-          <w:numId w:val="11"/>
-        </w:numPr>
-        <w:rPr>
-          <w:color w:val="E97132" w:themeColor="accent2"/>
-        </w:rPr>
-      </w:pPr>
-      <w:r>
-        <w:rPr>
-          <w:color w:val="E97132" w:themeColor="accent2"/>
-        </w:rPr>
-        <w:t>Isothermal valid for high speeds? Comment</w:t>
-      </w:r>
-    </w:p>
-    <w:p>
-      <w:pPr>
-        <w:numPr>
-          <w:ilvl w:val="0"/>
-          <w:numId w:val="11"/>
-        </w:numPr>
-        <w:rPr>
-          <w:color w:val="000000" w:themeColor="text1"/>
-        </w:rPr>
-      </w:pPr>
-      <w:r>
-        <w:rPr>
-          <w:color w:val="000000" w:themeColor="text1"/>
-        </w:rPr>
-        <w:t>Why not validate ANN against experiment?</w:t>
-      </w:r>
-    </w:p>
-    <w:p>
-      <w:pPr>
-        <w:numPr>
-          <w:ilvl w:val="0"/>
-          <w:numId w:val="11"/>
-        </w:numPr>
-        <w:rPr>
-          <w:color w:val="000000" w:themeColor="text1"/>
-        </w:rPr>
-      </w:pPr>
-      <w:r>
-        <w:rPr>
-          <w:color w:val="000000" w:themeColor="text1"/>
-        </w:rPr>
-        <w:t xml:space="preserve">Yes, but ideally you should compare model predictions to a completely new set of data available in literature (e.g. Maclaren et al, high speed film thickness data or similar). It </w:t>
-      </w:r>
-      <w:proofErr w:type="gramStart"/>
-      <w:r>
-        <w:rPr>
-          <w:color w:val="000000" w:themeColor="text1"/>
-        </w:rPr>
-        <w:t>would  have</w:t>
-      </w:r>
-      <w:proofErr w:type="gramEnd"/>
-      <w:r>
-        <w:rPr>
-          <w:color w:val="000000" w:themeColor="text1"/>
-        </w:rPr>
-        <w:t xml:space="preserve"> been a good addition to this chapter but there is no time for this now, something to think about in the future. The possibility and the value of this should be mentioned though.</w:t>
-      </w:r>
-    </w:p>
-    <w:p>
-      <w:pPr>
-        <w:numPr>
-          <w:ilvl w:val="0"/>
-          <w:numId w:val="11"/>
-        </w:numPr>
-        <w:rPr>
-          <w:color w:val="000000" w:themeColor="text1"/>
-        </w:rPr>
-      </w:pPr>
-      <w:r>
-        <w:rPr>
-          <w:color w:val="000000" w:themeColor="text1"/>
-        </w:rPr>
-        <w:t xml:space="preserve">Clarify why large </w:t>
-      </w:r>
-      <w:proofErr w:type="spellStart"/>
-      <w:r>
-        <w:rPr>
-          <w:color w:val="000000" w:themeColor="text1"/>
-        </w:rPr>
-        <w:t>discrepency</w:t>
-      </w:r>
-      <w:proofErr w:type="spellEnd"/>
-      <w:r>
-        <w:rPr>
-          <w:color w:val="000000" w:themeColor="text1"/>
-        </w:rPr>
-        <w:t xml:space="preserve"> at high speed between analytical and numerical </w:t>
-      </w:r>
-      <w:proofErr w:type="spellStart"/>
-      <w:r>
-        <w:rPr>
-          <w:color w:val="000000" w:themeColor="text1"/>
-        </w:rPr>
-        <w:t>predicitions</w:t>
-      </w:r>
-      <w:proofErr w:type="spellEnd"/>
-    </w:p>
-    <w:p>
-      <w:pPr>
-        <w:pStyle w:val="Heading2"/>
-      </w:pPr>
-      <w:r>
-        <w:t>Chapter 6 - Conclusions</w:t>
-      </w:r>
-    </w:p>
-    <w:p>
-      <w:pPr>
-        <w:numPr>
-          <w:ilvl w:val="0"/>
+        <w:t xml:space="preserve">Film correction factors not considered, most prominently inlet shear heating at high speed. Whilst this would not affect the conclusions of this work, it would </w:t>
+      </w:r>
+    </w:p>
+    <w:p>
+      <w:pPr>
+        <w:numPr>
+          <w:ilvl w:val="1"/>
           <w:numId w:val="8"/>
         </w:numPr>
-      </w:pPr>
-      <w:r>
-        <w:t>Chapter 6 - provide more evidence of the significance of your work.</w:t>
-      </w:r>
-    </w:p>
-    <w:p>
-      <w:pPr>
-        <w:numPr>
-          <w:ilvl w:val="0"/>
+        <w:rPr>
+          <w:i/>
+          <w:iCs/>
+        </w:rPr>
+      </w:pPr>
+      <w:r>
+        <w:rPr>
+          <w:i/>
+          <w:iCs/>
+        </w:rPr>
+        <w:t xml:space="preserve">Training ANN using experimentally informed </w:t>
+      </w:r>
+    </w:p>
+    <w:p>
+      <w:pPr>
+        <w:numPr>
+          <w:ilvl w:val="1"/>
           <w:numId w:val="8"/>
         </w:numPr>
-      </w:pPr>
-      <w:r>
-        <w:t>Add limitations to future work</w:t>
-      </w:r>
-      <w:r>
-        <w:t xml:space="preserve"> section.</w:t>
+        <w:rPr>
+          <w:i/>
+          <w:iCs/>
+        </w:rPr>
+      </w:pPr>
+      <w:r>
+        <w:rPr>
+          <w:i/>
+          <w:iCs/>
+        </w:rPr>
+        <w:t>Need to add literature relevant to these sections and says these are the advantage of the ANN.</w:t>
       </w:r>
     </w:p>
     <w:sectPr>
@@ -2502,7 +3587,7 @@
   <w:abstractNum w:abstractNumId="4" w15:restartNumberingAfterBreak="0">
     <w:nsid w:val="3A82510C"/>
     <w:multiLevelType w:val="multilevel"/>
-    <w:tmpl w:val="9F60B382"/>
+    <w:tmpl w:val="34BC67EE"/>
     <w:lvl w:ilvl="0">
       <w:start w:val="1"/>
       <w:numFmt w:val="decimal"/>
@@ -2517,12 +3602,15 @@
     </w:lvl>
     <w:lvl w:ilvl="1">
       <w:start w:val="1"/>
-      <w:numFmt w:val="lowerLetter"/>
-      <w:lvlText w:val="%2)"/>
+      <w:numFmt w:val="bullet"/>
+      <w:lvlText w:val=""/>
       <w:lvlJc w:val="left"/>
       <w:pPr>
         <w:ind w:left="1440" w:hanging="360"/>
       </w:pPr>
+      <w:rPr>
+        <w:rFonts w:ascii="Symbol" w:hAnsi="Symbol" w:hint="default"/>
+      </w:rPr>
     </w:lvl>
     <w:lvl w:ilvl="2">
       <w:start w:val="1"/>
@@ -2922,6 +4010,119 @@
     </w:lvl>
   </w:abstractNum>
   <w:abstractNum w:abstractNumId="8" w15:restartNumberingAfterBreak="0">
+    <w:nsid w:val="69B932CE"/>
+    <w:multiLevelType w:val="multilevel"/>
+    <w:tmpl w:val="34BC67EE"/>
+    <w:lvl w:ilvl="0">
+      <w:start w:val="1"/>
+      <w:numFmt w:val="decimal"/>
+      <w:lvlText w:val="%1."/>
+      <w:lvlJc w:val="left"/>
+      <w:pPr>
+        <w:tabs>
+          <w:tab w:val="num" w:pos="720"/>
+        </w:tabs>
+        <w:ind w:left="720" w:hanging="360"/>
+      </w:pPr>
+    </w:lvl>
+    <w:lvl w:ilvl="1">
+      <w:start w:val="1"/>
+      <w:numFmt w:val="bullet"/>
+      <w:lvlText w:val=""/>
+      <w:lvlJc w:val="left"/>
+      <w:pPr>
+        <w:ind w:left="1440" w:hanging="360"/>
+      </w:pPr>
+      <w:rPr>
+        <w:rFonts w:ascii="Symbol" w:hAnsi="Symbol" w:hint="default"/>
+      </w:rPr>
+    </w:lvl>
+    <w:lvl w:ilvl="2">
+      <w:start w:val="1"/>
+      <w:numFmt w:val="bullet"/>
+      <w:lvlText w:val=""/>
+      <w:lvlJc w:val="left"/>
+      <w:pPr>
+        <w:ind w:left="2160" w:hanging="360"/>
+      </w:pPr>
+      <w:rPr>
+        <w:rFonts w:ascii="Symbol" w:hAnsi="Symbol" w:hint="default"/>
+      </w:rPr>
+    </w:lvl>
+    <w:lvl w:ilvl="3" w:tentative="1">
+      <w:start w:val="1"/>
+      <w:numFmt w:val="decimal"/>
+      <w:lvlText w:val="%4."/>
+      <w:lvlJc w:val="left"/>
+      <w:pPr>
+        <w:tabs>
+          <w:tab w:val="num" w:pos="2880"/>
+        </w:tabs>
+        <w:ind w:left="2880" w:hanging="360"/>
+      </w:pPr>
+    </w:lvl>
+    <w:lvl w:ilvl="4" w:tentative="1">
+      <w:start w:val="1"/>
+      <w:numFmt w:val="decimal"/>
+      <w:lvlText w:val="%5."/>
+      <w:lvlJc w:val="left"/>
+      <w:pPr>
+        <w:tabs>
+          <w:tab w:val="num" w:pos="3600"/>
+        </w:tabs>
+        <w:ind w:left="3600" w:hanging="360"/>
+      </w:pPr>
+    </w:lvl>
+    <w:lvl w:ilvl="5" w:tentative="1">
+      <w:start w:val="1"/>
+      <w:numFmt w:val="decimal"/>
+      <w:lvlText w:val="%6."/>
+      <w:lvlJc w:val="left"/>
+      <w:pPr>
+        <w:tabs>
+          <w:tab w:val="num" w:pos="4320"/>
+        </w:tabs>
+        <w:ind w:left="4320" w:hanging="360"/>
+      </w:pPr>
+    </w:lvl>
+    <w:lvl w:ilvl="6" w:tentative="1">
+      <w:start w:val="1"/>
+      <w:numFmt w:val="decimal"/>
+      <w:lvlText w:val="%7."/>
+      <w:lvlJc w:val="left"/>
+      <w:pPr>
+        <w:tabs>
+          <w:tab w:val="num" w:pos="5040"/>
+        </w:tabs>
+        <w:ind w:left="5040" w:hanging="360"/>
+      </w:pPr>
+    </w:lvl>
+    <w:lvl w:ilvl="7" w:tentative="1">
+      <w:start w:val="1"/>
+      <w:numFmt w:val="decimal"/>
+      <w:lvlText w:val="%8."/>
+      <w:lvlJc w:val="left"/>
+      <w:pPr>
+        <w:tabs>
+          <w:tab w:val="num" w:pos="5760"/>
+        </w:tabs>
+        <w:ind w:left="5760" w:hanging="360"/>
+      </w:pPr>
+    </w:lvl>
+    <w:lvl w:ilvl="8" w:tentative="1">
+      <w:start w:val="1"/>
+      <w:numFmt w:val="decimal"/>
+      <w:lvlText w:val="%9."/>
+      <w:lvlJc w:val="left"/>
+      <w:pPr>
+        <w:tabs>
+          <w:tab w:val="num" w:pos="6480"/>
+        </w:tabs>
+        <w:ind w:left="6480" w:hanging="360"/>
+      </w:pPr>
+    </w:lvl>
+  </w:abstractNum>
+  <w:abstractNum w:abstractNumId="9" w15:restartNumberingAfterBreak="0">
     <w:nsid w:val="6C537067"/>
     <w:multiLevelType w:val="multilevel"/>
     <w:tmpl w:val="E3EEA7A0"/>
@@ -3070,7 +4271,7 @@
       </w:rPr>
     </w:lvl>
   </w:abstractNum>
-  <w:abstractNum w:abstractNumId="9" w15:restartNumberingAfterBreak="0">
+  <w:abstractNum w:abstractNumId="10" w15:restartNumberingAfterBreak="0">
     <w:nsid w:val="6FB00A3F"/>
     <w:multiLevelType w:val="multilevel"/>
     <w:tmpl w:val="0809001D"/>
@@ -3156,7 +4357,7 @@
       </w:pPr>
     </w:lvl>
   </w:abstractNum>
-  <w:abstractNum w:abstractNumId="10" w15:restartNumberingAfterBreak="0">
+  <w:abstractNum w:abstractNumId="11" w15:restartNumberingAfterBreak="0">
     <w:nsid w:val="707A3F30"/>
     <w:multiLevelType w:val="multilevel"/>
     <w:tmpl w:val="0809001D"/>
@@ -3242,7 +4443,7 @@
       </w:pPr>
     </w:lvl>
   </w:abstractNum>
-  <w:abstractNum w:abstractNumId="11" w15:restartNumberingAfterBreak="0">
+  <w:abstractNum w:abstractNumId="12" w15:restartNumberingAfterBreak="0">
     <w:nsid w:val="79690723"/>
     <w:multiLevelType w:val="multilevel"/>
     <w:tmpl w:val="E79872A4"/>
@@ -3341,10 +4542,10 @@
     <w:abstractNumId w:val="4"/>
   </w:num>
   <w:num w:numId="4" w16cid:durableId="1986815891">
-    <w:abstractNumId w:val="11"/>
+    <w:abstractNumId w:val="12"/>
   </w:num>
   <w:num w:numId="5" w16cid:durableId="1202938048">
-    <w:abstractNumId w:val="10"/>
+    <w:abstractNumId w:val="11"/>
   </w:num>
   <w:num w:numId="6" w16cid:durableId="814488065">
     <w:abstractNumId w:val="2"/>
@@ -3353,7 +4554,7 @@
     <w:abstractNumId w:val="0"/>
   </w:num>
   <w:num w:numId="8" w16cid:durableId="1390154152">
-    <w:abstractNumId w:val="9"/>
+    <w:abstractNumId w:val="10"/>
   </w:num>
   <w:num w:numId="9" w16cid:durableId="1754859666">
     <w:abstractNumId w:val="1"/>
@@ -3365,6 +4566,9 @@
     <w:abstractNumId w:val="3"/>
   </w:num>
   <w:num w:numId="12" w16cid:durableId="397246090">
+    <w:abstractNumId w:val="9"/>
+  </w:num>
+  <w:num w:numId="13" w16cid:durableId="759643959">
     <w:abstractNumId w:val="8"/>
   </w:num>
 </w:numbering>
@@ -3973,7 +5177,6 @@
   <w:style w:type="character" w:default="1" w:styleId="DefaultParagraphFont">
     <w:name w:val="Default Paragraph Font"/>
     <w:uiPriority w:val="1"/>
-    <w:semiHidden/>
     <w:unhideWhenUsed/>
   </w:style>
   <w:style w:type="table" w:default="1" w:styleId="TableNormal">

</xml_diff>